<commit_message>
kapitel hard und software wahl begonnen
</commit_message>
<xml_diff>
--- a/Kamerabasierte Gestenerkennung zur Steuerung eines virtuellen Orchesters (Masterarbeit Wegener).docx
+++ b/Kamerabasierte Gestenerkennung zur Steuerung eines virtuellen Orchesters (Masterarbeit Wegener).docx
@@ -162,14 +162,12 @@
           <w:lang w:val="en-US"/>
         </w:rPr>
       </w:pPr>
-      <w:proofErr w:type="spellStart"/>
       <w:r>
         <w:rPr>
           <w:lang w:val="en-US"/>
         </w:rPr>
         <w:t>Studiengang</w:t>
       </w:r>
-      <w:proofErr w:type="spellEnd"/>
       <w:r>
         <w:rPr>
           <w:lang w:val="en-US"/>
@@ -525,23 +523,7 @@
           <w:i/>
           <w:color w:val="FF0000"/>
         </w:rPr>
-        <w:t xml:space="preserve">Hinweise zur </w:t>
-      </w:r>
-      <w:proofErr w:type="spellStart"/>
-      <w:r>
-        <w:rPr>
-          <w:i/>
-          <w:color w:val="FF0000"/>
-        </w:rPr>
-        <w:t>Verendung</w:t>
-      </w:r>
-      <w:proofErr w:type="spellEnd"/>
-      <w:r>
-        <w:rPr>
-          <w:i/>
-          <w:color w:val="FF0000"/>
-        </w:rPr>
-        <w:t xml:space="preserve"> von MS-Word </w:t>
+        <w:t xml:space="preserve">Hinweise zur Verendung von MS-Word </w:t>
       </w:r>
       <w:r>
         <w:rPr>
@@ -784,15 +766,7 @@
         <w:sym w:font="Wingdings" w:char="F0E0"/>
       </w:r>
       <w:r>
-        <w:t xml:space="preserve"> „d. h.“ (wird erreicht mit „</w:t>
-      </w:r>
-      <w:proofErr w:type="spellStart"/>
-      <w:r>
-        <w:t>Umschalt</w:t>
-      </w:r>
-      <w:proofErr w:type="spellEnd"/>
-      <w:r>
-        <w:t>“ + „Steuerung“ + „Leertaste“).</w:t>
+        <w:t xml:space="preserve"> „d. h.“ (wird erreicht mit „Umschalt“ + „Steuerung“ + „Leertaste“).</w:t>
       </w:r>
     </w:p>
     <w:p>
@@ -809,15 +783,7 @@
         <w:t>Zahlen</w:t>
       </w:r>
       <w:r>
-        <w:t xml:space="preserve"> bis „zwölf“ werden im Regelfall </w:t>
-      </w:r>
-      <w:proofErr w:type="gramStart"/>
-      <w:r>
-        <w:t>ausgeschrieben</w:t>
-      </w:r>
-      <w:proofErr w:type="gramEnd"/>
-      <w:r>
-        <w:t xml:space="preserve"> wenn die Zahlen im Fließtext genannt werden.</w:t>
+        <w:t xml:space="preserve"> bis „zwölf“ werden im Regelfall ausgeschrieben wenn die Zahlen im Fließtext genannt werden.</w:t>
       </w:r>
     </w:p>
     <w:p>
@@ -3838,31 +3804,13 @@
       <w:r>
         <w:tab/>
       </w:r>
-      <w:proofErr w:type="spellStart"/>
       <w:r>
         <w:rPr>
           <w:rStyle w:val="Grundzenglisch"/>
           <w:lang w:val="de-DE"/>
         </w:rPr>
-        <w:t>dots</w:t>
-      </w:r>
-      <w:proofErr w:type="spellEnd"/>
-      <w:r>
-        <w:rPr>
-          <w:rStyle w:val="Grundzenglisch"/>
-          <w:lang w:val="de-DE"/>
-        </w:rPr>
-        <w:t xml:space="preserve"> per </w:t>
-      </w:r>
-      <w:proofErr w:type="spellStart"/>
-      <w:r>
-        <w:rPr>
-          <w:rStyle w:val="Grundzenglisch"/>
-          <w:lang w:val="de-DE"/>
-        </w:rPr>
-        <w:t>inch</w:t>
-      </w:r>
-      <w:proofErr w:type="spellEnd"/>
+        <w:t>dots per inch</w:t>
+      </w:r>
     </w:p>
     <w:p>
       <w:pPr>
@@ -3880,7 +3828,6 @@
       <w:pPr>
         <w:pStyle w:val="GrundtextEinrckung"/>
       </w:pPr>
-      <w:proofErr w:type="gramStart"/>
       <w:r>
         <w:t>FV</w:t>
       </w:r>
@@ -3888,17 +3835,14 @@
         <w:tab/>
         <w:t>Formatvorlage</w:t>
       </w:r>
-      <w:proofErr w:type="gramEnd"/>
     </w:p>
     <w:p>
       <w:pPr>
         <w:pStyle w:val="GrundtextEinrckung"/>
       </w:pPr>
-      <w:proofErr w:type="spellStart"/>
       <w:r>
         <w:t>GoM</w:t>
       </w:r>
-      <w:proofErr w:type="spellEnd"/>
       <w:r>
         <w:tab/>
         <w:t>Grundsätze ordnungsmäßiger Modellierung</w:t>
@@ -3969,11 +3913,9 @@
       <w:pPr>
         <w:pStyle w:val="GrundtextEinrckung"/>
       </w:pPr>
-      <w:proofErr w:type="spellStart"/>
       <w:r>
         <w:t>pt</w:t>
       </w:r>
-      <w:proofErr w:type="spellEnd"/>
       <w:r>
         <w:tab/>
         <w:t>Point</w:t>
@@ -4109,7 +4051,6 @@
       <w:pPr>
         <w:pStyle w:val="GrundtextEinrckung"/>
       </w:pPr>
-      <w:proofErr w:type="spellStart"/>
       <w:r>
         <w:t>r</w:t>
       </w:r>
@@ -4119,7 +4060,6 @@
         </w:rPr>
         <w:t>s</w:t>
       </w:r>
-      <w:proofErr w:type="spellEnd"/>
       <w:r>
         <w:tab/>
         <w:t>Abstand der Stufe s in cm vom Seitenrand</w:t>
@@ -4291,15 +4231,7 @@
         <w:sym w:font="Symbol" w:char="F0AE"/>
       </w:r>
       <w:r>
-        <w:t xml:space="preserve"> Format/Absatz/</w:t>
-      </w:r>
-      <w:proofErr w:type="spellStart"/>
-      <w:r>
-        <w:t>Textfluß</w:t>
-      </w:r>
-      <w:proofErr w:type="spellEnd"/>
-      <w:r>
-        <w:t>] die Option [Seitenwechsel oberhalb] deaktiviert wird.</w:t>
+        <w:t xml:space="preserve"> Format/Absatz/Textfluß] die Option [Seitenwechsel oberhalb] deaktiviert wird.</w:t>
       </w:r>
     </w:p>
     <w:p>
@@ -4557,32 +4489,14 @@
       <w:r>
         <w:t>Eine Geste ist eine Bewegung, welche der zwischenmenschlichen Kommunikation dient [</w:t>
       </w:r>
-      <w:proofErr w:type="spellStart"/>
-      <w:r>
-        <w:fldChar w:fldCharType="begin"/>
-      </w:r>
-      <w:r>
-        <w:instrText>HYPERLINK \l "wiki_gestik"</w:instrText>
-      </w:r>
-      <w:r>
-        <w:fldChar w:fldCharType="separate"/>
-      </w:r>
-      <w:r>
-        <w:rPr>
-          <w:rStyle w:val="Hyperlink"/>
-        </w:rPr>
-        <w:t>wiki</w:t>
-      </w:r>
-      <w:proofErr w:type="spellEnd"/>
-      <w:r>
-        <w:rPr>
-          <w:rStyle w:val="Hyperlink"/>
-        </w:rPr>
-        <w:t>., Gestik</w:t>
-      </w:r>
-      <w:r>
-        <w:fldChar w:fldCharType="end"/>
-      </w:r>
+      <w:hyperlink w:anchor="wiki_gestik" w:history="1">
+        <w:r>
+          <w:rPr>
+            <w:rStyle w:val="Hyperlink"/>
+          </w:rPr>
+          <w:t>wiki., Gestik</w:t>
+        </w:r>
+      </w:hyperlink>
       <w:r>
         <w:t>]</w:t>
       </w:r>
@@ -4652,55 +4566,7 @@
           <w:i/>
           <w:iCs/>
         </w:rPr>
-        <w:t>Human Pose-</w:t>
-      </w:r>
-      <w:proofErr w:type="spellStart"/>
-      <w:r>
-        <w:rPr>
-          <w:i/>
-          <w:iCs/>
-        </w:rPr>
-        <w:t>based</w:t>
-      </w:r>
-      <w:proofErr w:type="spellEnd"/>
-      <w:r>
-        <w:rPr>
-          <w:i/>
-          <w:iCs/>
-        </w:rPr>
-        <w:t xml:space="preserve"> </w:t>
-      </w:r>
-      <w:proofErr w:type="spellStart"/>
-      <w:r>
-        <w:rPr>
-          <w:i/>
-          <w:iCs/>
-        </w:rPr>
-        <w:t>Estimation</w:t>
-      </w:r>
-      <w:proofErr w:type="spellEnd"/>
-      <w:r>
-        <w:rPr>
-          <w:i/>
-          <w:iCs/>
-        </w:rPr>
-        <w:t xml:space="preserve">, Tracking and Action Recognition </w:t>
-      </w:r>
-      <w:proofErr w:type="spellStart"/>
-      <w:r>
-        <w:rPr>
-          <w:i/>
-          <w:iCs/>
-        </w:rPr>
-        <w:t>with</w:t>
-      </w:r>
-      <w:proofErr w:type="spellEnd"/>
-      <w:r>
-        <w:rPr>
-          <w:i/>
-          <w:iCs/>
-        </w:rPr>
-        <w:t xml:space="preserve"> Deep Learning: A Survey</w:t>
+        <w:t>Human Pose-based Estimation, Tracking and Action Recognition with Deep Learning: A Survey</w:t>
       </w:r>
       <w:r>
         <w:rPr>
@@ -4732,67 +4598,21 @@
       <w:r>
         <w:t xml:space="preserve"> drei Verfahren unterteilt: „</w:t>
       </w:r>
-      <w:proofErr w:type="spellStart"/>
-      <w:r>
-        <w:t>pose</w:t>
-      </w:r>
-      <w:proofErr w:type="spellEnd"/>
-      <w:r>
-        <w:t xml:space="preserve"> </w:t>
-      </w:r>
-      <w:proofErr w:type="spellStart"/>
-      <w:r>
-        <w:t>estimation</w:t>
-      </w:r>
-      <w:proofErr w:type="spellEnd"/>
-      <w:r>
-        <w:t xml:space="preserve">, </w:t>
-      </w:r>
-      <w:proofErr w:type="spellStart"/>
-      <w:r>
-        <w:t>pose</w:t>
-      </w:r>
-      <w:proofErr w:type="spellEnd"/>
-      <w:r>
-        <w:t xml:space="preserve"> </w:t>
-      </w:r>
-      <w:proofErr w:type="spellStart"/>
-      <w:r>
-        <w:t>tracking</w:t>
-      </w:r>
-      <w:proofErr w:type="spellEnd"/>
-      <w:r>
-        <w:t xml:space="preserve">, and </w:t>
-      </w:r>
-      <w:proofErr w:type="spellStart"/>
-      <w:r>
-        <w:t>action</w:t>
-      </w:r>
-      <w:proofErr w:type="spellEnd"/>
-      <w:r>
-        <w:t xml:space="preserve"> </w:t>
-      </w:r>
-      <w:proofErr w:type="spellStart"/>
-      <w:r>
-        <w:t>recognition</w:t>
-      </w:r>
-      <w:proofErr w:type="spellEnd"/>
+      <w:r>
+        <w:t>pose estimation, pose tracking, and action recognition</w:t>
+      </w:r>
       <w:r>
         <w:t xml:space="preserve">“ übersetzt bedeutet das: </w:t>
       </w:r>
-      <w:proofErr w:type="spellStart"/>
       <w:r>
         <w:t>Posenschätzung</w:t>
       </w:r>
-      <w:proofErr w:type="spellEnd"/>
       <w:r>
         <w:t xml:space="preserve"> (Körperpose), </w:t>
       </w:r>
-      <w:proofErr w:type="spellStart"/>
       <w:r>
         <w:t>Posenverfolgung</w:t>
       </w:r>
-      <w:proofErr w:type="spellEnd"/>
       <w:r>
         <w:t xml:space="preserve"> und </w:t>
       </w:r>
@@ -4818,15 +4638,7 @@
         <w:jc w:val="both"/>
       </w:pPr>
       <w:r>
-        <w:t xml:space="preserve">Pose </w:t>
-      </w:r>
-      <w:proofErr w:type="spellStart"/>
-      <w:r>
-        <w:t>Estimation</w:t>
-      </w:r>
-      <w:proofErr w:type="spellEnd"/>
-      <w:r>
-        <w:t> bezieht sich auf die Bestimmung der Position menschlicher Gelenke in Bildern oder Bildsequenzen</w:t>
+        <w:t>Pose Estimation bezieht sich auf die Bestimmung der Position menschlicher Gelenke in Bildern oder Bildsequenzen</w:t>
       </w:r>
     </w:p>
     <w:p>
@@ -5017,13 +4829,8 @@
       <w:r>
         <w:t>, das nennt sich dann „</w:t>
       </w:r>
-      <w:proofErr w:type="spellStart"/>
-      <w:r>
-        <w:t>Supervised</w:t>
-      </w:r>
-      <w:proofErr w:type="spellEnd"/>
-      <w:r>
-        <w:t xml:space="preserve"> Learning</w:t>
+      <w:r>
+        <w:t>Supervised Learning</w:t>
       </w:r>
       <w:r>
         <w:t>“</w:t>
@@ -5031,26 +4838,14 @@
       <w:r>
         <w:t xml:space="preserve"> [</w:t>
       </w:r>
-      <w:proofErr w:type="spellStart"/>
-      <w:r>
-        <w:fldChar w:fldCharType="begin"/>
-      </w:r>
-      <w:r>
-        <w:instrText>HYPERLINK \l "wiki_SL"</w:instrText>
-      </w:r>
-      <w:r>
-        <w:fldChar w:fldCharType="separate"/>
-      </w:r>
-      <w:r>
-        <w:rPr>
-          <w:rStyle w:val="Hyperlink"/>
-        </w:rPr>
-        <w:t>wiki_SL</w:t>
-      </w:r>
-      <w:proofErr w:type="spellEnd"/>
-      <w:r>
-        <w:fldChar w:fldCharType="end"/>
-      </w:r>
+      <w:hyperlink w:anchor="wiki_SL" w:history="1">
+        <w:r>
+          <w:rPr>
+            <w:rStyle w:val="Hyperlink"/>
+          </w:rPr>
+          <w:t>wiki_SL</w:t>
+        </w:r>
+      </w:hyperlink>
       <w:r>
         <w:t>].</w:t>
       </w:r>
@@ -5084,15 +4879,7 @@
         </w:numPr>
       </w:pPr>
       <w:r>
-        <w:t>indirekte (</w:t>
-      </w:r>
-      <w:proofErr w:type="spellStart"/>
-      <w:r>
-        <w:t>pose-based</w:t>
-      </w:r>
-      <w:proofErr w:type="spellEnd"/>
-      <w:r>
-        <w:t xml:space="preserve"> / mehrstufige)</w:t>
+        <w:t>indirekte (pose-based / mehrstufige)</w:t>
       </w:r>
       <w:r>
         <w:t xml:space="preserve">: </w:t>
@@ -5201,13 +4988,8 @@
       </w:pPr>
       <w:r>
         <w:lastRenderedPageBreak/>
-        <w:t>verschiedene Ansätze der Bildverarbeitung/</w:t>
-      </w:r>
-      <w:proofErr w:type="spellStart"/>
-      <w:r>
-        <w:t>Gesternerkennung</w:t>
-      </w:r>
-      <w:proofErr w:type="spellEnd"/>
+        <w:t>verschiedene Ansätze der Bildverarbeitung/Gesternerkennung</w:t>
+      </w:r>
     </w:p>
     <w:p>
       <w:pPr>
@@ -5228,27 +5010,14 @@
       <w:r>
         <w:t xml:space="preserve">von </w:t>
       </w:r>
-      <w:proofErr w:type="spellStart"/>
-      <w:r>
-        <w:t>Oudah</w:t>
-      </w:r>
-      <w:proofErr w:type="spellEnd"/>
-      <w:r>
-        <w:t xml:space="preserve"> M., Al-Naji A.</w:t>
+      <w:r>
+        <w:t>Oudah M., Al-Naji A.</w:t>
       </w:r>
       <w:r>
         <w:t xml:space="preserve"> und</w:t>
       </w:r>
       <w:r>
-        <w:t xml:space="preserve"> </w:t>
-      </w:r>
-      <w:proofErr w:type="spellStart"/>
-      <w:r>
-        <w:t>Chahl</w:t>
-      </w:r>
-      <w:proofErr w:type="spellEnd"/>
-      <w:r>
-        <w:t xml:space="preserve"> J.</w:t>
+        <w:t xml:space="preserve"> Chahl J.</w:t>
       </w:r>
       <w:r>
         <w:t xml:space="preserve"> [</w:t>
@@ -5393,27 +5162,14 @@
       <w:r>
         <w:t xml:space="preserve">-Verfahren“ soll die vorherige Gruppierung aus dem technischen Review von </w:t>
       </w:r>
-      <w:proofErr w:type="spellStart"/>
-      <w:r>
-        <w:t>Oudah</w:t>
-      </w:r>
-      <w:proofErr w:type="spellEnd"/>
-      <w:r>
-        <w:t xml:space="preserve"> M., Al-Naji A.</w:t>
+      <w:r>
+        <w:t>Oudah M., Al-Naji A.</w:t>
       </w:r>
       <w:r>
         <w:t xml:space="preserve"> und</w:t>
       </w:r>
       <w:r>
-        <w:t xml:space="preserve"> </w:t>
-      </w:r>
-      <w:proofErr w:type="spellStart"/>
-      <w:r>
-        <w:t>Chahl</w:t>
-      </w:r>
-      <w:proofErr w:type="spellEnd"/>
-      <w:r>
-        <w:t xml:space="preserve"> J.</w:t>
+        <w:t xml:space="preserve"> Chahl J.</w:t>
       </w:r>
       <w:r>
         <w:t xml:space="preserve"> erweitert werden.</w:t>
@@ -5430,15 +5186,7 @@
         <w:t>Farbbasierte</w:t>
       </w:r>
       <w:r>
-        <w:t xml:space="preserve"> Verfahren nutzen Hautfarbe oder farbige Marker zur Segmentierung der Hand. Diese Ansätze </w:t>
-      </w:r>
-      <w:proofErr w:type="gramStart"/>
-      <w:r>
-        <w:t>sind vergleichsweise</w:t>
-      </w:r>
-      <w:proofErr w:type="gramEnd"/>
-      <w:r>
-        <w:t xml:space="preserve"> einfach umzusetzen und eignen sich gut für kontrollierte Umgebungen, reagieren jedoch empfindlich auf Beleuchtungsänderungen und auf Hintergründe mit ähnlichen Farbwerten</w:t>
+        <w:t xml:space="preserve"> Verfahren nutzen Hautfarbe oder farbige Marker zur Segmentierung der Hand. Diese Ansätze sind vergleichsweise einfach umzusetzen und eignen sich gut für kontrollierte Umgebungen, reagieren jedoch empfindlich auf Beleuchtungsänderungen und auf Hintergründe mit ähnlichen Farbwerten</w:t>
       </w:r>
       <w:r>
         <w:t>.</w:t>
@@ -5737,6 +5485,347 @@
       </w:pPr>
       <w:r>
         <w:lastRenderedPageBreak/>
+        <w:t>Hardware und Software</w:t>
+      </w:r>
+    </w:p>
+    <w:p>
+      <w:pPr>
+        <w:pStyle w:val="Grundtext"/>
+      </w:pPr>
+      <w:r>
+        <w:t xml:space="preserve">In diesem Abschnitt wird entschieden welche </w:t>
+      </w:r>
+      <w:r>
+        <w:t>Hardware</w:t>
+      </w:r>
+      <w:r>
+        <w:t>-</w:t>
+      </w:r>
+      <w:r>
+        <w:t xml:space="preserve"> und Software-Komponenten</w:t>
+      </w:r>
+      <w:r>
+        <w:t xml:space="preserve"> in diesem Projekt zum Einsatz kommen. Also welche Kamera, Recheneinheit und Programmumgebung genutzt wird genutzt, um die Gestenerkennung zu realisieren.</w:t>
+      </w:r>
+    </w:p>
+    <w:p>
+      <w:pPr>
+        <w:pStyle w:val="berschrift2"/>
+      </w:pPr>
+      <w:r>
+        <w:t>Anforderungen</w:t>
+      </w:r>
+    </w:p>
+    <w:p>
+      <w:pPr>
+        <w:pStyle w:val="Grundtext"/>
+      </w:pPr>
+      <w:r>
+        <w:t xml:space="preserve">Die Wahl der Komponenten unterliegt Kreterin. Diese stammen </w:t>
+      </w:r>
+      <w:r>
+        <w:t>vorrangig</w:t>
+      </w:r>
+      <w:r>
+        <w:t xml:space="preserve"> </w:t>
+      </w:r>
+      <w:r>
+        <w:t>aus dem Projekt</w:t>
+      </w:r>
+      <w:r>
+        <w:t xml:space="preserve"> und der Physische Projektumgebung, also dem 3D-Audio-Raum</w:t>
+      </w:r>
+      <w:r>
+        <w:t xml:space="preserve">. Weitere Kreterin ergeben sich mit der Wahl der Komponenten. </w:t>
+      </w:r>
+    </w:p>
+    <w:p>
+      <w:pPr>
+        <w:pStyle w:val="Grundtext"/>
+      </w:pPr>
+      <w:r>
+        <w:t xml:space="preserve">Soll zum Beispiel eine 3D-Kamera wie die </w:t>
+      </w:r>
+      <w:hyperlink r:id="rId13" w:history="1">
+        <w:r>
+          <w:rPr>
+            <w:rStyle w:val="Hyperlink"/>
+          </w:rPr>
+          <w:t>Micr</w:t>
+        </w:r>
+        <w:r>
+          <w:rPr>
+            <w:rStyle w:val="Hyperlink"/>
+          </w:rPr>
+          <w:t>o</w:t>
+        </w:r>
+        <w:r>
+          <w:rPr>
+            <w:rStyle w:val="Hyperlink"/>
+          </w:rPr>
+          <w:t>soft Kinect</w:t>
+        </w:r>
+      </w:hyperlink>
+      <w:r>
+        <w:t xml:space="preserve"> zum Einsatz kommen, dann muss die Programmumgebung in der Lage sein die notwendige Treiber Software zu integrieren. </w:t>
+      </w:r>
+    </w:p>
+    <w:p>
+      <w:pPr>
+        <w:pStyle w:val="Grundtext"/>
+      </w:pPr>
+      <w:r>
+        <w:t xml:space="preserve">Soll eine bestimmte Software eingesetzt werden, beispielsweise </w:t>
+      </w:r>
+      <w:hyperlink r:id="rId14" w:history="1">
+        <w:r>
+          <w:rPr>
+            <w:rStyle w:val="Hyperlink"/>
+          </w:rPr>
+          <w:t>MATLAB Simulink</w:t>
+        </w:r>
+      </w:hyperlink>
+      <w:r>
+        <w:t>, dann muss die Recheneinheit ein Betriebssystem handeln können, welches die Installation von MATLAB unterstützt. Weiterhin müsste deren Rechenleistung ausreichen, um eine Gestensteuerung via Simulink zu betreiben.</w:t>
+      </w:r>
+    </w:p>
+    <w:p>
+      <w:pPr>
+        <w:pStyle w:val="berschrift3"/>
+      </w:pPr>
+      <w:r>
+        <w:t>Projekta</w:t>
+      </w:r>
+      <w:r>
+        <w:t>nforderungen an die Kamera</w:t>
+      </w:r>
+    </w:p>
+    <w:p>
+      <w:pPr>
+        <w:pStyle w:val="Grundtext"/>
+      </w:pPr>
+      <w:r>
+        <w:t>Die Kamera muss mit dem Projektbudget finanzierbar sein.</w:t>
+      </w:r>
+    </w:p>
+    <w:p>
+      <w:pPr>
+        <w:pStyle w:val="Grundtext"/>
+      </w:pPr>
+      <w:r>
+        <w:t>Die Kamera muss im 3D-Audio-Raum installiert werden können, beispielsweise mittels Halterung am Metallgerüst, an welchem auch die Lautsprecher montiert sind.</w:t>
+      </w:r>
+    </w:p>
+    <w:p>
+      <w:pPr>
+        <w:pStyle w:val="Grundtext"/>
+      </w:pPr>
+      <w:r>
+        <w:t>Der Sichtbereich muss den Handlungsbereich abdecken, die Armbewegungen des Dirigenten sollten das Kamerabild nicht verlassen, damit die Gesten optimal interpretiert werden können.</w:t>
+      </w:r>
+    </w:p>
+    <w:p>
+      <w:pPr>
+        <w:pStyle w:val="Grundtext"/>
+      </w:pPr>
+      <w:r>
+        <w:t>Das Kamerabild muss ausreichend Bildinformationen liefern, um eine Gestenerkennung anwenden zu können. Dieser Informationsgehalt hängt jedoch nicht nur von der Kamera an sich ab, sondern auch von ihrer Positionierung im Raum und den Lichtverhältnissen. Bei der Wahl der Kamera ist hierbei auf ein Minimum der Auflösung, der Lichtempfindlichkeit und der Bildwiederholungsrate (Framerate) zu achten, also auf ein Minimum an Bildqualität. Zu dem ist zu entscheiden um es eine 2D oder 3D-Kamera seien soll. Eine 3D-Kamera gibt neben den Farbwerten des 2D Pixelfeldes auch Tiefeninformation bestimmter Bildbereiche.</w:t>
+      </w:r>
+    </w:p>
+    <w:p>
+      <w:pPr>
+        <w:pStyle w:val="Grundtext"/>
+      </w:pPr>
+      <w:r>
+        <w:lastRenderedPageBreak/>
+        <w:t xml:space="preserve">Bezüglich: Preis, Bildqualität und Installierbarkeit sind die Anforderungen wahrscheinlich unkritische, da </w:t>
+      </w:r>
+      <w:r>
+        <w:t xml:space="preserve">aktuelle </w:t>
+      </w:r>
+      <w:r>
+        <w:t>bereits mausgroße USB-Webcams für ca. 30€, Full HD (1920x1080 Pixel) in 30 FPS liefern.</w:t>
+      </w:r>
+    </w:p>
+    <w:p>
+      <w:pPr>
+        <w:pStyle w:val="Grundtext"/>
+      </w:pPr>
+      <w:r>
+        <w:t>Weiterhin ist davon auszugehen, dass das Projekt in diesem Stadium noch ausreichend flexibel ist</w:t>
+      </w:r>
+      <w:r>
+        <w:t>, um Eine Gestenerkennung</w:t>
+      </w:r>
+      <w:r>
+        <w:t xml:space="preserve"> </w:t>
+      </w:r>
+      <w:r>
+        <w:t>sowohl mit einer 2D- als auch mit einer 3D-Kammera implementiert werden kann</w:t>
+      </w:r>
+      <w:r>
+        <w:t>.</w:t>
+      </w:r>
+    </w:p>
+    <w:p>
+      <w:pPr>
+        <w:pStyle w:val="Grundtext"/>
+      </w:pPr>
+      <w:r>
+        <w:t>An dieser Stelle ist</w:t>
+      </w:r>
+      <w:r>
+        <w:t xml:space="preserve"> also</w:t>
+      </w:r>
+      <w:r>
+        <w:t xml:space="preserve"> vorrangig festzulegen welchen Öffnungswinkel der Kamerasensor haben soll</w:t>
+      </w:r>
+      <w:r>
+        <w:t>.</w:t>
+      </w:r>
+    </w:p>
+    <w:p>
+      <w:pPr>
+        <w:pStyle w:val="Grundtext"/>
+      </w:pPr>
+      <w:r>
+        <w:t xml:space="preserve">Der Öffnungswinkel einer Kamera kann in zwei Dimensionen gemessen werden horizontal und vertikal. </w:t>
+      </w:r>
+      <w:r>
+        <w:t>In Englisch “</w:t>
+      </w:r>
+      <w:r>
+        <w:t>horizontal field of view</w:t>
+      </w:r>
+      <w:r>
+        <w:t>” und “</w:t>
+      </w:r>
+      <w:r>
+        <w:t>vertical field of view</w:t>
+      </w:r>
+      <w:r>
+        <w:t>” genannt, oder kurz “</w:t>
+      </w:r>
+      <w:r>
+        <w:t>hFOV</w:t>
+      </w:r>
+      <w:r>
+        <w:t>” und “</w:t>
+      </w:r>
+      <w:r>
+        <w:t>vFOV</w:t>
+      </w:r>
+      <w:r>
+        <w:t>”.</w:t>
+      </w:r>
+      <w:r>
+        <w:t xml:space="preserve"> Welcher hFOV und vFOV nötig ist hänkt von folgenden Faktoren ab:</w:t>
+      </w:r>
+    </w:p>
+    <w:p>
+      <w:pPr>
+        <w:pStyle w:val="Grundtext"/>
+        <w:numPr>
+          <w:ilvl w:val="0"/>
+          <w:numId w:val="31"/>
+        </w:numPr>
+      </w:pPr>
+      <w:r>
+        <w:t>Standzone: Bereich, am Boden, auf dem der Dirigent stehen können soll, um erkannt zu werden.</w:t>
+      </w:r>
+    </w:p>
+    <w:p>
+      <w:pPr>
+        <w:pStyle w:val="Grundtext"/>
+        <w:numPr>
+          <w:ilvl w:val="0"/>
+          <w:numId w:val="31"/>
+        </w:numPr>
+      </w:pPr>
+      <w:r>
+        <w:t>Armradius: Bereich, welchen die Arme des Dirigenten in Anspruch nehmen wenn er „dirigiert“ – mit Gesten steuert.</w:t>
+      </w:r>
+    </w:p>
+    <w:p>
+      <w:pPr>
+        <w:pStyle w:val="Grundtext"/>
+        <w:numPr>
+          <w:ilvl w:val="0"/>
+          <w:numId w:val="31"/>
+        </w:numPr>
+      </w:pPr>
+      <w:r>
+        <w:t>Entfernung der Kamera zum Dirigenten bzw. zur Standzone.</w:t>
+      </w:r>
+    </w:p>
+    <w:p>
+      <w:pPr>
+        <w:pStyle w:val="Grundtext"/>
+        <w:numPr>
+          <w:ilvl w:val="0"/>
+          <w:numId w:val="31"/>
+        </w:numPr>
+      </w:pPr>
+      <w:r>
+        <w:t>Neigungswinkel: aus welcher höhe ist die Kamera auf den Dirigenten gerichtet.</w:t>
+      </w:r>
+    </w:p>
+    <w:p>
+      <w:pPr>
+        <w:pStyle w:val="Grundtext"/>
+        <w:numPr>
+          <w:ilvl w:val="0"/>
+          <w:numId w:val="31"/>
+        </w:numPr>
+      </w:pPr>
+      <w:r>
+        <w:t xml:space="preserve">Größe des Dirigenten: menschliche Körpergröße und der damit zuhängende hängende Armradius. </w:t>
+      </w:r>
+    </w:p>
+    <w:p>
+      <w:pPr>
+        <w:pStyle w:val="Grundtext"/>
+      </w:pPr>
+      <w:r>
+        <w:t>Da die Position der Kamera noch nicht …</w:t>
+      </w:r>
+    </w:p>
+    <w:p>
+      <w:pPr>
+        <w:pStyle w:val="berschrift3"/>
+      </w:pPr>
+      <w:r>
+        <w:t xml:space="preserve">Projektanforderungen </w:t>
+      </w:r>
+      <w:r>
+        <w:t>an die Recheneinheit</w:t>
+      </w:r>
+    </w:p>
+    <w:p>
+      <w:pPr>
+        <w:pStyle w:val="berschrift3"/>
+      </w:pPr>
+      <w:r>
+        <w:t xml:space="preserve">Projektanforderungen </w:t>
+      </w:r>
+      <w:r>
+        <w:t xml:space="preserve">an die Programmumgebung </w:t>
+      </w:r>
+    </w:p>
+    <w:p>
+      <w:pPr>
+        <w:pStyle w:val="berschrift2"/>
+      </w:pPr>
+      <w:r>
+        <w:t>Wahl der Hardware und Software</w:t>
+      </w:r>
+    </w:p>
+    <w:p>
+      <w:pPr>
+        <w:pStyle w:val="berschrift1"/>
+      </w:pPr>
+      <w:r>
+        <w:lastRenderedPageBreak/>
         <w:t>Armwinkel schätzen</w:t>
       </w:r>
     </w:p>
@@ -5771,69 +5860,7 @@
         <w:pStyle w:val="Grundtext"/>
       </w:pPr>
       <w:r>
-        <w:t>Im Werk “</w:t>
-      </w:r>
-      <w:r>
-        <w:t xml:space="preserve">Visual </w:t>
-      </w:r>
-      <w:proofErr w:type="spellStart"/>
-      <w:r>
-        <w:t>recognition</w:t>
-      </w:r>
-      <w:proofErr w:type="spellEnd"/>
-      <w:r>
-        <w:t xml:space="preserve"> </w:t>
-      </w:r>
-      <w:proofErr w:type="spellStart"/>
-      <w:r>
-        <w:t>of</w:t>
-      </w:r>
-      <w:proofErr w:type="spellEnd"/>
-      <w:r>
-        <w:t xml:space="preserve"> </w:t>
-      </w:r>
-      <w:proofErr w:type="spellStart"/>
-      <w:r>
-        <w:t>pointing</w:t>
-      </w:r>
-      <w:proofErr w:type="spellEnd"/>
-      <w:r>
-        <w:t xml:space="preserve"> </w:t>
-      </w:r>
-      <w:proofErr w:type="spellStart"/>
-      <w:r>
-        <w:t>gestures</w:t>
-      </w:r>
-      <w:proofErr w:type="spellEnd"/>
-      <w:r>
-        <w:t xml:space="preserve"> </w:t>
-      </w:r>
-      <w:proofErr w:type="spellStart"/>
-      <w:r>
-        <w:t>for</w:t>
-      </w:r>
-      <w:proofErr w:type="spellEnd"/>
-      <w:r>
-        <w:t xml:space="preserve"> human–</w:t>
-      </w:r>
-      <w:proofErr w:type="spellStart"/>
-      <w:r>
-        <w:t>robot</w:t>
-      </w:r>
-      <w:proofErr w:type="spellEnd"/>
-      <w:r>
-        <w:t xml:space="preserve"> </w:t>
-      </w:r>
-      <w:proofErr w:type="spellStart"/>
-      <w:r>
-        <w:t>interaction</w:t>
-      </w:r>
-      <w:proofErr w:type="spellEnd"/>
-      <w:r>
-        <w:t xml:space="preserve">” von </w:t>
-      </w:r>
-      <w:r>
-        <w:t xml:space="preserve">Kai Nickel </w:t>
+        <w:t xml:space="preserve">Im Werk “Visual recognition of pointing gestures for human–robot interaction” von Kai Nickel </w:t>
       </w:r>
       <w:r>
         <w:t>und</w:t>
@@ -6006,16 +6033,11 @@
         <w:t>Der</w:t>
       </w:r>
       <w:r>
-        <w:t xml:space="preserve">/ </w:t>
-      </w:r>
-      <w:proofErr w:type="gramStart"/>
-      <w:r>
-        <w:t>die</w:t>
+        <w:t>/ die</w:t>
       </w:r>
       <w:r>
         <w:t xml:space="preserve"> Student</w:t>
       </w:r>
-      <w:proofErr w:type="gramEnd"/>
       <w:r>
         <w:t>/ in</w:t>
       </w:r>
@@ -6140,15 +6162,7 @@
         <w:t>Inhalt</w:t>
       </w:r>
       <w:r>
-        <w:t xml:space="preserve"> (was ist die „Erkenntnis</w:t>
-      </w:r>
-      <w:proofErr w:type="gramStart"/>
-      <w:r>
-        <w:t>“?,</w:t>
-      </w:r>
-      <w:proofErr w:type="gramEnd"/>
-      <w:r>
-        <w:t xml:space="preserve"> wie gut wird die Thematik herausgearbeitet?), </w:t>
+        <w:t xml:space="preserve"> (was ist die „Erkenntnis“?, wie gut wird die Thematik herausgearbeitet?), </w:t>
       </w:r>
       <w:r>
         <w:rPr>
@@ -6166,23 +6180,7 @@
         <w:t>Arbeitsweise</w:t>
       </w:r>
       <w:r>
-        <w:t xml:space="preserve"> (wie wird die vorhandene Literatur </w:t>
-      </w:r>
-      <w:proofErr w:type="gramStart"/>
-      <w:r>
-        <w:t>verwertet?,</w:t>
-      </w:r>
-      <w:proofErr w:type="gramEnd"/>
-      <w:r>
-        <w:t xml:space="preserve"> wie ist der </w:t>
-      </w:r>
-      <w:proofErr w:type="gramStart"/>
-      <w:r>
-        <w:t>Schreibstil?,</w:t>
-      </w:r>
-      <w:proofErr w:type="gramEnd"/>
-      <w:r>
-        <w:t xml:space="preserve">) und </w:t>
+        <w:t xml:space="preserve"> (wie wird die vorhandene Literatur verwertet?, wie ist der Schreibstil?,) und </w:t>
       </w:r>
       <w:r>
         <w:rPr>
@@ -6194,16 +6192,11 @@
         <w:t xml:space="preserve"> (wie ist der „Aufbau“?) der Arbeit haben. Es ist daher von hoher Bedeutung, dass sich </w:t>
       </w:r>
       <w:r>
-        <w:t>der/</w:t>
-      </w:r>
-      <w:proofErr w:type="gramStart"/>
-      <w:r>
-        <w:t xml:space="preserve">die </w:t>
+        <w:t xml:space="preserve">der/die </w:t>
       </w:r>
       <w:r>
         <w:t>Student</w:t>
       </w:r>
-      <w:proofErr w:type="gramEnd"/>
       <w:r>
         <w:t>*in</w:t>
       </w:r>
@@ -6217,15 +6210,7 @@
         <w:t xml:space="preserve">Betreuer im Laufe der Arbeitserstellung immer wieder abstimmen. Die Betreuungsintensität ist im Regelfall zu Beginn der Arbeit hoch und wird dann geringer. </w:t>
       </w:r>
       <w:r>
-        <w:t xml:space="preserve">Die </w:t>
-      </w:r>
-      <w:proofErr w:type="spellStart"/>
-      <w:r>
-        <w:t>Pflichtermine</w:t>
-      </w:r>
-      <w:proofErr w:type="spellEnd"/>
-      <w:r>
-        <w:t xml:space="preserve"> gem. Betreuungsplan sind vom Studierenden mindesten</w:t>
+        <w:t>Die Pflichtermine gem. Betreuungsplan sind vom Studierenden mindesten</w:t>
       </w:r>
       <w:r>
         <w:t>s in der geforderten Form gem. B</w:t>
@@ -6475,13 +6460,8 @@
       <w:r>
         <w:t xml:space="preserve">(1999), </w:t>
       </w:r>
-      <w:proofErr w:type="spellStart"/>
-      <w:r>
-        <w:t>Disterer</w:t>
-      </w:r>
-      <w:proofErr w:type="spellEnd"/>
-      <w:r>
-        <w:t xml:space="preserve"> </w:t>
+      <w:r>
+        <w:t xml:space="preserve">Disterer </w:t>
       </w:r>
       <w:r>
         <w:t>(</w:t>
@@ -6496,23 +6476,7 @@
         <w:t>aktuellen Ausgaben.</w:t>
       </w:r>
       <w:r>
-        <w:t xml:space="preserve"> Z.T. sind diese Quellen als </w:t>
-      </w:r>
-      <w:proofErr w:type="spellStart"/>
-      <w:r>
-        <w:t>pdf</w:t>
-      </w:r>
-      <w:proofErr w:type="spellEnd"/>
-      <w:r>
-        <w:t xml:space="preserve">-Datei oder als </w:t>
-      </w:r>
-      <w:proofErr w:type="spellStart"/>
-      <w:r>
-        <w:t>e-book</w:t>
-      </w:r>
-      <w:proofErr w:type="spellEnd"/>
-      <w:r>
-        <w:t xml:space="preserve"> verfügbar.</w:t>
+        <w:t xml:space="preserve"> Z.T. sind diese Quellen als pdf-Datei oder als e-book verfügbar.</w:t>
       </w:r>
     </w:p>
     <w:p>
@@ -6557,51 +6521,41 @@
         <w:pStyle w:val="Grundtext"/>
       </w:pPr>
       <w:r>
-        <w:t xml:space="preserve">Wissenschaftliche Arbeiten bestehen aus der Titelteil, dem Textteil und dem </w:t>
-      </w:r>
-      <w:proofErr w:type="spellStart"/>
+        <w:t>Wissenschaftliche Arbeiten bestehen aus der Titelteil, dem Textteil und dem Anhangteil. Zu</w:t>
+      </w:r>
+      <w:r>
+        <w:t>m</w:t>
+      </w:r>
+      <w:r>
+        <w:t xml:space="preserve"> Titel</w:t>
+      </w:r>
+      <w:r>
+        <w:t>t</w:t>
+      </w:r>
+      <w:r>
+        <w:t>ei</w:t>
+      </w:r>
+      <w:r>
+        <w:t>l</w:t>
+      </w:r>
+      <w:r>
+        <w:t xml:space="preserve"> gehören Haupttitel, Inhalts-, Abkürzungs-, Symbol-, Abbildungs- und Tabel</w:t>
+      </w:r>
+      <w:r>
+        <w:softHyphen/>
+        <w:t>lenverzeichnis. Der Textteil besteht aus einem einleitenden Abschnitt, dem Haupttext und einem abschließenden Abschnitt. Schließlich bilden der Anhang und das Litera</w:t>
+      </w:r>
+      <w:r>
+        <w:softHyphen/>
+        <w:t>tur</w:t>
+      </w:r>
+      <w:r>
+        <w:softHyphen/>
+        <w:t xml:space="preserve">verzeichnis den </w:t>
+      </w:r>
       <w:r>
         <w:t>Anhangteil</w:t>
       </w:r>
-      <w:proofErr w:type="spellEnd"/>
-      <w:r>
-        <w:t>. Zu</w:t>
-      </w:r>
-      <w:r>
-        <w:t>m</w:t>
-      </w:r>
-      <w:r>
-        <w:t xml:space="preserve"> Titel</w:t>
-      </w:r>
-      <w:r>
-        <w:t>t</w:t>
-      </w:r>
-      <w:r>
-        <w:t>ei</w:t>
-      </w:r>
-      <w:r>
-        <w:t>l</w:t>
-      </w:r>
-      <w:r>
-        <w:t xml:space="preserve"> gehören Haupttitel, Inhalts-, Abkürzungs-, Symbol-, Abbildungs- und Tabel</w:t>
-      </w:r>
-      <w:r>
-        <w:softHyphen/>
-        <w:t>lenverzeichnis. Der Textteil besteht aus einem einleitenden Abschnitt, dem Haupttext und einem abschließenden Abschnitt. Schließlich bilden der Anhang und das Litera</w:t>
-      </w:r>
-      <w:r>
-        <w:softHyphen/>
-        <w:t>tur</w:t>
-      </w:r>
-      <w:r>
-        <w:softHyphen/>
-        <w:t xml:space="preserve">verzeichnis den </w:t>
-      </w:r>
-      <w:proofErr w:type="spellStart"/>
-      <w:r>
-        <w:t>Anhangteil</w:t>
-      </w:r>
-      <w:proofErr w:type="spellEnd"/>
       <w:r>
         <w:t>.</w:t>
       </w:r>
@@ -6609,15 +6563,7 @@
         <w:t xml:space="preserve"> Lose Anlagen, wie z. B. Pläne können die wissenschaftliche Arbeit ergänzen.</w:t>
       </w:r>
       <w:r>
-        <w:t xml:space="preserve"> Der </w:t>
-      </w:r>
-      <w:proofErr w:type="spellStart"/>
-      <w:r>
-        <w:t>Bedraf</w:t>
-      </w:r>
-      <w:proofErr w:type="spellEnd"/>
-      <w:r>
-        <w:t xml:space="preserve"> eines Abkürzungs-, Symbol-, Abbildungs- oder Tabel</w:t>
+        <w:t xml:space="preserve"> Der Bedraf eines Abkürzungs-, Symbol-, Abbildungs- oder Tabel</w:t>
       </w:r>
       <w:r>
         <w:softHyphen/>
@@ -6758,15 +6704,7 @@
         <w:t>einem</w:t>
       </w:r>
       <w:r>
-        <w:t xml:space="preserve"> Gliederungspunkt). Eine Gliederung muss konsistent sein. Keine Artikel, keine Sätze. Kurze und knappe Überschriften. Eine gute Gliederung zu </w:t>
-      </w:r>
-      <w:proofErr w:type="gramStart"/>
-      <w:r>
-        <w:t>erarbeiten</w:t>
-      </w:r>
-      <w:proofErr w:type="gramEnd"/>
-      <w:r>
-        <w:t xml:space="preserve"> kostet Zeit. Die Gliederung ist die „Visitenkarte“ der Arbeit. Nehmen Sie sich Zeit. Auf jeder eröffneten Glie</w:t>
+        <w:t xml:space="preserve"> Gliederungspunkt). Eine Gliederung muss konsistent sein. Keine Artikel, keine Sätze. Kurze und knappe Überschriften. Eine gute Gliederung zu erarbeiten kostet Zeit. Die Gliederung ist die „Visitenkarte“ der Arbeit. Nehmen Sie sich Zeit. Auf jeder eröffneten Glie</w:t>
       </w:r>
       <w:r>
         <w:softHyphen/>
@@ -7104,15 +7042,7 @@
         <w:footnoteReference w:id="3"/>
       </w:r>
       <w:r>
-        <w:t xml:space="preserve"> An Satzanfängen und in Überschriften </w:t>
-      </w:r>
-      <w:proofErr w:type="gramStart"/>
-      <w:r>
-        <w:t>ist</w:t>
-      </w:r>
-      <w:proofErr w:type="gramEnd"/>
-      <w:r>
-        <w:t xml:space="preserve"> statt der Abkürzungen der ausgeschrie</w:t>
+        <w:t xml:space="preserve"> An Satzanfängen und in Überschriften ist statt der Abkürzungen der ausgeschrie</w:t>
       </w:r>
       <w:r>
         <w:softHyphen/>
@@ -7162,15 +7092,7 @@
         <w:pStyle w:val="GrundtextAufzhlung"/>
       </w:pPr>
       <w:r>
-        <w:t xml:space="preserve">Auf die Einführung von Symbolen ist zu verzichten, wenn ein Objekt in einem bestimmten Text nur </w:t>
-      </w:r>
-      <w:proofErr w:type="spellStart"/>
-      <w:r>
-        <w:t>ein Mal</w:t>
-      </w:r>
-      <w:proofErr w:type="spellEnd"/>
-      <w:r>
-        <w:t xml:space="preserve"> erscheint und auch nur kurz danach auf dieses Objekt zurückgegriffen wird.</w:t>
+        <w:t>Auf die Einführung von Symbolen ist zu verzichten, wenn ein Objekt in einem bestimmten Text nur ein Mal erscheint und auch nur kurz danach auf dieses Objekt zurückgegriffen wird.</w:t>
       </w:r>
     </w:p>
     <w:p>
@@ -7277,15 +7199,7 @@
       </w:r>
       <w:r>
         <w:softHyphen/>
-        <w:t>schieben‘ –</w:t>
-      </w:r>
-      <w:proofErr w:type="gramStart"/>
-      <w:r>
-        <w:t>insbesondere</w:t>
-      </w:r>
-      <w:proofErr w:type="gramEnd"/>
-      <w:r>
-        <w:t xml:space="preserve"> wenn der Definition eine umfangreiche Bedeutungs</w:t>
+        <w:t>schieben‘ –insbesondere wenn der Definition eine umfangreiche Bedeutungs</w:t>
       </w:r>
       <w:r>
         <w:softHyphen/>
@@ -7386,15 +7300,7 @@
         <w:t>ss</w:t>
       </w:r>
       <w:r>
-        <w:t xml:space="preserve">. Alle Aussagen sind zu erläutern, zu begründen oder zu belegen. Beispielsweise ist es nicht „erlaubt“ Behauptungen </w:t>
-      </w:r>
-      <w:proofErr w:type="gramStart"/>
-      <w:r>
-        <w:t>aufzustellen</w:t>
-      </w:r>
-      <w:proofErr w:type="gramEnd"/>
-      <w:r>
-        <w:t xml:space="preserve"> die der Autor nicht selbst belegen kann. Beispiel: „Eine zunehmende </w:t>
+        <w:t xml:space="preserve">. Alle Aussagen sind zu erläutern, zu begründen oder zu belegen. Beispielsweise ist es nicht „erlaubt“ Behauptungen aufzustellen die der Autor nicht selbst belegen kann. Beispiel: „Eine zunehmende </w:t>
       </w:r>
       <w:r>
         <w:t>Urbani</w:t>
@@ -7424,23 +7330,7 @@
         <w:t xml:space="preserve">oder dem Internet </w:t>
       </w:r>
       <w:r>
-        <w:t xml:space="preserve">reicht jedenfalls nicht aus! Weiteres Beispiel: „Die </w:t>
-      </w:r>
-      <w:proofErr w:type="spellStart"/>
-      <w:r>
-        <w:t>Balanced</w:t>
-      </w:r>
-      <w:proofErr w:type="spellEnd"/>
-      <w:r>
-        <w:t xml:space="preserve"> </w:t>
-      </w:r>
-      <w:proofErr w:type="spellStart"/>
-      <w:r>
-        <w:t>Scorecard</w:t>
-      </w:r>
-      <w:proofErr w:type="spellEnd"/>
-      <w:r>
-        <w:t xml:space="preserve"> enthält die vier Dimensionen: Prozesse, Mitarbeiter, Kunden und Finanzen […]“. Da sich der Autor das nicht gerade ausgedacht hat, muss bei dieser Behauptung ebenfalls zwingend auf die entsprechende Literatur verwiesen werden. Handelt es sich wie in diesem Beispiel um ein eindeutig zuordenbares Instrument muss der „Erschaffer“ benannt werden (in diesem Fall die Herren Norton und Kaplan). Grundsätzlich ist immer die „Quelle“ zu finden (und nicht irgendein „Zwischenhändler“).</w:t>
+        <w:t>reicht jedenfalls nicht aus! Weiteres Beispiel: „Die Balanced Scorecard enthält die vier Dimensionen: Prozesse, Mitarbeiter, Kunden und Finanzen […]“. Da sich der Autor das nicht gerade ausgedacht hat, muss bei dieser Behauptung ebenfalls zwingend auf die entsprechende Literatur verwiesen werden. Handelt es sich wie in diesem Beispiel um ein eindeutig zuordenbares Instrument muss der „Erschaffer“ benannt werden (in diesem Fall die Herren Norton und Kaplan). Grundsätzlich ist immer die „Quelle“ zu finden (und nicht irgendein „Zwischenhändler“).</w:t>
       </w:r>
     </w:p>
     <w:p>
@@ -7869,15 +7759,7 @@
         <w:pStyle w:val="GrundtextAufzhlung"/>
       </w:pPr>
       <w:r>
-        <w:t xml:space="preserve">Ein Fachbegriff darf in einer Arbeit nur </w:t>
-      </w:r>
-      <w:proofErr w:type="spellStart"/>
-      <w:r>
-        <w:t>ein Mal</w:t>
-      </w:r>
-      <w:proofErr w:type="spellEnd"/>
-      <w:r>
-        <w:t xml:space="preserve"> definiert werden.</w:t>
+        <w:t>Ein Fachbegriff darf in einer Arbeit nur ein Mal definiert werden.</w:t>
       </w:r>
     </w:p>
     <w:p>
@@ -8029,15 +7911,7 @@
       </w:pPr>
       <w:r>
         <w:lastRenderedPageBreak/>
-        <w:t xml:space="preserve">Generell gilt, dass einerseits jeweils die </w:t>
-      </w:r>
-      <w:proofErr w:type="gramStart"/>
-      <w:r>
-        <w:t>aktuellste</w:t>
-      </w:r>
-      <w:proofErr w:type="gramEnd"/>
-      <w:r>
-        <w:t xml:space="preserve"> Information zu verwenden ist, also z. B. die neueste Auflage eines Buches. Andererseits sind stets die Originalquellen zu zitieren. Wird z. B. in einem Buch zu Datenmodellen das Entity-Relationship-Modell erläutert und auf einen Aufsatz von </w:t>
+        <w:t xml:space="preserve">Generell gilt, dass einerseits jeweils die aktuellste Information zu verwenden ist, also z. B. die neueste Auflage eines Buches. Andererseits sind stets die Originalquellen zu zitieren. Wird z. B. in einem Buch zu Datenmodellen das Entity-Relationship-Modell erläutert und auf einen Aufsatz von </w:t>
       </w:r>
       <w:r>
         <w:rPr>
@@ -8058,15 +7932,7 @@
       </w:r>
       <w:r>
         <w:softHyphen/>
-        <w:t xml:space="preserve">dene Quellen herangezogen und gegeneinander abgegrenzt werden. Aussagen aus der Literatur dürfen nicht unreflektiert übernommen werden, sondern sind jeweils auf ihre Stichhaltigkeit zu prüfen. In der Literatur auftretende Widersprüche, </w:t>
-      </w:r>
-      <w:proofErr w:type="spellStart"/>
-      <w:r>
-        <w:t>Vagheiten</w:t>
-      </w:r>
-      <w:proofErr w:type="spellEnd"/>
-      <w:r>
-        <w:t xml:space="preserve"> o. ä. sind als solche kenntlich zu machen.</w:t>
+        <w:t>dene Quellen herangezogen und gegeneinander abgegrenzt werden. Aussagen aus der Literatur dürfen nicht unreflektiert übernommen werden, sondern sind jeweils auf ihre Stichhaltigkeit zu prüfen. In der Literatur auftretende Widersprüche, Vagheiten o. ä. sind als solche kenntlich zu machen.</w:t>
       </w:r>
     </w:p>
     <w:p>
@@ -8116,23 +7982,7 @@
         <w:t>eigene</w:t>
       </w:r>
       <w:r>
-        <w:t xml:space="preserve"> Leistung. Wenn die eigene Leistung in „</w:t>
-      </w:r>
-      <w:proofErr w:type="spellStart"/>
-      <w:r>
-        <w:t>copy</w:t>
-      </w:r>
-      <w:proofErr w:type="spellEnd"/>
-      <w:r>
-        <w:t xml:space="preserve"> and </w:t>
-      </w:r>
-      <w:proofErr w:type="spellStart"/>
-      <w:r>
-        <w:t>paste</w:t>
-      </w:r>
-      <w:proofErr w:type="spellEnd"/>
-      <w:r>
-        <w:t>“ und Expertensuche im Internet besteht, reicht das für eine ausreichende Leistung nicht aus.</w:t>
+        <w:t xml:space="preserve"> Leistung. Wenn die eigene Leistung in „copy and paste“ und Expertensuche im Internet besteht, reicht das für eine ausreichende Leistung nicht aus.</w:t>
       </w:r>
     </w:p>
     <w:p>
@@ -8158,15 +8008,7 @@
         <w:footnoteReference w:id="7"/>
       </w:r>
       <w:r>
-        <w:t xml:space="preserve"> aus der Quelle in die eigene Arbeit übernommen wird. Direkte Zitate sind durch dop-</w:t>
-      </w:r>
-      <w:proofErr w:type="spellStart"/>
-      <w:r>
-        <w:t>pelte</w:t>
-      </w:r>
-      <w:proofErr w:type="spellEnd"/>
-      <w:r>
-        <w:t xml:space="preserve"> Anführungszeichen gekennzeichnet, die Autoren werden ohne vorangehendes ‚vgl.‘ aufgeführt, z. B.: „Als </w:t>
+        <w:t xml:space="preserve"> aus der Quelle in die eigene Arbeit übernommen wird. Direkte Zitate sind durch dop-pelte Anführungszeichen gekennzeichnet, die Autoren werden ohne vorangehendes ‚vgl.‘ aufgeführt, z. B.: „Als </w:t>
       </w:r>
       <w:r>
         <w:rPr>
@@ -8175,15 +8017,7 @@
         <w:t>wörtliches (direktes) Zitat</w:t>
       </w:r>
       <w:r>
-        <w:t xml:space="preserve"> wird die unmittelbare und genaue Übernahme einer fremden Aussage bezeichnet.“, (</w:t>
-      </w:r>
-      <w:proofErr w:type="spellStart"/>
-      <w:r>
-        <w:t>Disterer</w:t>
-      </w:r>
-      <w:proofErr w:type="spellEnd"/>
-      <w:r>
-        <w:t xml:space="preserve"> (1998), S. 112; Her</w:t>
+        <w:t xml:space="preserve"> wird die unmittelbare und genaue Übernahme einer fremden Aussage bezeichnet.“, (Disterer (1998), S. 112; Her</w:t>
       </w:r>
       <w:r>
         <w:softHyphen/>
@@ -8387,35 +8221,11 @@
       </w:r>
       <w:r>
         <w:softHyphen/>
-        <w:t xml:space="preserve">fassers </w:t>
-      </w:r>
-      <w:proofErr w:type="gramStart"/>
-      <w:r>
-        <w:t>[....</w:t>
-      </w:r>
-      <w:proofErr w:type="gramEnd"/>
-      <w:r>
-        <w:t>]“ sind folglich sparsam einzusetzen. Lassen sich ausdrückliche Stellung</w:t>
-      </w:r>
-      <w:r>
-        <w:softHyphen/>
-        <w:t xml:space="preserve">nahmen in Einzelfällen nicht vermeiden, ist statt der ‚Ich‘- oder ‚Wir‘-Form („[...] Ich bin der Meinung </w:t>
-      </w:r>
-      <w:proofErr w:type="gramStart"/>
-      <w:r>
-        <w:t>[....</w:t>
-      </w:r>
-      <w:proofErr w:type="gramEnd"/>
-      <w:r>
-        <w:t xml:space="preserve">]“, „[...] Wir widersprechen der Auffassung </w:t>
-      </w:r>
-      <w:proofErr w:type="gramStart"/>
-      <w:r>
-        <w:t>[....</w:t>
-      </w:r>
-      <w:proofErr w:type="gramEnd"/>
-      <w:r>
-        <w:t>]“ o. ä.) eine Passiv-Konstruktion für die Formulierung zu verwenden, z. B. „[...] Es ist festzuhalten/zu berück</w:t>
+        <w:t>fassers [....]“ sind folglich sparsam einzusetzen. Lassen sich ausdrückliche Stellung</w:t>
+      </w:r>
+      <w:r>
+        <w:softHyphen/>
+        <w:t>nahmen in Einzelfällen nicht vermeiden, ist statt der ‚Ich‘- oder ‚Wir‘-Form („[...] Ich bin der Meinung [....]“, „[...] Wir widersprechen der Auffassung [....]“ o. ä.) eine Passiv-Konstruktion für die Formulierung zu verwenden, z. B. „[...] Es ist festzuhalten/zu berück</w:t>
       </w:r>
       <w:r>
         <w:softHyphen/>
@@ -8435,23 +8245,7 @@
       </w:r>
       <w:r>
         <w:softHyphen/>
-        <w:t xml:space="preserve">fügen </w:t>
-      </w:r>
-      <w:proofErr w:type="gramStart"/>
-      <w:r>
-        <w:t>[....</w:t>
-      </w:r>
-      <w:proofErr w:type="gramEnd"/>
-      <w:r>
-        <w:t xml:space="preserve">]“, „[...] Dieser Auffassung ist entgegenzuhalten </w:t>
-      </w:r>
-      <w:proofErr w:type="gramStart"/>
-      <w:r>
-        <w:t>[....</w:t>
-      </w:r>
-      <w:proofErr w:type="gramEnd"/>
-      <w:r>
-        <w:t>]“.</w:t>
+        <w:t>fügen [....]“, „[...] Dieser Auffassung ist entgegenzuhalten [....]“.</w:t>
       </w:r>
       <w:r>
         <w:rPr>
@@ -8646,15 +8440,7 @@
       </w:r>
       <w:r>
         <w:softHyphen/>
-        <w:t>chen (</w:t>
-      </w:r>
-      <w:proofErr w:type="spellStart"/>
-      <w:r>
-        <w:t>Grundz</w:t>
-      </w:r>
-      <w:proofErr w:type="spellEnd"/>
-      <w:r>
-        <w:t>.), zurück</w:t>
+        <w:t>chen (Grundz.), zurück</w:t>
       </w:r>
       <w:r>
         <w:softHyphen/>
@@ -8717,27 +8503,11 @@
         <w:pStyle w:val="Grundtext"/>
       </w:pPr>
       <w:r>
-        <w:t>Mit ‚</w:t>
-      </w:r>
-      <w:proofErr w:type="spellStart"/>
-      <w:r>
-        <w:t>Grundz</w:t>
-      </w:r>
-      <w:proofErr w:type="spellEnd"/>
-      <w:r>
-        <w:t>. (Sprache)‘ wird ein fremdsprachlicher Text gekennzeichnet. Sollte eine Überprüfung eines Abschnitts nicht erwünscht sein, so kann über die FV ‚</w:t>
-      </w:r>
-      <w:proofErr w:type="spellStart"/>
-      <w:r>
-        <w:t>Grund</w:t>
-      </w:r>
-      <w:r>
-        <w:softHyphen/>
-        <w:t>z</w:t>
-      </w:r>
-      <w:proofErr w:type="spellEnd"/>
-      <w:r>
-        <w:t>. (keine Überprüfung)‘ die Rechtschreibung ausgeschaltet werden.</w:t>
+        <w:t>Mit ‚Grundz. (Sprache)‘ wird ein fremdsprachlicher Text gekennzeichnet. Sollte eine Überprüfung eines Abschnitts nicht erwünscht sein, so kann über die FV ‚Grund</w:t>
+      </w:r>
+      <w:r>
+        <w:softHyphen/>
+        <w:t>z. (keine Überprüfung)‘ die Rechtschreibung ausgeschaltet werden.</w:t>
       </w:r>
     </w:p>
     <w:p>
@@ -8748,15 +8518,7 @@
         </w:rPr>
       </w:pPr>
       <w:r>
-        <w:t>Mit der FV ‚</w:t>
-      </w:r>
-      <w:proofErr w:type="spellStart"/>
-      <w:r>
-        <w:t>Grundz</w:t>
-      </w:r>
-      <w:proofErr w:type="spellEnd"/>
-      <w:r>
-        <w:t xml:space="preserve">. (Kapitälchen)‘ können die Namen von </w:t>
+        <w:t xml:space="preserve">Mit der FV ‚Grundz. (Kapitälchen)‘ können die Namen von </w:t>
       </w:r>
       <w:r>
         <w:rPr>
@@ -8765,15 +8527,7 @@
         <w:t>Autoren</w:t>
       </w:r>
       <w:r>
-        <w:t xml:space="preserve"> im Fließtext hervorgehoben werden; über ‚</w:t>
-      </w:r>
-      <w:proofErr w:type="spellStart"/>
-      <w:r>
-        <w:t>Grundz</w:t>
-      </w:r>
-      <w:proofErr w:type="spellEnd"/>
-      <w:r>
-        <w:t xml:space="preserve">. (Courrier)‘ kann </w:t>
+        <w:t xml:space="preserve"> im Fließtext hervorgehoben werden; über ‚Grundz. (Courrier)‘ kann </w:t>
       </w:r>
       <w:r>
         <w:rPr>
@@ -8812,44 +8566,19 @@
       </w:r>
       <w:r>
         <w:tab/>
-      </w:r>
-      <w:proofErr w:type="spellStart"/>
-      <w:r>
-        <w:t>Kunde.KdName</w:t>
-      </w:r>
-      <w:proofErr w:type="spellEnd"/>
-      <w:r>
-        <w:t xml:space="preserve">, </w:t>
-      </w:r>
-      <w:proofErr w:type="spellStart"/>
-      <w:r>
-        <w:t>Bestellung.BestNr</w:t>
-      </w:r>
-      <w:proofErr w:type="spellEnd"/>
-      <w:r>
-        <w:t xml:space="preserve">, </w:t>
-      </w:r>
-      <w:proofErr w:type="spellStart"/>
-      <w:r>
-        <w:t>Lieferant.LfNr</w:t>
-      </w:r>
-      <w:proofErr w:type="spellEnd"/>
+        <w:t>Kunde.KdName, Bestellung.BestNr, Lieferant.LfNr</w:t>
+      </w:r>
     </w:p>
     <w:p>
       <w:pPr>
         <w:pStyle w:val="GrundtextSQL"/>
       </w:pPr>
-      <w:proofErr w:type="gramStart"/>
       <w:r>
         <w:t>FROM</w:t>
       </w:r>
       <w:r>
         <w:tab/>
-        <w:t>Kunde</w:t>
-      </w:r>
-      <w:proofErr w:type="gramEnd"/>
-      <w:r>
-        <w:t>, Bestellung, Lieferant</w:t>
+        <w:t>Kunde, Bestellung, Lieferant</w:t>
       </w:r>
     </w:p>
     <w:p>
@@ -8862,46 +8591,7 @@
       </w:r>
       <w:r>
         <w:tab/>
-      </w:r>
-      <w:proofErr w:type="spellStart"/>
-      <w:r>
-        <w:t>Bestellung.KdNr</w:t>
-      </w:r>
-      <w:proofErr w:type="spellEnd"/>
-      <w:r>
-        <w:t xml:space="preserve"> = </w:t>
-      </w:r>
-      <w:proofErr w:type="spellStart"/>
-      <w:r>
-        <w:t>Kunde.KdNr</w:t>
-      </w:r>
-      <w:proofErr w:type="spellEnd"/>
-      <w:r>
-        <w:t xml:space="preserve"> AND </w:t>
-      </w:r>
-      <w:proofErr w:type="spellStart"/>
-      <w:r>
-        <w:t>Bestellung.LfNr</w:t>
-      </w:r>
-      <w:proofErr w:type="spellEnd"/>
-      <w:r>
-        <w:t xml:space="preserve"> = </w:t>
-      </w:r>
-      <w:proofErr w:type="spellStart"/>
-      <w:r>
-        <w:t>Lieferant.LfNr</w:t>
-      </w:r>
-      <w:proofErr w:type="spellEnd"/>
-      <w:r>
-        <w:t xml:space="preserve"> AND </w:t>
-      </w:r>
-      <w:proofErr w:type="spellStart"/>
-      <w:r>
-        <w:t>Bestellung.Status</w:t>
-      </w:r>
-      <w:proofErr w:type="spellEnd"/>
-      <w:r>
-        <w:t xml:space="preserve"> = ‘OPEN’;</w:t>
+        <w:t>Bestellung.KdNr = Kunde.KdNr AND Bestellung.LfNr = Lieferant.LfNr AND Bestellung.Status = ‘OPEN’;</w:t>
       </w:r>
     </w:p>
     <w:p>
@@ -8965,23 +8655,7 @@
       </w:r>
       <w:r>
         <w:softHyphen/>
-        <w:t xml:space="preserve">stand zwischen ihnen auf </w:t>
-      </w:r>
-      <w:proofErr w:type="spellStart"/>
-      <w:r>
-        <w:t>Null</w:t>
-      </w:r>
-      <w:proofErr w:type="spellEnd"/>
-      <w:r>
-        <w:t xml:space="preserve"> zu setzen. Bildet eine Überschrift den Seitenbeginn, ist auf die gleiche Weise der Abstand vor der Überschrift auf </w:t>
-      </w:r>
-      <w:proofErr w:type="spellStart"/>
-      <w:r>
-        <w:t>Null</w:t>
-      </w:r>
-      <w:proofErr w:type="spellEnd"/>
-      <w:r>
-        <w:t xml:space="preserve"> einzustellen.</w:t>
+        <w:t>stand zwischen ihnen auf Null zu setzen. Bildet eine Überschrift den Seitenbeginn, ist auf die gleiche Weise der Abstand vor der Überschrift auf Null einzustellen.</w:t>
       </w:r>
     </w:p>
     <w:p>
@@ -8989,15 +8663,7 @@
         <w:pStyle w:val="Grundtext"/>
       </w:pPr>
       <w:r>
-        <w:t xml:space="preserve">Überschriften sollten in eine Zeile passen, damit Silbentrennungen vermieden werden können. Sollten Silbentrennungen in Ausnahmefällen erforderlich sein, ist sinngemäß zu trennen, also z. B. nicht </w:t>
-      </w:r>
-      <w:proofErr w:type="spellStart"/>
-      <w:r>
-        <w:t>Umweltin-formatik</w:t>
-      </w:r>
-      <w:proofErr w:type="spellEnd"/>
-      <w:r>
-        <w:t>, sondern Umwelt-informatik.</w:t>
+        <w:t>Überschriften sollten in eine Zeile passen, damit Silbentrennungen vermieden werden können. Sollten Silbentrennungen in Ausnahmefällen erforderlich sein, ist sinngemäß zu trennen, also z. B. nicht Umweltin-formatik, sondern Umwelt-informatik.</w:t>
       </w:r>
     </w:p>
     <w:p>
@@ -9152,31 +8818,7 @@
               <w:pStyle w:val="Anmerkungenklein"/>
             </w:pPr>
             <w:r>
-              <w:t xml:space="preserve">Schriftart Times New Roman, 10 </w:t>
-            </w:r>
-            <w:proofErr w:type="spellStart"/>
-            <w:r>
-              <w:t>pt</w:t>
-            </w:r>
-            <w:proofErr w:type="spellEnd"/>
-            <w:r>
-              <w:t xml:space="preserve">, Deutsch (Deutschland), zentriert, Zeilenabstand einfach, Abstand vor 6 </w:t>
-            </w:r>
-            <w:proofErr w:type="spellStart"/>
-            <w:r>
-              <w:t>pt</w:t>
-            </w:r>
-            <w:proofErr w:type="spellEnd"/>
-            <w:r>
-              <w:t xml:space="preserve">, Abstand nach 12 </w:t>
-            </w:r>
-            <w:proofErr w:type="spellStart"/>
-            <w:r>
-              <w:t>pt</w:t>
-            </w:r>
-            <w:proofErr w:type="spellEnd"/>
-            <w:r>
-              <w:t>, Absatzkontrolle</w:t>
+              <w:t>Schriftart Times New Roman, 10 pt, Deutsch (Deutschland), zentriert, Zeilenabstand einfach, Abstand vor 6 pt, Abstand nach 12 pt, Absatzkontrolle</w:t>
             </w:r>
           </w:p>
         </w:tc>
@@ -9204,27 +8846,11 @@
               <w:pStyle w:val="Anmerkungenklein"/>
             </w:pPr>
             <w:r>
-              <w:t xml:space="preserve">Schriftart Times New Roman, 10 </w:t>
-            </w:r>
-            <w:proofErr w:type="spellStart"/>
-            <w:r>
-              <w:t>pt</w:t>
-            </w:r>
-            <w:proofErr w:type="spellEnd"/>
-            <w:r>
-              <w:t>, Deutsch (Deutschland), Einzug hän</w:t>
+              <w:t>Schriftart Times New Roman, 10 pt, Deutsch (Deutschland), Einzug hän</w:t>
             </w:r>
             <w:r>
               <w:softHyphen/>
-              <w:t xml:space="preserve">gend 0,5 cm, Block, Zeilenabstand einfach, Absatzkontrolle, </w:t>
-            </w:r>
-            <w:proofErr w:type="spellStart"/>
-            <w:r>
-              <w:t>Tabstop</w:t>
-            </w:r>
-            <w:proofErr w:type="spellEnd"/>
-            <w:r>
-              <w:t xml:space="preserve"> 0,5 cm</w:t>
+              <w:t>gend 0,5 cm, Block, Zeilenabstand einfach, Absatzkontrolle, Tabstop 0,5 cm</w:t>
             </w:r>
           </w:p>
         </w:tc>
@@ -9266,11 +8892,9 @@
             <w:pPr>
               <w:pStyle w:val="Anmerkungenklein"/>
             </w:pPr>
-            <w:proofErr w:type="spellStart"/>
             <w:r>
               <w:t>GrafikQuelle</w:t>
             </w:r>
-            <w:proofErr w:type="spellEnd"/>
           </w:p>
         </w:tc>
         <w:tc>
@@ -9282,23 +8906,7 @@
               <w:pStyle w:val="Anmerkungenklein"/>
             </w:pPr>
             <w:r>
-              <w:t xml:space="preserve">Grundtext + Schriftgröße 10 </w:t>
-            </w:r>
-            <w:proofErr w:type="spellStart"/>
-            <w:r>
-              <w:t>pt</w:t>
-            </w:r>
-            <w:proofErr w:type="spellEnd"/>
-            <w:r>
-              <w:t>, zentriert, Zeilenabstand einfach, Abstand vor 6 </w:t>
-            </w:r>
-            <w:proofErr w:type="spellStart"/>
-            <w:r>
-              <w:t>pt</w:t>
-            </w:r>
-            <w:proofErr w:type="spellEnd"/>
-            <w:r>
-              <w:t>, Absätze nicht trennen</w:t>
+              <w:t>Grundtext + Schriftgröße 10 pt, zentriert, Zeilenabstand einfach, Abstand vor 6 pt, Absätze nicht trennen</w:t>
             </w:r>
           </w:p>
         </w:tc>
@@ -9326,31 +8934,7 @@
               <w:pStyle w:val="Anmerkungenklein"/>
             </w:pPr>
             <w:r>
-              <w:t xml:space="preserve">Schriftart Times New Roman, 12 </w:t>
-            </w:r>
-            <w:proofErr w:type="spellStart"/>
-            <w:r>
-              <w:t>pt</w:t>
-            </w:r>
-            <w:proofErr w:type="spellEnd"/>
-            <w:r>
-              <w:t xml:space="preserve">, Deutsch (Deutschland), Block, Zeilenabstand mind. 18 </w:t>
-            </w:r>
-            <w:proofErr w:type="spellStart"/>
-            <w:r>
-              <w:t>pt</w:t>
-            </w:r>
-            <w:proofErr w:type="spellEnd"/>
-            <w:r>
-              <w:t xml:space="preserve">, Abstand nach 12 </w:t>
-            </w:r>
-            <w:proofErr w:type="spellStart"/>
-            <w:r>
-              <w:t>pt</w:t>
-            </w:r>
-            <w:proofErr w:type="spellEnd"/>
-            <w:r>
-              <w:t>, Absatzkontrolle</w:t>
+              <w:t>Schriftart Times New Roman, 12 pt, Deutsch (Deutschland), Block, Zeilenabstand mind. 18 pt, Abstand nach 12 pt, Absatzkontrolle</w:t>
             </w:r>
           </w:p>
         </w:tc>
@@ -9378,15 +8962,7 @@
               <w:pStyle w:val="Anmerkungenklein"/>
             </w:pPr>
             <w:r>
-              <w:t xml:space="preserve">Grundtext + Einzug hängend 0,5 cm, Aufzählungszeichen, </w:t>
-            </w:r>
-            <w:proofErr w:type="spellStart"/>
-            <w:r>
-              <w:t>Tabstop</w:t>
-            </w:r>
-            <w:proofErr w:type="spellEnd"/>
-            <w:r>
-              <w:t xml:space="preserve"> 0,5 cm</w:t>
+              <w:t>Grundtext + Einzug hängend 0,5 cm, Aufzählungszeichen, Tabstop 0,5 cm</w:t>
             </w:r>
           </w:p>
         </w:tc>
@@ -9414,13 +8990,8 @@
               <w:pStyle w:val="Anmerkungenklein"/>
             </w:pPr>
             <w:r>
-              <w:t>Grundtext + Einzug hängend 3 cm, linksbündig, Zeilenabstand einfach, Abstand nach 0 </w:t>
-            </w:r>
-            <w:proofErr w:type="spellStart"/>
-            <w:r>
-              <w:t>pt</w:t>
-            </w:r>
-            <w:proofErr w:type="spellEnd"/>
+              <w:t>Grundtext + Einzug hängend 3 cm, linksbündig, Zeilenabstand einfach, Abstand nach 0 pt</w:t>
+            </w:r>
           </w:p>
         </w:tc>
       </w:tr>
@@ -9447,13 +9018,8 @@
               <w:pStyle w:val="Anmerkungenklein"/>
             </w:pPr>
             <w:r>
-              <w:t xml:space="preserve">Grundtext + Abstand vor 12 </w:t>
-            </w:r>
-            <w:proofErr w:type="spellStart"/>
-            <w:r>
-              <w:t>pt</w:t>
-            </w:r>
-            <w:proofErr w:type="spellEnd"/>
+              <w:t>Grundtext + Abstand vor 12 pt</w:t>
+            </w:r>
           </w:p>
         </w:tc>
       </w:tr>
@@ -9467,15 +9033,7 @@
               <w:pStyle w:val="Anmerkungenklein"/>
             </w:pPr>
             <w:r>
-              <w:t>Grundtext (</w:t>
-            </w:r>
-            <w:proofErr w:type="spellStart"/>
-            <w:r>
-              <w:t>Numerierung</w:t>
-            </w:r>
-            <w:proofErr w:type="spellEnd"/>
-            <w:r>
-              <w:t>)</w:t>
+              <w:t>Grundtext (Numerierung)</w:t>
             </w:r>
           </w:p>
         </w:tc>
@@ -9488,13 +9046,8 @@
               <w:pStyle w:val="Anmerkungenklein"/>
             </w:pPr>
             <w:r>
-              <w:t xml:space="preserve">Grundtext (Aufzählung) + </w:t>
-            </w:r>
-            <w:proofErr w:type="spellStart"/>
-            <w:r>
-              <w:t>Autonumerierung</w:t>
-            </w:r>
-            <w:proofErr w:type="spellEnd"/>
+              <w:t>Grundtext (Aufzählung) + Autonumerierung</w:t>
+            </w:r>
           </w:p>
         </w:tc>
       </w:tr>
@@ -9521,31 +9074,7 @@
               <w:pStyle w:val="Anmerkungenklein"/>
             </w:pPr>
             <w:r>
-              <w:t xml:space="preserve">Grundtext + Schriftart Courier New, 12 </w:t>
-            </w:r>
-            <w:proofErr w:type="spellStart"/>
-            <w:r>
-              <w:t>pt</w:t>
-            </w:r>
-            <w:proofErr w:type="spellEnd"/>
-            <w:r>
-              <w:t>, Einzug hängend 2 cm, Abstand nach 0 </w:t>
-            </w:r>
-            <w:proofErr w:type="spellStart"/>
-            <w:r>
-              <w:t>pt</w:t>
-            </w:r>
-            <w:proofErr w:type="spellEnd"/>
-            <w:r>
-              <w:t xml:space="preserve">, linksbündig, </w:t>
-            </w:r>
-            <w:proofErr w:type="spellStart"/>
-            <w:r>
-              <w:t>Tabstop</w:t>
-            </w:r>
-            <w:proofErr w:type="spellEnd"/>
-            <w:r>
-              <w:t xml:space="preserve"> bei 2 cm</w:t>
+              <w:t>Grundtext + Schriftart Courier New, 12 pt, Einzug hängend 2 cm, Abstand nach 0 pt, linksbündig, Tabstop bei 2 cm</w:t>
             </w:r>
           </w:p>
         </w:tc>
@@ -9573,13 +9102,8 @@
               <w:pStyle w:val="Anmerkungenklein"/>
             </w:pPr>
             <w:r>
-              <w:t xml:space="preserve">Grundtext (SQL) + Abstand nach 12 </w:t>
-            </w:r>
-            <w:proofErr w:type="spellStart"/>
-            <w:r>
-              <w:t>pt</w:t>
-            </w:r>
-            <w:proofErr w:type="spellEnd"/>
+              <w:t>Grundtext (SQL) + Abstand nach 12 pt</w:t>
+            </w:r>
           </w:p>
         </w:tc>
       </w:tr>
@@ -9606,23 +9130,7 @@
               <w:pStyle w:val="Anmerkungenklein"/>
             </w:pPr>
             <w:r>
-              <w:t xml:space="preserve">Schriftart Times New Roman, 12 </w:t>
-            </w:r>
-            <w:proofErr w:type="spellStart"/>
-            <w:r>
-              <w:t>pt</w:t>
-            </w:r>
-            <w:proofErr w:type="spellEnd"/>
-            <w:r>
-              <w:t xml:space="preserve">, Deutsch (Deutschland), Einzug hängend 1,5 cm, linksbündig, Zeilenabstand mind. 16 </w:t>
-            </w:r>
-            <w:proofErr w:type="spellStart"/>
-            <w:r>
-              <w:t>pt</w:t>
-            </w:r>
-            <w:proofErr w:type="spellEnd"/>
-            <w:r>
-              <w:t>, Absatzkontrolle</w:t>
+              <w:t>Schriftart Times New Roman, 12 pt, Deutsch (Deutschland), Einzug hängend 1,5 cm, linksbündig, Zeilenabstand mind. 16 pt, Absatzkontrolle</w:t>
             </w:r>
           </w:p>
         </w:tc>
@@ -9650,23 +9158,7 @@
               <w:pStyle w:val="Anmerkungenklein"/>
             </w:pPr>
             <w:r>
-              <w:t xml:space="preserve">Schriftart Times New Roman, 10 </w:t>
-            </w:r>
-            <w:proofErr w:type="spellStart"/>
-            <w:r>
-              <w:t>pt</w:t>
-            </w:r>
-            <w:proofErr w:type="spellEnd"/>
-            <w:r>
-              <w:t xml:space="preserve">, Deutsch (Deutschland), zentriert, Zeilenabstand einfach, Abstand nach 6 </w:t>
-            </w:r>
-            <w:proofErr w:type="spellStart"/>
-            <w:r>
-              <w:t>pt</w:t>
-            </w:r>
-            <w:proofErr w:type="spellEnd"/>
-            <w:r>
-              <w:t>, Absatzkontrolle</w:t>
+              <w:t>Schriftart Times New Roman, 10 pt, Deutsch (Deutschland), zentriert, Zeilenabstand einfach, Abstand nach 6 pt, Absatzkontrolle</w:t>
             </w:r>
           </w:p>
         </w:tc>
@@ -9694,31 +9186,7 @@
               <w:pStyle w:val="Anmerkungenklein"/>
             </w:pPr>
             <w:r>
-              <w:t xml:space="preserve">Schriftart Times New Roman, 10 </w:t>
-            </w:r>
-            <w:proofErr w:type="spellStart"/>
-            <w:r>
-              <w:t>pt</w:t>
-            </w:r>
-            <w:proofErr w:type="spellEnd"/>
-            <w:r>
-              <w:t xml:space="preserve">, Deutsch (Deutschland), linksbündig, Zeilenabstand einfach, Abstand vor 2 </w:t>
-            </w:r>
-            <w:proofErr w:type="spellStart"/>
-            <w:r>
-              <w:t>pt</w:t>
-            </w:r>
-            <w:proofErr w:type="spellEnd"/>
-            <w:r>
-              <w:t xml:space="preserve">, Abstand nach 2 </w:t>
-            </w:r>
-            <w:proofErr w:type="spellStart"/>
-            <w:r>
-              <w:t>pt</w:t>
-            </w:r>
-            <w:proofErr w:type="spellEnd"/>
-            <w:r>
-              <w:t>, Absatzkontrolle</w:t>
+              <w:t>Schriftart Times New Roman, 10 pt, Deutsch (Deutschland), linksbündig, Zeilenabstand einfach, Abstand vor 2 pt, Abstand nach 2 pt, Absatzkontrolle</w:t>
             </w:r>
           </w:p>
         </w:tc>
@@ -9746,53 +9214,13 @@
               <w:pStyle w:val="Anmerkungenklein"/>
             </w:pPr>
             <w:r>
-              <w:t xml:space="preserve">Schriftart Times New Roman, 14 </w:t>
-            </w:r>
-            <w:proofErr w:type="spellStart"/>
-            <w:r>
-              <w:t>pt</w:t>
-            </w:r>
-            <w:proofErr w:type="spellEnd"/>
-            <w:r>
-              <w:t xml:space="preserve">, Deutsch (Deutschland), Einzug hängend 1,5 cm, linksbündig, Unterschneidung ab 14 </w:t>
-            </w:r>
-            <w:proofErr w:type="spellStart"/>
-            <w:r>
-              <w:t>pt</w:t>
-            </w:r>
-            <w:proofErr w:type="spellEnd"/>
-            <w:r>
-              <w:t>, fett, Zeilenabstand genau 18 </w:t>
-            </w:r>
-            <w:proofErr w:type="spellStart"/>
-            <w:r>
-              <w:t>pt</w:t>
-            </w:r>
-            <w:proofErr w:type="spellEnd"/>
-            <w:r>
-              <w:t>, Abstand nach 8 </w:t>
-            </w:r>
-            <w:proofErr w:type="spellStart"/>
-            <w:r>
-              <w:t>pt</w:t>
-            </w:r>
-            <w:proofErr w:type="spellEnd"/>
-            <w:r>
-              <w:t>, Absatzkontrolle, Seitenwechsel oberhalb, Absätze nicht trennen, keine Silbentrennung, Autonu</w:t>
+              <w:t>Schriftart Times New Roman, 14 pt, Deutsch (Deutschland), Einzug hängend 1,5 cm, linksbündig, Unterschneidung ab 14 pt, fett, Zeilenabstand genau 18 pt, Abstand nach 8 pt, Absatzkontrolle, Seitenwechsel oberhalb, Absätze nicht trennen, keine Silbentrennung, Autonu</w:t>
             </w:r>
             <w:r>
               <w:t>m</w:t>
             </w:r>
             <w:r>
-              <w:t>merierung Gliederung Ebene 1 (</w:t>
-            </w:r>
-            <w:proofErr w:type="spellStart"/>
-            <w:r>
-              <w:t>Tabstop</w:t>
-            </w:r>
-            <w:proofErr w:type="spellEnd"/>
-            <w:r>
-              <w:t xml:space="preserve"> 1,5 cm)</w:t>
+              <w:t>merierung Gliederung Ebene 1 (Tabstop 1,5 cm)</w:t>
             </w:r>
           </w:p>
         </w:tc>
@@ -9820,23 +9248,7 @@
               <w:pStyle w:val="Anmerkungenklein"/>
             </w:pPr>
             <w:r>
-              <w:t xml:space="preserve">Überschrift 1 + Schriftart 12 </w:t>
-            </w:r>
-            <w:proofErr w:type="spellStart"/>
-            <w:r>
-              <w:t>pt</w:t>
-            </w:r>
-            <w:proofErr w:type="spellEnd"/>
-            <w:r>
-              <w:t xml:space="preserve">, Abstand vor 30 </w:t>
-            </w:r>
-            <w:proofErr w:type="spellStart"/>
-            <w:r>
-              <w:t>pt</w:t>
-            </w:r>
-            <w:proofErr w:type="spellEnd"/>
-            <w:r>
-              <w:t>, nicht Seitenwechsel oberhalb, Autonum</w:t>
+              <w:t>Überschrift 1 + Schriftart 12 pt, Abstand vor 30 pt, nicht Seitenwechsel oberhalb, Autonum</w:t>
             </w:r>
             <w:r>
               <w:t>m</w:t>
@@ -9972,15 +9384,7 @@
               <w:pStyle w:val="Anmerkungenklein"/>
             </w:pPr>
             <w:r>
-              <w:t>Überschrift 1 + Abstand nach 18 </w:t>
-            </w:r>
-            <w:proofErr w:type="spellStart"/>
-            <w:r>
-              <w:t>pt</w:t>
-            </w:r>
-            <w:proofErr w:type="spellEnd"/>
-            <w:r>
-              <w:t>, keine Nu</w:t>
+              <w:t>Überschrift 1 + Abstand nach 18 pt, keine Nu</w:t>
             </w:r>
             <w:r>
               <w:t>m</w:t>
@@ -10014,31 +9418,7 @@
               <w:pStyle w:val="Anmerkungenklein"/>
             </w:pPr>
             <w:r>
-              <w:t xml:space="preserve">Schriftart Times New Roman, 12 </w:t>
-            </w:r>
-            <w:proofErr w:type="spellStart"/>
-            <w:r>
-              <w:t>pt</w:t>
-            </w:r>
-            <w:proofErr w:type="spellEnd"/>
-            <w:r>
-              <w:t xml:space="preserve">, Deutsch (Deutschland), linksbündig, Einzug hängend 0,5 cm, Zeilenabstand einfach, Abstand vor 6 </w:t>
-            </w:r>
-            <w:proofErr w:type="spellStart"/>
-            <w:r>
-              <w:t>pt</w:t>
-            </w:r>
-            <w:proofErr w:type="spellEnd"/>
-            <w:r>
-              <w:t xml:space="preserve">, Absatzkontrolle, Absätze nicht trennen, </w:t>
-            </w:r>
-            <w:proofErr w:type="spellStart"/>
-            <w:r>
-              <w:t>Tabstop</w:t>
-            </w:r>
-            <w:proofErr w:type="spellEnd"/>
-            <w:r>
-              <w:t xml:space="preserve"> 15 cm rechtsbündig</w:t>
+              <w:t>Schriftart Times New Roman, 12 pt, Deutsch (Deutschland), linksbündig, Einzug hängend 0,5 cm, Zeilenabstand einfach, Abstand vor 6 pt, Absatzkontrolle, Absätze nicht trennen, Tabstop 15 cm rechtsbündig</w:t>
             </w:r>
           </w:p>
         </w:tc>
@@ -10066,31 +9446,7 @@
               <w:pStyle w:val="Anmerkungenklein"/>
             </w:pPr>
             <w:r>
-              <w:t>Verzeichnis 1 + Einzug links 0,5 cm, Einzug hängend 1 cm, Abstand vor 3 </w:t>
-            </w:r>
-            <w:proofErr w:type="spellStart"/>
-            <w:r>
-              <w:t>pt</w:t>
-            </w:r>
-            <w:proofErr w:type="spellEnd"/>
-            <w:r>
-              <w:t xml:space="preserve">, </w:t>
-            </w:r>
-            <w:proofErr w:type="spellStart"/>
-            <w:r>
-              <w:t>Tabstop</w:t>
-            </w:r>
-            <w:proofErr w:type="spellEnd"/>
-            <w:r>
-              <w:t xml:space="preserve"> 1,69 cm, </w:t>
-            </w:r>
-            <w:proofErr w:type="spellStart"/>
-            <w:r>
-              <w:t>Tabstop</w:t>
-            </w:r>
-            <w:proofErr w:type="spellEnd"/>
-            <w:r>
-              <w:t xml:space="preserve"> 15 cm rechtsbündig</w:t>
+              <w:t>Verzeichnis 1 + Einzug links 0,5 cm, Einzug hängend 1 cm, Abstand vor 3 pt, Tabstop 1,69 cm, Tabstop 15 cm rechtsbündig</w:t>
             </w:r>
           </w:p>
         </w:tc>
@@ -10121,31 +9477,7 @@
               <w:pStyle w:val="Anmerkungenklein"/>
             </w:pPr>
             <w:r>
-              <w:t>Verzeichnis 1 + Einzug links 1,5 cm, Einzug hängend 1,3 cm, Abstand vor 3 </w:t>
-            </w:r>
-            <w:proofErr w:type="spellStart"/>
-            <w:r>
-              <w:t>pt</w:t>
-            </w:r>
-            <w:proofErr w:type="spellEnd"/>
-            <w:r>
-              <w:t xml:space="preserve">, </w:t>
-            </w:r>
-            <w:proofErr w:type="spellStart"/>
-            <w:r>
-              <w:t>Tabstop</w:t>
-            </w:r>
-            <w:proofErr w:type="spellEnd"/>
-            <w:r>
-              <w:t xml:space="preserve"> 1,3 cm rechtsbündig, </w:t>
-            </w:r>
-            <w:proofErr w:type="spellStart"/>
-            <w:r>
-              <w:t>Tabstop</w:t>
-            </w:r>
-            <w:proofErr w:type="spellEnd"/>
-            <w:r>
-              <w:t xml:space="preserve"> 15 cm rechtsbündig</w:t>
+              <w:t>Verzeichnis 1 + Einzug links 1,5 cm, Einzug hängend 1,3 cm, Abstand vor 3 pt, Tabstop 1,3 cm rechtsbündig, Tabstop 15 cm rechtsbündig</w:t>
             </w:r>
           </w:p>
         </w:tc>
@@ -10173,31 +9505,7 @@
               <w:pStyle w:val="Anmerkungenklein"/>
             </w:pPr>
             <w:r>
-              <w:t>Verzeichnis 1 + Einzug links 2,8 cm, Einzug hängend 1,5 cm, Abstand vor 3 </w:t>
-            </w:r>
-            <w:proofErr w:type="spellStart"/>
-            <w:r>
-              <w:t>pt</w:t>
-            </w:r>
-            <w:proofErr w:type="spellEnd"/>
-            <w:r>
-              <w:t xml:space="preserve">, </w:t>
-            </w:r>
-            <w:proofErr w:type="spellStart"/>
-            <w:r>
-              <w:t>Tabstop</w:t>
-            </w:r>
-            <w:proofErr w:type="spellEnd"/>
-            <w:r>
-              <w:t xml:space="preserve"> 1,5 cm rechtsbündig, </w:t>
-            </w:r>
-            <w:proofErr w:type="spellStart"/>
-            <w:r>
-              <w:t>Tabstop</w:t>
-            </w:r>
-            <w:proofErr w:type="spellEnd"/>
-            <w:r>
-              <w:t xml:space="preserve"> 15 cm rechtsbündig</w:t>
+              <w:t>Verzeichnis 1 + Einzug links 2,8 cm, Einzug hängend 1,5 cm, Abstand vor 3 pt, Tabstop 1,5 cm rechtsbündig, Tabstop 15 cm rechtsbündig</w:t>
             </w:r>
           </w:p>
         </w:tc>
@@ -10225,15 +9533,7 @@
               <w:pStyle w:val="Anmerkungenklein"/>
             </w:pPr>
             <w:r>
-              <w:t xml:space="preserve">Verzeichnis 1 + </w:t>
-            </w:r>
-            <w:proofErr w:type="spellStart"/>
-            <w:r>
-              <w:t>Tabstop</w:t>
-            </w:r>
-            <w:proofErr w:type="spellEnd"/>
-            <w:r>
-              <w:t xml:space="preserve"> 0,5 cm </w:t>
+              <w:t xml:space="preserve">Verzeichnis 1 + Tabstop 0,5 cm </w:t>
             </w:r>
           </w:p>
         </w:tc>
@@ -10261,31 +9561,7 @@
               <w:pStyle w:val="Anmerkungenklein"/>
             </w:pPr>
             <w:r>
-              <w:t xml:space="preserve">Schriftart Times New Roman, 12 </w:t>
-            </w:r>
-            <w:proofErr w:type="spellStart"/>
-            <w:r>
-              <w:t>pt</w:t>
-            </w:r>
-            <w:proofErr w:type="spellEnd"/>
-            <w:r>
-              <w:t xml:space="preserve">, kursiv, Deutsch (Deutschland), linksbündig, Zeilenabstand 1,5 Zeilen, Abstand vor 30 </w:t>
-            </w:r>
-            <w:proofErr w:type="spellStart"/>
-            <w:r>
-              <w:t>pt</w:t>
-            </w:r>
-            <w:proofErr w:type="spellEnd"/>
-            <w:r>
-              <w:t>, Abstand nach 3 </w:t>
-            </w:r>
-            <w:proofErr w:type="spellStart"/>
-            <w:r>
-              <w:t>pt</w:t>
-            </w:r>
-            <w:proofErr w:type="spellEnd"/>
-            <w:r>
-              <w:t>, Absatzkontrolle</w:t>
+              <w:t>Schriftart Times New Roman, 12 pt, kursiv, Deutsch (Deutschland), linksbündig, Zeilenabstand 1,5 Zeilen, Abstand vor 30 pt, Abstand nach 3 pt, Absatzkontrolle</w:t>
             </w:r>
           </w:p>
         </w:tc>
@@ -10337,23 +9613,7 @@
         <w:pStyle w:val="GrundtextAufzhlung"/>
       </w:pPr>
       <w:r>
-        <w:t xml:space="preserve">Die Schriftgröße ist 2 </w:t>
-      </w:r>
-      <w:proofErr w:type="spellStart"/>
-      <w:r>
-        <w:t>pt</w:t>
-      </w:r>
-      <w:proofErr w:type="spellEnd"/>
-      <w:r>
-        <w:t xml:space="preserve"> kleiner zu wählen als der Grundtext, hier also 10 </w:t>
-      </w:r>
-      <w:proofErr w:type="spellStart"/>
-      <w:r>
-        <w:t>pt</w:t>
-      </w:r>
-      <w:proofErr w:type="spellEnd"/>
-      <w:r>
-        <w:t>.</w:t>
+        <w:t>Die Schriftgröße ist 2 pt kleiner zu wählen als der Grundtext, hier also 10 pt.</w:t>
       </w:r>
     </w:p>
     <w:p>
@@ -10387,23 +9647,7 @@
       </w:r>
       <w:r>
         <w:softHyphen/>
-        <w:t>ansicht zu prüfen ist. Wird z. B. die Schriftart Times New Roman, 10 </w:t>
-      </w:r>
-      <w:proofErr w:type="spellStart"/>
-      <w:r>
-        <w:t>pt</w:t>
-      </w:r>
-      <w:proofErr w:type="spellEnd"/>
-      <w:r>
-        <w:t>, nicht fett eingesetzt, entspricht dies einer Linienstärke von 0,5 </w:t>
-      </w:r>
-      <w:proofErr w:type="spellStart"/>
-      <w:r>
-        <w:t>pt</w:t>
-      </w:r>
-      <w:proofErr w:type="spellEnd"/>
-      <w:r>
-        <w:t>.</w:t>
+        <w:t>ansicht zu prüfen ist. Wird z. B. die Schriftart Times New Roman, 10 pt, nicht fett eingesetzt, entspricht dies einer Linienstärke von 0,5 pt.</w:t>
       </w:r>
     </w:p>
     <w:p>
@@ -10553,15 +9797,7 @@
       </w:r>
       <w:r>
         <w:lastRenderedPageBreak/>
-        <w:t>Nummern von Abbildungen und Tabellen über die Formatvorlage ‚</w:t>
-      </w:r>
-      <w:proofErr w:type="spellStart"/>
-      <w:r>
-        <w:t>Grundz</w:t>
-      </w:r>
-      <w:proofErr w:type="spellEnd"/>
-      <w:r>
-        <w:t>. (fett)‘ fett zu setzen.</w:t>
+        <w:t>Nummern von Abbildungen und Tabellen über die Formatvorlage ‚Grundz. (fett)‘ fett zu setzen.</w:t>
       </w:r>
       <w:r>
         <w:rPr>
@@ -10620,7 +9856,7 @@
                     </pic:cNvPicPr>
                   </pic:nvPicPr>
                   <pic:blipFill>
-                    <a:blip r:embed="rId13" cstate="print"/>
+                    <a:blip r:embed="rId15" cstate="print"/>
                     <a:srcRect/>
                     <a:stretch>
                       <a:fillRect/>
@@ -10764,15 +10000,7 @@
       </w:r>
       <w:r>
         <w:softHyphen/>
-        <w:t>ren Darstellungen orientieren, ist die Quelle anzugeben (FV ‚</w:t>
-      </w:r>
-      <w:proofErr w:type="spellStart"/>
-      <w:r>
-        <w:t>GrafikQuelle</w:t>
-      </w:r>
-      <w:proofErr w:type="spellEnd"/>
-      <w:r>
-        <w:t>‘). Die Quel</w:t>
+        <w:t>ren Darstellungen orientieren, ist die Quelle anzugeben (FV ‚GrafikQuelle‘). Die Quel</w:t>
       </w:r>
       <w:r>
         <w:softHyphen/>
@@ -11850,7 +11078,6 @@
         <w:softHyphen/>
         <w:t xml:space="preserve">merierung werden Großbuchstaben (u. U. </w:t>
       </w:r>
-      <w:proofErr w:type="spellStart"/>
       <w:r>
         <w:rPr>
           <w:i/>
@@ -11878,7 +11105,6 @@
         </w:rPr>
         <w:t>Ziffer</w:t>
       </w:r>
-      <w:proofErr w:type="spellEnd"/>
       <w:r>
         <w:t>) verwendet.</w:t>
       </w:r>
@@ -11909,7 +11135,7 @@
                     </pic:cNvPicPr>
                   </pic:nvPicPr>
                   <pic:blipFill>
-                    <a:blip r:embed="rId14" cstate="print"/>
+                    <a:blip r:embed="rId16" cstate="print"/>
                     <a:srcRect/>
                     <a:stretch>
                       <a:fillRect/>
@@ -12048,36 +11274,20 @@
           <w:rStyle w:val="Grundzfett"/>
           <w:b w:val="0"/>
         </w:rPr>
-        <w:t xml:space="preserve">Tabellen und Abbildungen des Anhangs </w:t>
-      </w:r>
-      <w:proofErr w:type="gramStart"/>
+        <w:t>Tabellen und Abbildungen des Anhangs werden wie im Haupttext nu</w:t>
+      </w:r>
       <w:r>
         <w:rPr>
           <w:rStyle w:val="Grundzfett"/>
           <w:b w:val="0"/>
         </w:rPr>
-        <w:t>werden</w:t>
-      </w:r>
-      <w:proofErr w:type="gramEnd"/>
+        <w:t>m</w:t>
+      </w:r>
       <w:r>
         <w:rPr>
           <w:rStyle w:val="Grundzfett"/>
           <w:b w:val="0"/>
         </w:rPr>
-        <w:t xml:space="preserve"> wie im Haupttext nu</w:t>
-      </w:r>
-      <w:r>
-        <w:rPr>
-          <w:rStyle w:val="Grundzfett"/>
-          <w:b w:val="0"/>
-        </w:rPr>
-        <w:t>m</w:t>
-      </w:r>
-      <w:r>
-        <w:rPr>
-          <w:rStyle w:val="Grundzfett"/>
-          <w:b w:val="0"/>
-        </w:rPr>
         <w:t xml:space="preserve">meriert, jedoch ist unter </w:t>
       </w:r>
       <w:r>
@@ -12095,15 +11305,7 @@
       </w:r>
       <w:r>
         <w:softHyphen/>
-        <w:t xml:space="preserve">staben in der </w:t>
-      </w:r>
-      <w:proofErr w:type="spellStart"/>
-      <w:r>
-        <w:t>Numerierung</w:t>
-      </w:r>
-      <w:proofErr w:type="spellEnd"/>
-      <w:r>
-        <w:t xml:space="preserve"> verwendet (unter [</w:t>
+        <w:t>staben in der Numerierung verwendet (unter [</w:t>
       </w:r>
       <w:r>
         <w:sym w:font="Symbol" w:char="F0AE"/>
@@ -12168,15 +11370,7 @@
       </w:r>
       <w:r>
         <w:softHyphen/>
-        <w:t xml:space="preserve">deckt. Konjunktionen wie </w:t>
-      </w:r>
-      <w:proofErr w:type="gramStart"/>
-      <w:r>
-        <w:t>‚</w:t>
-      </w:r>
-      <w:proofErr w:type="gramEnd"/>
-      <w:r>
-        <w:t>weil‘, ‚deshal</w:t>
+        <w:t>deckt. Konjunktionen wie ‚weil‘, ‚deshal</w:t>
       </w:r>
       <w:r>
         <w:t>b‘, ‚dadurch‘ verdeutlichen, dass</w:t>
@@ -12247,14 +11441,7 @@
       </w:r>
       <w:r>
         <w:br/>
-      </w:r>
-      <w:proofErr w:type="gramStart"/>
-      <w:r>
-        <w:t>Mindestens</w:t>
-      </w:r>
-      <w:proofErr w:type="gramEnd"/>
-      <w:r>
-        <w:t xml:space="preserve"> zwei Gegenstände oder Vorgänge werden gegenübergestellt, um Ge</w:t>
+        <w:t>Mindestens zwei Gegenstände oder Vorgänge werden gegenübergestellt, um Ge</w:t>
       </w:r>
       <w:r>
         <w:softHyphen/>
@@ -12364,15 +11551,7 @@
         <w:pStyle w:val="Grundtext"/>
       </w:pPr>
       <w:r>
-        <w:t xml:space="preserve">Das Literaturverzeichnis ist alphabetisch nach den Autorennamen sortiert. Hat ein Autor mehrere </w:t>
-      </w:r>
-      <w:proofErr w:type="gramStart"/>
-      <w:r>
-        <w:t>Monographien</w:t>
-      </w:r>
-      <w:proofErr w:type="gramEnd"/>
-      <w:r>
-        <w:t>, Zeitschriften oder Sammelbeiträge in einem Jahr publiziert, so werden die Quellen mit dem Jahr und einem Buchstaben ge</w:t>
+        <w:t>Das Literaturverzeichnis ist alphabetisch nach den Autorennamen sortiert. Hat ein Autor mehrere Monographien, Zeitschriften oder Sammelbeiträge in einem Jahr publiziert, so werden die Quellen mit dem Jahr und einem Buchstaben ge</w:t>
       </w:r>
       <w:r>
         <w:softHyphen/>
@@ -12420,28 +11599,15 @@
       <w:bookmarkStart w:id="169" w:name="Zwischenueberschrift"/>
       <w:bookmarkEnd w:id="169"/>
       <w:r>
-        <w:t xml:space="preserve">Zitieren einer </w:t>
-      </w:r>
-      <w:proofErr w:type="gramStart"/>
-      <w:r>
-        <w:t>Monographie</w:t>
-      </w:r>
-      <w:proofErr w:type="gramEnd"/>
+        <w:t>Zitieren einer Monographie</w:t>
+      </w:r>
     </w:p>
     <w:p>
       <w:pPr>
         <w:pStyle w:val="Grundtext"/>
       </w:pPr>
       <w:r>
-        <w:t xml:space="preserve">Der Titel einer </w:t>
-      </w:r>
-      <w:proofErr w:type="gramStart"/>
-      <w:r>
-        <w:t>Monographie</w:t>
-      </w:r>
-      <w:proofErr w:type="gramEnd"/>
-      <w:r>
-        <w:t xml:space="preserve"> ist jeweils vollständig, mit Untertitel, aufzuführen.</w:t>
+        <w:t>Der Titel einer Monographie ist jeweils vollständig, mit Untertitel, aufzuführen.</w:t>
       </w:r>
     </w:p>
     <w:p>
@@ -12593,34 +11759,19 @@
         <w:rPr>
           <w:highlight w:val="yellow"/>
         </w:rPr>
-        <w:t>{Verlag</w:t>
-      </w:r>
-      <w:proofErr w:type="gramStart"/>
-      <w:r>
-        <w:rPr>
-          <w:highlight w:val="yellow"/>
-        </w:rPr>
-        <w:t>,}</w:t>
+        <w:t>{Verlag,}</w:t>
       </w:r>
       <w:r>
         <w:rPr>
           <w:rStyle w:val="Grundzkursiv"/>
           <w:highlight w:val="yellow"/>
         </w:rPr>
-        <w:t>Erscheinungsort</w:t>
-      </w:r>
-      <w:proofErr w:type="gramEnd"/>
-      <w:r>
-        <w:rPr>
-          <w:rStyle w:val="Grundzkursiv"/>
+        <w:t>Erscheinungsort(e)</w:t>
+      </w:r>
+      <w:r>
+        <w:rPr>
           <w:highlight w:val="yellow"/>
         </w:rPr>
-        <w:t>(e)</w:t>
-      </w:r>
-      <w:r>
-        <w:rPr>
-          <w:highlight w:val="yellow"/>
-        </w:rPr>
         <w:t>.</w:t>
       </w:r>
     </w:p>
@@ -12643,15 +11794,7 @@
         <w:pStyle w:val="Literatureintrag"/>
       </w:pPr>
       <w:r>
-        <w:t xml:space="preserve">Becker, J.; Rosemann, M. (1993): Logistik und CIM: Die effiziente Material- und </w:t>
-      </w:r>
-      <w:proofErr w:type="spellStart"/>
-      <w:r>
-        <w:t>Informationsflußgestaltung</w:t>
-      </w:r>
-      <w:proofErr w:type="spellEnd"/>
-      <w:r>
-        <w:t xml:space="preserve"> im Industrieunternehmen.</w:t>
+        <w:t>Becker, J.; Rosemann, M. (1993): Logistik und CIM: Die effiziente Material- und Informationsflußgestaltung im Industrieunternehmen.</w:t>
       </w:r>
       <w:r>
         <w:t> – </w:t>
@@ -12679,15 +11822,7 @@
         <w:pStyle w:val="Literatureintrag"/>
       </w:pPr>
       <w:r>
-        <w:t>Beutelspacher, A. (1999): Das ist o. B. d. A. trivial! – </w:t>
-      </w:r>
-      <w:proofErr w:type="spellStart"/>
-      <w:r>
-        <w:t>Tips</w:t>
-      </w:r>
-      <w:proofErr w:type="spellEnd"/>
-      <w:r>
-        <w:t xml:space="preserve"> und Tricks zur Formulierung mathematischer Gedanken.</w:t>
+        <w:t>Beutelspacher, A. (1999): Das ist o. B. d. A. trivial! – Tips und Tricks zur Formulierung mathematischer Gedanken.</w:t>
       </w:r>
       <w:r>
         <w:t> </w:t>
@@ -12703,13 +11838,8 @@
       <w:pPr>
         <w:pStyle w:val="Literatureintrag"/>
       </w:pPr>
-      <w:proofErr w:type="spellStart"/>
-      <w:r>
-        <w:t>Disterer</w:t>
-      </w:r>
-      <w:proofErr w:type="spellEnd"/>
-      <w:r>
-        <w:t>, G. (1998): Studienarbeiten schreiben: Diplom-, Seminar- und Hausarbeiten in</w:t>
+      <w:r>
+        <w:t>Disterer, G. (1998): Studienarbeiten schreiben: Diplom-, Seminar- und Hausarbeiten in</w:t>
       </w:r>
       <w:r>
         <w:t xml:space="preserve"> den Wirtschaftswissenschaften.</w:t>
@@ -12770,7 +11900,7 @@
         </w:rPr>
         <w:t xml:space="preserve">(aktuelle Fassung liegt i.d.R. auf </w:t>
       </w:r>
-      <w:hyperlink r:id="rId15" w:history="1">
+      <w:hyperlink r:id="rId17" w:history="1">
         <w:r>
           <w:rPr>
             <w:rStyle w:val="Hyperlink"/>
@@ -12816,13 +11946,8 @@
       <w:r>
         <w:t> – </w:t>
       </w:r>
-      <w:proofErr w:type="spellStart"/>
-      <w:r>
-        <w:t>Vieweg+Teubner</w:t>
-      </w:r>
-      <w:proofErr w:type="spellEnd"/>
-      <w:r>
-        <w:t>, Auflage 6, Wiesbaden.</w:t>
+      <w:r>
+        <w:t>Vieweg+Teubner, Auflage 6, Wiesbaden.</w:t>
       </w:r>
     </w:p>
     <w:p>
@@ -12848,21 +11973,7 @@
         <w:rPr>
           <w:lang w:val="en-US"/>
         </w:rPr>
-        <w:t xml:space="preserve">7. </w:t>
-      </w:r>
-      <w:proofErr w:type="spellStart"/>
-      <w:r>
-        <w:rPr>
-          <w:lang w:val="en-US"/>
-        </w:rPr>
-        <w:t>Aufl</w:t>
-      </w:r>
-      <w:proofErr w:type="spellEnd"/>
-      <w:r>
-        <w:rPr>
-          <w:lang w:val="en-US"/>
-        </w:rPr>
-        <w:t>., München – Wien.</w:t>
+        <w:t>7. Aufl., München – Wien.</w:t>
       </w:r>
     </w:p>
     <w:p>
@@ -13113,15 +12224,7 @@
         <w:pStyle w:val="Literatureintrag"/>
       </w:pPr>
       <w:r>
-        <w:t>Becker, J.; Rosemann, M.; Schütte, R. (1995): Grundsätze ordnungsmäßiger Modellierung (</w:t>
-      </w:r>
-      <w:proofErr w:type="spellStart"/>
-      <w:r>
-        <w:t>GoM</w:t>
-      </w:r>
-      <w:proofErr w:type="spellEnd"/>
-      <w:r>
-        <w:t xml:space="preserve">). </w:t>
+        <w:t xml:space="preserve">Becker, J.; Rosemann, M.; Schütte, R. (1995): Grundsätze ordnungsmäßiger Modellierung (GoM). </w:t>
       </w:r>
       <w:r>
         <w:t xml:space="preserve"> – In: </w:t>
@@ -13402,27 +12505,11 @@
         <w:pStyle w:val="Literatureintrag"/>
       </w:pPr>
       <w:r>
-        <w:t xml:space="preserve">Rosemann, M. (1995): Erstellung und Integration von </w:t>
-      </w:r>
-      <w:proofErr w:type="spellStart"/>
-      <w:r>
-        <w:t>Prozeßmodellen</w:t>
-      </w:r>
-      <w:proofErr w:type="spellEnd"/>
-      <w:r>
-        <w:t> </w:t>
-      </w:r>
-      <w:proofErr w:type="gramStart"/>
-      <w:r>
-        <w:t>–  Methoden</w:t>
-      </w:r>
-      <w:r>
-        <w:softHyphen/>
-        <w:t>spezifische</w:t>
-      </w:r>
-      <w:proofErr w:type="gramEnd"/>
-      <w:r>
-        <w:t xml:space="preserve"> Gestaltungsempfehlungen für die Informationsmodellierung. Dissertation, Westfälische-Wilhelms-Universität</w:t>
+        <w:t>Rosemann, M. (1995): Erstellung und Integration von Prozeßmodellen –  Methoden</w:t>
+      </w:r>
+      <w:r>
+        <w:softHyphen/>
+        <w:t>spezifische Gestaltungsempfehlungen für die Informationsmodellierung. Dissertation, Westfälische-Wilhelms-Universität</w:t>
       </w:r>
       <w:r>
         <w:t>,</w:t>
@@ -13662,21 +12749,7 @@
         <w:rPr>
           <w:lang w:val="en-US"/>
         </w:rPr>
-        <w:t xml:space="preserve">Kargermann, H. (1996): Accounting as </w:t>
-      </w:r>
-      <w:proofErr w:type="gramStart"/>
-      <w:r>
-        <w:rPr>
-          <w:lang w:val="en-US"/>
-        </w:rPr>
-        <w:t>an</w:t>
-      </w:r>
-      <w:proofErr w:type="gramEnd"/>
-      <w:r>
-        <w:rPr>
-          <w:lang w:val="en-US"/>
-        </w:rPr>
-        <w:t xml:space="preserve"> Management Tool.</w:t>
+        <w:t>Kargermann, H. (1996): Accounting as an Management Tool.</w:t>
       </w:r>
       <w:r>
         <w:rPr>
@@ -14010,8 +13083,6 @@
         </w:rPr>
         <w:t xml:space="preserve"> vom </w:t>
       </w:r>
-      <w:proofErr w:type="spellStart"/>
-      <w:proofErr w:type="gramStart"/>
       <w:r>
         <w:rPr>
           <w:rStyle w:val="Grundzkursiv"/>
@@ -14045,8 +13116,6 @@
         </w:rPr>
         <w:t>Jahr</w:t>
       </w:r>
-      <w:proofErr w:type="spellEnd"/>
-      <w:proofErr w:type="gramEnd"/>
       <w:r>
         <w:rPr>
           <w:highlight w:val="yellow"/>
@@ -14083,6 +13152,9 @@
     <w:p>
       <w:pPr>
         <w:pStyle w:val="Literatureintrag"/>
+        <w:rPr>
+          <w:lang w:val="en-US"/>
+        </w:rPr>
       </w:pPr>
       <w:r>
         <w:t>Gewirtz, C. (1972): Eurobonds</w:t>
@@ -14091,24 +13163,26 @@
         <w:t>. – </w:t>
       </w:r>
       <w:r>
-        <w:t xml:space="preserve">In: Herald </w:t>
-      </w:r>
-      <w:proofErr w:type="spellStart"/>
-      <w:r>
-        <w:t>Tribune</w:t>
-      </w:r>
-      <w:proofErr w:type="spellEnd"/>
-      <w:r>
-        <w:t>. Nr. 27-880 vom 4. September 1972, S. 9.</w:t>
+        <w:t>In: Herald Tribune. Nr. 27-880 vom 4. </w:t>
+      </w:r>
+      <w:r>
+        <w:rPr>
+          <w:lang w:val="en-US"/>
+        </w:rPr>
+        <w:t>September 1972, S. 9.</w:t>
       </w:r>
     </w:p>
     <w:p>
       <w:pPr>
         <w:rPr>
           <w:szCs w:val="20"/>
-        </w:rPr>
-      </w:pPr>
-      <w:r>
+          <w:lang w:val="en-US"/>
+        </w:rPr>
+      </w:pPr>
+      <w:r>
+        <w:rPr>
+          <w:lang w:val="en-US"/>
+        </w:rPr>
         <w:br w:type="page"/>
       </w:r>
     </w:p>
@@ -14125,34 +13199,12 @@
         </w:rPr>
       </w:pPr>
       <w:bookmarkStart w:id="170" w:name="_Toc226907275"/>
-      <w:proofErr w:type="spellStart"/>
       <w:r>
         <w:rPr>
           <w:lang w:val="en-US"/>
         </w:rPr>
         <w:lastRenderedPageBreak/>
-        <w:t>Literaturverzeichnis</w:t>
-      </w:r>
-      <w:proofErr w:type="spellEnd"/>
-      <w:r>
-        <w:rPr>
-          <w:lang w:val="en-US"/>
-        </w:rPr>
-        <w:t xml:space="preserve"> (</w:t>
-      </w:r>
-      <w:proofErr w:type="spellStart"/>
-      <w:r>
-        <w:rPr>
-          <w:lang w:val="en-US"/>
-        </w:rPr>
-        <w:t>Quellen</w:t>
-      </w:r>
-      <w:proofErr w:type="spellEnd"/>
-      <w:r>
-        <w:rPr>
-          <w:lang w:val="en-US"/>
-        </w:rPr>
-        <w:t>)</w:t>
+        <w:t>Literaturverzeichnis (Quellen)</w:t>
       </w:r>
       <w:bookmarkEnd w:id="170"/>
     </w:p>
@@ -14217,16 +13269,8 @@
         <w:rPr>
           <w:lang w:val="en-US"/>
         </w:rPr>
-        <w:t xml:space="preserve">, </w:t>
-      </w:r>
-      <w:proofErr w:type="spellStart"/>
-      <w:r>
-        <w:rPr>
-          <w:lang w:val="en-US"/>
-        </w:rPr>
-        <w:t>Gaol</w:t>
-      </w:r>
-      <w:proofErr w:type="spellEnd"/>
+        <w:t>, Gaol</w:t>
+      </w:r>
       <w:r>
         <w:rPr>
           <w:lang w:val="en-US"/>
@@ -14282,23 +13326,9 @@
         <w:rPr>
           <w:lang w:val="en-US"/>
         </w:rPr>
-        <w:t xml:space="preserve">– Online </w:t>
-      </w:r>
-      <w:proofErr w:type="spellStart"/>
-      <w:r>
-        <w:rPr>
-          <w:lang w:val="en-US"/>
-        </w:rPr>
-        <w:t>im</w:t>
-      </w:r>
-      <w:proofErr w:type="spellEnd"/>
-      <w:r>
-        <w:rPr>
-          <w:lang w:val="en-US"/>
-        </w:rPr>
-        <w:t xml:space="preserve"> Internet: </w:t>
-      </w:r>
-      <w:hyperlink r:id="rId16" w:history="1">
+        <w:t xml:space="preserve">– Online im Internet: </w:t>
+      </w:r>
+      <w:hyperlink r:id="rId18" w:history="1">
         <w:r>
           <w:rPr>
             <w:rStyle w:val="Hyperlink"/>
@@ -14348,7 +13378,7 @@
       <w:r>
         <w:t xml:space="preserve">nline im Internet: </w:t>
       </w:r>
-      <w:hyperlink r:id="rId17" w:history="1">
+      <w:hyperlink r:id="rId19" w:history="1">
         <w:r>
           <w:rPr>
             <w:rStyle w:val="Hyperlink"/>
@@ -14398,29 +13428,15 @@
         <w:rPr>
           <w:lang w:val="en-US"/>
         </w:rPr>
-        <w:t xml:space="preserve"> – Online </w:t>
-      </w:r>
-      <w:proofErr w:type="spellStart"/>
+        <w:t xml:space="preserve"> – Online i</w:t>
+      </w:r>
       <w:r>
         <w:rPr>
           <w:lang w:val="en-US"/>
         </w:rPr>
-        <w:t>i</w:t>
-      </w:r>
-      <w:r>
-        <w:rPr>
-          <w:lang w:val="en-US"/>
-        </w:rPr>
-        <w:t>m</w:t>
-      </w:r>
-      <w:proofErr w:type="spellEnd"/>
-      <w:r>
-        <w:rPr>
-          <w:lang w:val="en-US"/>
-        </w:rPr>
-        <w:t xml:space="preserve"> Internet: </w:t>
-      </w:r>
-      <w:hyperlink r:id="rId18" w:history="1">
+        <w:t xml:space="preserve">m Internet: </w:t>
+      </w:r>
+      <w:hyperlink r:id="rId20" w:history="1">
         <w:r>
           <w:rPr>
             <w:rStyle w:val="Hyperlink"/>
@@ -14454,79 +13470,49 @@
         </w:rPr>
       </w:pPr>
       <w:bookmarkStart w:id="174" w:name="Oudah_2020"/>
-      <w:proofErr w:type="spellStart"/>
       <w:r>
         <w:rPr>
           <w:lang w:val="en-US"/>
         </w:rPr>
-        <w:t>Oudah</w:t>
-      </w:r>
-      <w:proofErr w:type="spellEnd"/>
+        <w:t>Oudah M., Al-Naji A.</w:t>
+      </w:r>
       <w:r>
         <w:rPr>
           <w:lang w:val="en-US"/>
         </w:rPr>
-        <w:t xml:space="preserve"> M., Al-Naji A.</w:t>
+        <w:t xml:space="preserve">, </w:t>
       </w:r>
       <w:r>
         <w:rPr>
           <w:lang w:val="en-US"/>
         </w:rPr>
-        <w:t xml:space="preserve">, </w:t>
-      </w:r>
-      <w:proofErr w:type="spellStart"/>
+        <w:t>Chahl J. (2020)</w:t>
+      </w:r>
       <w:r>
         <w:rPr>
           <w:lang w:val="en-US"/>
         </w:rPr>
-        <w:t>Chahl</w:t>
-      </w:r>
-      <w:proofErr w:type="spellEnd"/>
+        <w:t>:</w:t>
+      </w:r>
       <w:r>
         <w:rPr>
           <w:lang w:val="en-US"/>
         </w:rPr>
-        <w:t xml:space="preserve"> J. (2020)</w:t>
+        <w:t xml:space="preserve"> Hand Gesture Recognition Based on Computer Vision: A Review of Techniques</w:t>
       </w:r>
       <w:r>
         <w:rPr>
           <w:lang w:val="en-US"/>
         </w:rPr>
-        <w:t>:</w:t>
+        <w:t xml:space="preserve"> – Online im Internet</w:t>
       </w:r>
       <w:r>
         <w:rPr>
           <w:lang w:val="en-US"/>
         </w:rPr>
-        <w:t xml:space="preserve"> Hand Gesture Recognition Based on Computer Vision: A Review of Techniques</w:t>
-      </w:r>
-      <w:r>
-        <w:rPr>
-          <w:lang w:val="en-US"/>
-        </w:rPr>
-        <w:t xml:space="preserve"> – Online </w:t>
-      </w:r>
-      <w:proofErr w:type="spellStart"/>
-      <w:r>
-        <w:rPr>
-          <w:lang w:val="en-US"/>
-        </w:rPr>
-        <w:t>im</w:t>
-      </w:r>
-      <w:proofErr w:type="spellEnd"/>
-      <w:r>
-        <w:rPr>
-          <w:lang w:val="en-US"/>
-        </w:rPr>
-        <w:t xml:space="preserve"> Internet</w:t>
-      </w:r>
-      <w:r>
-        <w:rPr>
-          <w:lang w:val="en-US"/>
-        </w:rPr>
         <w:t xml:space="preserve">: </w:t>
       </w:r>
-      <w:hyperlink r:id="rId19" w:history="1">
+      <w:hyperlink r:id="rId21" w:history="1">
         <w:r>
           <w:rPr>
             <w:rStyle w:val="Hyperlink"/>
@@ -14559,61 +13545,15 @@
         <w:rPr>
           <w:lang w:val="en-US"/>
         </w:rPr>
-        <w:t xml:space="preserve">Nickel </w:t>
+        <w:t>Nickel K., Stiefelhagen R. (2007): Visual recognition of pointing gestures for human–robot interaction</w:t>
       </w:r>
       <w:r>
         <w:rPr>
           <w:lang w:val="en-US"/>
         </w:rPr>
-        <w:t>K.</w:t>
-      </w:r>
-      <w:r>
-        <w:rPr>
-          <w:lang w:val="en-US"/>
-        </w:rPr>
-        <w:t xml:space="preserve">, </w:t>
-      </w:r>
-      <w:proofErr w:type="spellStart"/>
-      <w:r>
-        <w:rPr>
-          <w:lang w:val="en-US"/>
-        </w:rPr>
-        <w:t>Stiefelhagen</w:t>
-      </w:r>
-      <w:proofErr w:type="spellEnd"/>
-      <w:r>
-        <w:rPr>
-          <w:lang w:val="en-US"/>
-        </w:rPr>
-        <w:t xml:space="preserve"> R. (2007): </w:t>
-      </w:r>
-      <w:r>
-        <w:rPr>
-          <w:lang w:val="en-US"/>
-        </w:rPr>
-        <w:t>Visual recognition of pointing gestures for human–robot interaction</w:t>
-      </w:r>
-      <w:r>
-        <w:rPr>
-          <w:lang w:val="en-US"/>
-        </w:rPr>
-        <w:t xml:space="preserve"> - Online </w:t>
-      </w:r>
-      <w:proofErr w:type="spellStart"/>
-      <w:r>
-        <w:rPr>
-          <w:lang w:val="en-US"/>
-        </w:rPr>
-        <w:t>im</w:t>
-      </w:r>
-      <w:proofErr w:type="spellEnd"/>
-      <w:r>
-        <w:rPr>
-          <w:lang w:val="en-US"/>
-        </w:rPr>
-        <w:t xml:space="preserve"> Internet: </w:t>
-      </w:r>
-      <w:hyperlink r:id="rId20" w:history="1">
+        <w:t xml:space="preserve"> - Online im Internet: </w:t>
+      </w:r>
+      <w:hyperlink r:id="rId22" w:history="1">
         <w:r>
           <w:rPr>
             <w:rStyle w:val="Hyperlink"/>
@@ -14702,8 +13642,8 @@
       </w:r>
     </w:p>
     <w:sectPr>
-      <w:headerReference w:type="default" r:id="rId21"/>
-      <w:headerReference w:type="first" r:id="rId22"/>
+      <w:headerReference w:type="default" r:id="rId23"/>
+      <w:headerReference w:type="first" r:id="rId24"/>
       <w:pgSz w:w="11906" w:h="16838" w:code="9"/>
       <w:pgMar w:top="1701" w:right="1701" w:bottom="1134" w:left="1701" w:header="720" w:footer="720" w:gutter="0"/>
       <w:pgNumType w:start="1"/>
@@ -14949,15 +13889,7 @@
       </w:r>
       <w:r>
         <w:tab/>
-        <w:t xml:space="preserve">Der Abkürzungspunkt ersetzt den </w:t>
-      </w:r>
-      <w:proofErr w:type="spellStart"/>
-      <w:r>
-        <w:t>Schlußpunkt</w:t>
-      </w:r>
-      <w:proofErr w:type="spellEnd"/>
-      <w:r>
-        <w:t>.</w:t>
+        <w:t>Der Abkürzungspunkt ersetzt den Schlußpunkt.</w:t>
       </w:r>
     </w:p>
   </w:footnote>
@@ -14973,15 +13905,7 @@
         <w:footnoteRef/>
       </w:r>
       <w:r>
-        <w:t xml:space="preserve"> Wobei es </w:t>
-      </w:r>
-      <w:proofErr w:type="gramStart"/>
-      <w:r>
-        <w:t>natürlich beim</w:t>
-      </w:r>
-      <w:proofErr w:type="gramEnd"/>
-      <w:r>
-        <w:t xml:space="preserve"> Professor </w:t>
+        <w:t xml:space="preserve"> Wobei es natürlich beim Professor </w:t>
       </w:r>
       <w:r>
         <w:rPr>
@@ -15102,15 +14026,7 @@
       </w:r>
       <w:r>
         <w:tab/>
-        <w:t>Bei einer Verkürzung der Schreibweise (‚Schriftart und -größe‘ statt ‚Schriftart und Schriftgröße‘) ist ein geschützter Trennstrich ([Shift]+[Strg]</w:t>
-      </w:r>
-      <w:proofErr w:type="gramStart"/>
-      <w:r>
-        <w:t>+[</w:t>
-      </w:r>
-      <w:proofErr w:type="gramEnd"/>
-      <w:r>
-        <w:t>-]) zu verwenden. So erfolgt auch bei einem anderen Zeilenumbruch eine korrekte Trennung und der Bindestrich steht nicht vereinzelt am rechten Rand.</w:t>
+        <w:t>Bei einer Verkürzung der Schreibweise (‚Schriftart und -größe‘ statt ‚Schriftart und Schriftgröße‘) ist ein geschützter Trennstrich ([Shift]+[Strg]+[-]) zu verwenden. So erfolgt auch bei einem anderen Zeilenumbruch eine korrekte Trennung und der Bindestrich steht nicht vereinzelt am rechten Rand.</w:t>
       </w:r>
     </w:p>
   </w:footnote>
@@ -15368,7 +14284,7 @@
           <w:color w:val="000000" w:themeColor="text1"/>
           <w:u w:val="none"/>
         </w:rPr>
-        <w:t>7</w:t>
+        <w:t>8</w:t>
       </w:r>
       <w:r>
         <w:rPr>
@@ -17873,6 +16789,7 @@
   <w:style w:type="character" w:default="1" w:styleId="Absatz-Standardschriftart">
     <w:name w:val="Default Paragraph Font"/>
     <w:uiPriority w:val="1"/>
+    <w:semiHidden/>
     <w:unhideWhenUsed/>
   </w:style>
   <w:style w:type="table" w:default="1" w:styleId="NormaleTabelle">

</xml_diff>

<commit_message>
modell auswertung der kamera perspecktive mit seichtfeld und so
</commit_message>
<xml_diff>
--- a/Kamerabasierte Gestenerkennung zur Steuerung eines virtuellen Orchesters (Masterarbeit Wegener).docx
+++ b/Kamerabasierte Gestenerkennung zur Steuerung eines virtuellen Orchesters (Masterarbeit Wegener).docx
@@ -1803,19 +1803,7 @@
               <w:rPr>
                 <w:rStyle w:val="Hyperlink"/>
               </w:rPr>
-              <w:t>Projektanforderunge</w:t>
-            </w:r>
-            <w:r>
-              <w:rPr>
-                <w:rStyle w:val="Hyperlink"/>
-              </w:rPr>
-              <w:t>n</w:t>
-            </w:r>
-            <w:r>
-              <w:rPr>
-                <w:rStyle w:val="Hyperlink"/>
-              </w:rPr>
-              <w:t xml:space="preserve"> an die Programmumgebung</w:t>
+              <w:t>Projektanforderungen an die Programmumgebung</w:t>
             </w:r>
             <w:r>
               <w:rPr>
@@ -5143,8 +5131,8 @@
       <w:pPr>
         <w:pStyle w:val="berschrift1"/>
       </w:pPr>
-      <w:bookmarkStart w:id="23" w:name="_Toc226907255"/>
-      <w:bookmarkStart w:id="24" w:name="_Toc228557168"/>
+      <w:bookmarkStart w:id="23" w:name="_Toc228557168"/>
+      <w:bookmarkStart w:id="24" w:name="_Toc226907255"/>
       <w:r>
         <w:lastRenderedPageBreak/>
         <w:t>Einsortierung zu Themenbereichen</w:t>
@@ -5152,7 +5140,7 @@
       <w:r>
         <w:t xml:space="preserve"> und Begriffsklärung</w:t>
       </w:r>
-      <w:bookmarkEnd w:id="24"/>
+      <w:bookmarkEnd w:id="23"/>
     </w:p>
     <w:p>
       <w:pPr>
@@ -6459,41 +6447,16 @@
       <w:r>
         <w:t xml:space="preserve"> feststeht ist der genaue Abstand zwischen Kamera und Standzone noch unbekannt. Ein </w:t>
       </w:r>
-      <w:r>
-        <w:fldChar w:fldCharType="begin"/>
-      </w:r>
-      <w:r>
-        <w:instrText>HYPERLINK "https://cad.onshape.com/documents/00b008a3f533eca98fac5bba/w/b6eb2c8f02007af9c686e203/e/60674b425d3e898ddf7b70c7"</w:instrText>
-      </w:r>
-      <w:r>
-        <w:fldChar w:fldCharType="separate"/>
-      </w:r>
-      <w:r>
-        <w:rPr>
-          <w:rStyle w:val="Hyperlink"/>
-        </w:rPr>
-        <w:t>3D-M</w:t>
-      </w:r>
-      <w:r>
-        <w:rPr>
-          <w:rStyle w:val="Hyperlink"/>
-        </w:rPr>
-        <w:t>o</w:t>
-      </w:r>
-      <w:r>
-        <w:rPr>
-          <w:rStyle w:val="Hyperlink"/>
-        </w:rPr>
-        <w:t>del</w:t>
-      </w:r>
-      <w:r>
-        <w:fldChar w:fldCharType="end"/>
-      </w:r>
-      <w:r>
-        <w:t xml:space="preserve"> </w:t>
-      </w:r>
-      <w:r>
-        <w:t xml:space="preserve">des 3D-Audio-Raums soll helfen die Auswirkungen der genannten Faktoren zu sehen. Das </w:t>
+      <w:hyperlink r:id="rId15" w:history="1">
+        <w:r>
+          <w:rPr>
+            <w:rStyle w:val="Hyperlink"/>
+          </w:rPr>
+          <w:t>3D-Model</w:t>
+        </w:r>
+      </w:hyperlink>
+      <w:r>
+        <w:t xml:space="preserve"> des 3D-Audio-Raums soll helfen die Auswirkungen der genannten Faktoren zu sehen. Das </w:t>
       </w:r>
       <w:r>
         <w:t>M</w:t>
@@ -6510,7 +6473,7 @@
       <w:r>
         <w:t xml:space="preserve"> von </w:t>
       </w:r>
-      <w:hyperlink r:id="rId15" w:history="1">
+      <w:hyperlink r:id="rId16" w:history="1">
         <w:r>
           <w:rPr>
             <w:rStyle w:val="Hyperlink"/>
@@ -6531,19 +6494,7 @@
         </w:r>
       </w:hyperlink>
       <w:r>
-        <w:t xml:space="preserve"> erstellt, das ist eine </w:t>
-      </w:r>
-      <w:r>
-        <w:t>3D-M</w:t>
-      </w:r>
-      <w:r>
-        <w:t>o</w:t>
-      </w:r>
-      <w:r>
-        <w:t>ddeling</w:t>
-      </w:r>
-      <w:r>
-        <w:t xml:space="preserve"> Browser Applikation.</w:t>
+        <w:t xml:space="preserve"> erstellt, das ist eine 3D-Moddeling Browser Applikation.</w:t>
       </w:r>
     </w:p>
     <w:p>
@@ -6579,19 +6530,10 @@
       </w:r>
       <w:r>
         <w:lastRenderedPageBreak/>
-        <w:t xml:space="preserve">Stangenstruktur der Gerüstsäulen und Balken nicht der Realität, auch die genaue Ausrichtung der Lautsprecher am Boden ist Falsch, Kleinteile wie Lautsprecher Halterungen und elektrische Leitungen wurde weggelassen. Der Raum um das Lautsprechersystem herum ist nur schemenhaft </w:t>
-      </w:r>
-      <w:r>
-        <w:t>dargestellt</w:t>
-      </w:r>
-      <w:r>
-        <w:t xml:space="preserve">. </w:t>
-      </w:r>
-      <w:r>
-        <w:t>Es existieren Boden und Fensterfront</w:t>
-      </w:r>
-      <w:r>
-        <w:t>, u</w:t>
+        <w:t xml:space="preserve">Stangenstruktur der Gerüstsäulen und Balken nicht der Realität, auch die genaue Ausrichtung der Lautsprecher am Boden ist Falsch, Kleinteile wie Lautsprecher Halterungen und elektrische Leitungen wurde weggelassen. Der Raum um das Lautsprechersystem herum ist nur schemenhaft dargestellt. </w:t>
+      </w:r>
+      <w:r>
+        <w:t>Es existieren Boden und Fensterfront, u</w:t>
       </w:r>
       <w:r>
         <w:t xml:space="preserve">m die Ausrichtung des Systems im Raum deutlich zu </w:t>
@@ -6630,7 +6572,7 @@
                     </pic:cNvPicPr>
                   </pic:nvPicPr>
                   <pic:blipFill>
-                    <a:blip r:embed="rId16" cstate="print">
+                    <a:blip r:embed="rId17" cstate="print">
                       <a:extLst>
                         <a:ext uri="{28A0092B-C50C-407E-A947-70E740481C1C}">
                           <a14:useLocalDpi xmlns:a14="http://schemas.microsoft.com/office/drawing/2010/main" val="0"/>
@@ -6683,7 +6625,7 @@
                     </pic:cNvPicPr>
                   </pic:nvPicPr>
                   <pic:blipFill>
-                    <a:blip r:embed="rId17" cstate="print">
+                    <a:blip r:embed="rId18" cstate="print">
                       <a:extLst>
                         <a:ext uri="{28A0092B-C50C-407E-A947-70E740481C1C}">
                           <a14:useLocalDpi xmlns:a14="http://schemas.microsoft.com/office/drawing/2010/main" val="0"/>
@@ -6772,7 +6714,7 @@
                     </pic:cNvPicPr>
                   </pic:nvPicPr>
                   <pic:blipFill rotWithShape="1">
-                    <a:blip r:embed="rId18" cstate="print">
+                    <a:blip r:embed="rId19" cstate="print">
                       <a:extLst>
                         <a:ext uri="{28A0092B-C50C-407E-A947-70E740481C1C}">
                           <a14:useLocalDpi xmlns:a14="http://schemas.microsoft.com/office/drawing/2010/main" val="0"/>
@@ -6830,7 +6772,7 @@
                     </pic:cNvPicPr>
                   </pic:nvPicPr>
                   <pic:blipFill>
-                    <a:blip r:embed="rId19" cstate="print">
+                    <a:blip r:embed="rId20" cstate="print">
                       <a:extLst>
                         <a:ext uri="{28A0092B-C50C-407E-A947-70E740481C1C}">
                           <a14:useLocalDpi xmlns:a14="http://schemas.microsoft.com/office/drawing/2010/main" val="0"/>
@@ -6921,10 +6863,46 @@
         <w:fldChar w:fldCharType="end"/>
       </w:r>
       <w:r>
-        <w:t xml:space="preserve"> Zeigen den Bereich im Raum in den Gesten erkannt werden sollen. Das Linke Bild zeigt einen Ansatz in dem Basierend auf der Standzone, dem Armradius und der Kopfhöhe Zwei rundliche Bereiche modelliert wurden, diese umschließen mögliche Positionen für Arm und Kopf. Der Ansatz im Bild rechts erweitert den Armbereich um die Möglichkeit den Arm um 90° zu heben und 45° zu senken. Dieser Neue Armbereich umschließt alle möglichen Kopfpositionen und macht einen Kopfbereich redundant. Die Simulation geht hier von einem 2 Meter großen Menschen aus mit einer Armspanne von 215 cm</w:t>
-      </w:r>
-      <w:r>
-        <w:t>, einer Hals-Kopf-Partie von 33 cm und einer Schulterhöhe von 167 cm</w:t>
+        <w:t xml:space="preserve"> Zeigen den Bereich im Raum in den Gesten erkannt werden sollen. Das Linke Bild zeigt einen Ansatz in dem Basierend auf der Standzone, dem Armradius und der Kopfhöhe Zwei rundliche Bereiche modelliert wurden, diese umschließen mögliche Positionen für Arm und Kopf. Der Ansatz im Bild rechts erweitert den Armbereich um die Möglichkeit den Arm um 90° zu heben und 45° zu senken. Dieser Neue Armbereich umschließt alle möglichen Kopfpositionen und macht einen Kopfbereich redundant. Die Simulation geht hier von einem 2</w:t>
+      </w:r>
+      <w:r>
+        <w:t>,07</w:t>
+      </w:r>
+      <w:r>
+        <w:t xml:space="preserve"> Meter großen Menschen aus mit einer Armspanne von </w:t>
+      </w:r>
+      <w:r>
+        <w:t>rund 223</w:t>
+      </w:r>
+      <w:r>
+        <w:t xml:space="preserve"> cm</w:t>
+      </w:r>
+      <w:r>
+        <w:t xml:space="preserve">, </w:t>
+      </w:r>
+      <w:r>
+        <w:t xml:space="preserve">einer Streckhöhe von 261 cm, beim entspannten nach oben zeigen, </w:t>
+      </w:r>
+      <w:r>
+        <w:t>einer Hals-Kopf-Partie von 3</w:t>
+      </w:r>
+      <w:r>
+        <w:t>4</w:t>
+      </w:r>
+      <w:r>
+        <w:t xml:space="preserve"> cm</w:t>
+      </w:r>
+      <w:r>
+        <w:t xml:space="preserve"> Höhe</w:t>
+      </w:r>
+      <w:r>
+        <w:t xml:space="preserve"> und einer Schulterhöhe von </w:t>
+      </w:r>
+      <w:r>
+        <w:t>173</w:t>
+      </w:r>
+      <w:r>
+        <w:t xml:space="preserve"> cm</w:t>
       </w:r>
       <w:r>
         <w:t>. Diese Maße</w:t>
@@ -6936,13 +6914,29 @@
         <w:t xml:space="preserve"> </w:t>
       </w:r>
       <w:r>
-        <w:t xml:space="preserve">Menschen hergeleitet uns sollen in ihrer Gebäulichkeit </w:t>
+        <w:t>Menschen hergeleitet uns sollen in ihrer Ge</w:t>
+      </w:r>
+      <w:r>
+        <w:t>nau</w:t>
+      </w:r>
+      <w:r>
+        <w:t>i</w:t>
+      </w:r>
+      <w:r>
+        <w:t>g</w:t>
+      </w:r>
+      <w:r>
+        <w:t xml:space="preserve">keit </w:t>
       </w:r>
       <w:r>
         <w:t>reichen,</w:t>
       </w:r>
       <w:r>
-        <w:t xml:space="preserve"> um die</w:t>
+        <w:t xml:space="preserve"> um </w:t>
+      </w:r>
+      <w:r>
+        <w:lastRenderedPageBreak/>
+        <w:t>die</w:t>
       </w:r>
       <w:r>
         <w:t xml:space="preserve"> </w:t>
@@ -6960,50 +6954,356 @@
         <w:t xml:space="preserve"> menschlicher Größe </w:t>
       </w:r>
       <w:r>
-        <w:t xml:space="preserve">zu repräsentieren, welche </w:t>
-      </w:r>
-      <w:r>
-        <w:lastRenderedPageBreak/>
-        <w:t xml:space="preserve">die Simulation berücksichtigt. </w:t>
-      </w:r>
-      <w:r>
-        <w:t>Diese Maße erlauben ca. 6 cm Freiraum zwischen einem locker noch oben gestreckten Arm und dem Gerüstbalken. Die untere Körpergrenze soll ein 150 cm großer Mensch repräsentieren, entsprechende Körpermaße werden linear abgeleitet, dass soll in seiner Gebäulichkeit für diese Simulation genügen.</w:t>
-      </w:r>
-      <w:r>
-        <w:t xml:space="preserve"> Aus dem simuliertem Armbereich einer maximal großen Person ergibt sich eine Standzone von 180 x 100 cm, hier bei sind die 180 cm so gewählt, dass ein Freiraum von ca. 5 cm zwischen Arm und den mittleren Seiten-Lautsprechern gewährleistet ist. Die 100 cm vo</w:t>
-      </w:r>
-      <w:r>
-        <w:t>m Mittelpunkt</w:t>
-      </w:r>
-      <w:r>
-        <w:t xml:space="preserve"> aus nach hinten </w:t>
-      </w:r>
-      <w:r>
-        <w:t>sind mehr</w:t>
-      </w:r>
-      <w:r>
-        <w:t xml:space="preserve"> ein Richtwert als eine feste Grenze. Die Armbewegung nach hinten soll kein </w:t>
-      </w:r>
-      <w:r>
-        <w:t>Teil</w:t>
+        <w:t xml:space="preserve">zu repräsentieren, welche die Simulation berücksichtig. </w:t>
+      </w:r>
+      <w:r>
+        <w:t>Diese Maße</w:t>
+      </w:r>
+      <w:r>
+        <w:t xml:space="preserve"> einer 2,07 Meter Person</w:t>
+      </w:r>
+      <w:r>
+        <w:t xml:space="preserve"> erlauben ca. </w:t>
+      </w:r>
+      <w:r>
+        <w:t>10</w:t>
+      </w:r>
+      <w:r>
+        <w:t xml:space="preserve"> cm Freiraum zwischen </w:t>
+      </w:r>
+      <w:r>
+        <w:t>seiner gestreckten Haltung</w:t>
+      </w:r>
+      <w:r>
+        <w:t xml:space="preserve"> und dem </w:t>
+      </w:r>
+      <w:r>
+        <w:t>Gerüstbalken oben in der Mitte</w:t>
+      </w:r>
+      <w:r>
+        <w:t xml:space="preserve">. </w:t>
+      </w:r>
+    </w:p>
+    <w:p>
+      <w:pPr>
+        <w:pStyle w:val="Grundtext"/>
+      </w:pPr>
+      <w:r>
+        <w:t>Die untere Körpergrenze soll ein 140 cm großer Mensch repräsentieren</w:t>
+      </w:r>
+      <w:r>
+        <w:t>. Es wird willkürlich davon ausgegangen das noch kleinere Personen nicht mit diesem System interagieren werden.</w:t>
       </w:r>
       <w:r>
         <w:t xml:space="preserve"> </w:t>
       </w:r>
       <w:r>
-        <w:t>der</w:t>
-      </w:r>
-      <w:r>
-        <w:t xml:space="preserve"> Gestenerkennung </w:t>
-      </w:r>
-      <w:r>
-        <w:t>werden</w:t>
-      </w:r>
-      <w:r>
-        <w:t>. Sie ist dennoch in der Simulation enthalten da sie nicht stört</w:t>
-      </w:r>
-      <w:r>
-        <w:t xml:space="preserve"> und den Kamera Öffnungswinkel nicht beeinflusst. Die folgende Figure zeigt den Armbereich einer …</w:t>
+        <w:t xml:space="preserve">Die </w:t>
+      </w:r>
+      <w:r>
+        <w:t>entsprechende</w:t>
+      </w:r>
+      <w:r>
+        <w:t>n</w:t>
+      </w:r>
+      <w:r>
+        <w:t xml:space="preserve"> Körpermaße werden linear abgeleitet, dass soll in seiner Genauigkeit für </w:t>
+      </w:r>
+      <w:r>
+        <w:t>das Modell mit seiner</w:t>
+      </w:r>
+      <w:r>
+        <w:t xml:space="preserve"> Simulation genügen.</w:t>
+      </w:r>
+    </w:p>
+    <w:p>
+      <w:pPr>
+        <w:pStyle w:val="Grundtext"/>
+        <w:rPr>
+          <w:color w:val="000000" w:themeColor="text1"/>
+        </w:rPr>
+      </w:pPr>
+      <w:r>
+        <w:rPr>
+          <w:color w:val="000000" w:themeColor="text1"/>
+        </w:rPr>
+        <w:t xml:space="preserve">Die folgende Figure zeigt </w:t>
+      </w:r>
+      <w:r>
+        <w:rPr>
+          <w:color w:val="000000" w:themeColor="text1"/>
+        </w:rPr>
+        <w:t>zwei</w:t>
+      </w:r>
+      <w:r>
+        <w:rPr>
+          <w:color w:val="000000" w:themeColor="text1"/>
+        </w:rPr>
+        <w:t xml:space="preserve"> </w:t>
+      </w:r>
+      <w:r>
+        <w:rPr>
+          <w:color w:val="000000" w:themeColor="text1"/>
+        </w:rPr>
+        <w:t xml:space="preserve">sich überschneidende </w:t>
+      </w:r>
+      <w:r>
+        <w:rPr>
+          <w:color w:val="000000" w:themeColor="text1"/>
+        </w:rPr>
+        <w:t>Armbereich</w:t>
+      </w:r>
+      <w:r>
+        <w:rPr>
+          <w:color w:val="000000" w:themeColor="text1"/>
+        </w:rPr>
+        <w:t>e</w:t>
+      </w:r>
+      <w:r>
+        <w:rPr>
+          <w:color w:val="000000" w:themeColor="text1"/>
+        </w:rPr>
+        <w:t xml:space="preserve"> im </w:t>
+      </w:r>
+      <w:r>
+        <w:rPr>
+          <w:color w:val="000000" w:themeColor="text1"/>
+        </w:rPr>
+        <w:t>Sichtfeld der Kamera</w:t>
+      </w:r>
+      <w:r>
+        <w:rPr>
+          <w:color w:val="000000" w:themeColor="text1"/>
+        </w:rPr>
+        <w:t>.</w:t>
+      </w:r>
+      <w:r>
+        <w:rPr>
+          <w:color w:val="000000" w:themeColor="text1"/>
+        </w:rPr>
+        <w:t xml:space="preserve"> </w:t>
+      </w:r>
+      <w:r>
+        <w:rPr>
+          <w:color w:val="000000" w:themeColor="text1"/>
+        </w:rPr>
+        <w:t>I</w:t>
+      </w:r>
+      <w:r>
+        <w:rPr>
+          <w:color w:val="000000" w:themeColor="text1"/>
+        </w:rPr>
+        <w:t xml:space="preserve">n Orange, </w:t>
+      </w:r>
+      <w:r>
+        <w:rPr>
+          <w:color w:val="000000" w:themeColor="text1"/>
+        </w:rPr>
+        <w:t>der Armbereich</w:t>
+      </w:r>
+      <w:r>
+        <w:rPr>
+          <w:color w:val="000000" w:themeColor="text1"/>
+        </w:rPr>
+        <w:t xml:space="preserve"> einer 207 cm</w:t>
+      </w:r>
+      <w:r>
+        <w:rPr>
+          <w:color w:val="000000" w:themeColor="text1"/>
+        </w:rPr>
+        <w:t xml:space="preserve"> großen Person</w:t>
+      </w:r>
+      <w:r>
+        <w:rPr>
+          <w:color w:val="000000" w:themeColor="text1"/>
+        </w:rPr>
+        <w:t xml:space="preserve"> und in Gelb, den einer</w:t>
+      </w:r>
+      <w:r>
+        <w:rPr>
+          <w:color w:val="000000" w:themeColor="text1"/>
+        </w:rPr>
+        <w:t xml:space="preserve"> </w:t>
+      </w:r>
+      <w:r>
+        <w:rPr>
+          <w:color w:val="000000" w:themeColor="text1"/>
+        </w:rPr>
+        <w:t>1</w:t>
+      </w:r>
+      <w:r>
+        <w:rPr>
+          <w:color w:val="000000" w:themeColor="text1"/>
+        </w:rPr>
+        <w:t>4</w:t>
+      </w:r>
+      <w:r>
+        <w:rPr>
+          <w:color w:val="000000" w:themeColor="text1"/>
+        </w:rPr>
+        <w:t>0 cm großen Person</w:t>
+      </w:r>
+      <w:r>
+        <w:rPr>
+          <w:color w:val="000000" w:themeColor="text1"/>
+        </w:rPr>
+        <w:t>.</w:t>
+      </w:r>
+      <w:r>
+        <w:rPr>
+          <w:color w:val="000000" w:themeColor="text1"/>
+        </w:rPr>
+        <w:t xml:space="preserve"> </w:t>
+      </w:r>
+      <w:r>
+        <w:rPr>
+          <w:color w:val="000000" w:themeColor="text1"/>
+        </w:rPr>
+        <w:t>D</w:t>
+      </w:r>
+      <w:r>
+        <w:rPr>
+          <w:color w:val="000000" w:themeColor="text1"/>
+        </w:rPr>
+        <w:t>as Sichtfeld ist i</w:t>
+      </w:r>
+      <w:r>
+        <w:rPr>
+          <w:color w:val="000000" w:themeColor="text1"/>
+        </w:rPr>
+        <w:t xml:space="preserve">m </w:t>
+      </w:r>
+      <w:r>
+        <w:rPr>
+          <w:color w:val="000000" w:themeColor="text1"/>
+        </w:rPr>
+        <w:t>Simulation</w:t>
+      </w:r>
+      <w:r>
+        <w:rPr>
+          <w:color w:val="000000" w:themeColor="text1"/>
+        </w:rPr>
+        <w:t>sm</w:t>
+      </w:r>
+      <w:r>
+        <w:rPr>
+          <w:color w:val="000000" w:themeColor="text1"/>
+        </w:rPr>
+        <w:t>odell durch eine hell</w:t>
+      </w:r>
+      <w:r>
+        <w:rPr>
+          <w:color w:val="000000" w:themeColor="text1"/>
+        </w:rPr>
+        <w:t>blaue</w:t>
+      </w:r>
+      <w:r>
+        <w:rPr>
+          <w:color w:val="000000" w:themeColor="text1"/>
+        </w:rPr>
+        <w:t xml:space="preserve"> Pyramide dargestellt, deren spitze die Position der Kameralinse repräsentiert. Es lässt sich erkennen, dass </w:t>
+      </w:r>
+      <w:r>
+        <w:rPr>
+          <w:color w:val="000000" w:themeColor="text1"/>
+        </w:rPr>
+        <w:t>das blaue</w:t>
+      </w:r>
+      <w:r>
+        <w:rPr>
+          <w:color w:val="000000" w:themeColor="text1"/>
+        </w:rPr>
+        <w:t xml:space="preserve"> Sichtfeld den orangenen</w:t>
+      </w:r>
+      <w:r>
+        <w:rPr>
+          <w:color w:val="000000" w:themeColor="text1"/>
+        </w:rPr>
+        <w:t xml:space="preserve"> und gelben</w:t>
+      </w:r>
+      <w:r>
+        <w:rPr>
+          <w:color w:val="000000" w:themeColor="text1"/>
+        </w:rPr>
+        <w:t xml:space="preserve"> Armbereich nicht</w:t>
+      </w:r>
+      <w:r>
+        <w:rPr>
+          <w:color w:val="000000" w:themeColor="text1"/>
+        </w:rPr>
+        <w:t xml:space="preserve"> vollständig </w:t>
+      </w:r>
+      <w:r>
+        <w:rPr>
+          <w:color w:val="000000" w:themeColor="text1"/>
+        </w:rPr>
+        <w:t xml:space="preserve">einfängt. Das </w:t>
+      </w:r>
+      <w:r>
+        <w:rPr>
+          <w:color w:val="000000" w:themeColor="text1"/>
+        </w:rPr>
+        <w:t>r</w:t>
+      </w:r>
+      <w:r>
+        <w:rPr>
+          <w:color w:val="000000" w:themeColor="text1"/>
+        </w:rPr>
+        <w:t xml:space="preserve">echte Bild zeigt das Szenario </w:t>
+      </w:r>
+      <w:r>
+        <w:rPr>
+          <w:color w:val="000000" w:themeColor="text1"/>
+        </w:rPr>
+        <w:t>aus</w:t>
+      </w:r>
+      <w:r>
+        <w:rPr>
+          <w:color w:val="000000" w:themeColor="text1"/>
+        </w:rPr>
+        <w:t xml:space="preserve"> der Blickrichtung der Kamera, das blaue Sichtfeld ist hierbei </w:t>
+      </w:r>
+      <w:r>
+        <w:rPr>
+          <w:color w:val="000000" w:themeColor="text1"/>
+        </w:rPr>
+        <w:t>undurchsichtig,</w:t>
+      </w:r>
+      <w:r>
+        <w:rPr>
+          <w:color w:val="000000" w:themeColor="text1"/>
+        </w:rPr>
+        <w:t xml:space="preserve"> </w:t>
+      </w:r>
+      <w:r>
+        <w:rPr>
+          <w:color w:val="000000" w:themeColor="text1"/>
+        </w:rPr>
+        <w:t>um</w:t>
+      </w:r>
+      <w:r>
+        <w:rPr>
+          <w:color w:val="000000" w:themeColor="text1"/>
+        </w:rPr>
+        <w:t xml:space="preserve"> Bereichsaustritte</w:t>
+      </w:r>
+      <w:r>
+        <w:rPr>
+          <w:color w:val="000000" w:themeColor="text1"/>
+        </w:rPr>
+        <w:t xml:space="preserve"> </w:t>
+      </w:r>
+      <w:r>
+        <w:rPr>
+          <w:color w:val="000000" w:themeColor="text1"/>
+        </w:rPr>
+        <w:t>besser sichtbar</w:t>
+      </w:r>
+      <w:r>
+        <w:rPr>
+          <w:color w:val="000000" w:themeColor="text1"/>
+        </w:rPr>
+        <w:t xml:space="preserve"> zu machen.</w:t>
       </w:r>
     </w:p>
     <w:p>
@@ -7016,68 +7316,10 @@
           <w:noProof/>
         </w:rPr>
         <w:drawing>
-          <wp:inline distT="0" distB="0" distL="0" distR="0" wp14:anchorId="0B071EEE" wp14:editId="00345138">
-            <wp:extent cx="2886075" cy="2197586"/>
+          <wp:inline distT="0" distB="0" distL="0" distR="0" wp14:anchorId="3EDA7DF5" wp14:editId="30A05262">
+            <wp:extent cx="2584122" cy="1850746"/>
             <wp:effectExtent l="0" t="0" r="0" b="0"/>
-            <wp:docPr id="495587162" name="Grafik 8"/>
-            <wp:cNvGraphicFramePr>
-              <a:graphicFrameLocks xmlns:a="http://schemas.openxmlformats.org/drawingml/2006/main" noChangeAspect="1"/>
-            </wp:cNvGraphicFramePr>
-            <a:graphic xmlns:a="http://schemas.openxmlformats.org/drawingml/2006/main">
-              <a:graphicData uri="http://schemas.openxmlformats.org/drawingml/2006/picture">
-                <pic:pic xmlns:pic="http://schemas.openxmlformats.org/drawingml/2006/picture">
-                  <pic:nvPicPr>
-                    <pic:cNvPr id="0" name="Picture 9"/>
-                    <pic:cNvPicPr>
-                      <a:picLocks noChangeAspect="1" noChangeArrowheads="1"/>
-                    </pic:cNvPicPr>
-                  </pic:nvPicPr>
-                  <pic:blipFill rotWithShape="1">
-                    <a:blip r:embed="rId20" cstate="print">
-                      <a:extLst>
-                        <a:ext uri="{28A0092B-C50C-407E-A947-70E740481C1C}">
-                          <a14:useLocalDpi xmlns:a14="http://schemas.microsoft.com/office/drawing/2010/main" val="0"/>
-                        </a:ext>
-                      </a:extLst>
-                    </a:blip>
-                    <a:srcRect l="3570" r="3618"/>
-                    <a:stretch>
-                      <a:fillRect/>
-                    </a:stretch>
-                  </pic:blipFill>
-                  <pic:spPr bwMode="auto">
-                    <a:xfrm>
-                      <a:off x="0" y="0"/>
-                      <a:ext cx="2911830" cy="2217197"/>
-                    </a:xfrm>
-                    <a:prstGeom prst="rect">
-                      <a:avLst/>
-                    </a:prstGeom>
-                    <a:noFill/>
-                    <a:ln>
-                      <a:noFill/>
-                    </a:ln>
-                    <a:extLst>
-                      <a:ext uri="{53640926-AAD7-44D8-BBD7-CCE9431645EC}">
-                        <a14:shadowObscured xmlns:a14="http://schemas.microsoft.com/office/drawing/2010/main"/>
-                      </a:ext>
-                    </a:extLst>
-                  </pic:spPr>
-                </pic:pic>
-              </a:graphicData>
-            </a:graphic>
-          </wp:inline>
-        </w:drawing>
-      </w:r>
-      <w:r>
-        <w:rPr>
-          <w:noProof/>
-        </w:rPr>
-        <w:drawing>
-          <wp:inline distT="0" distB="0" distL="0" distR="0" wp14:anchorId="43C498C1" wp14:editId="4385D474">
-            <wp:extent cx="2495550" cy="2094385"/>
-            <wp:effectExtent l="0" t="0" r="0" b="1270"/>
-            <wp:docPr id="1034017643" name="Grafik 7"/>
+            <wp:docPr id="826073359" name="Grafik 8"/>
             <wp:cNvGraphicFramePr>
               <a:graphicFrameLocks xmlns:a="http://schemas.openxmlformats.org/drawingml/2006/main" noChangeAspect="1"/>
             </wp:cNvGraphicFramePr>
@@ -7098,7 +7340,7 @@
                         </a:ext>
                       </a:extLst>
                     </a:blip>
-                    <a:srcRect l="9025" r="6767"/>
+                    <a:srcRect t="7486" r="8681"/>
                     <a:stretch>
                       <a:fillRect/>
                     </a:stretch>
@@ -7106,7 +7348,7 @@
                   <pic:spPr bwMode="auto">
                     <a:xfrm>
                       <a:off x="0" y="0"/>
-                      <a:ext cx="2506573" cy="2103636"/>
+                      <a:ext cx="2600129" cy="1862210"/>
                     </a:xfrm>
                     <a:prstGeom prst="rect">
                       <a:avLst/>
@@ -7127,6 +7369,64 @@
           </wp:inline>
         </w:drawing>
       </w:r>
+      <w:r>
+        <w:rPr>
+          <w:noProof/>
+        </w:rPr>
+        <w:drawing>
+          <wp:inline distT="0" distB="0" distL="0" distR="0" wp14:anchorId="6CFA3C00" wp14:editId="1A43A868">
+            <wp:extent cx="2411882" cy="1757493"/>
+            <wp:effectExtent l="0" t="0" r="7620" b="0"/>
+            <wp:docPr id="1577672868" name="Grafik 9"/>
+            <wp:cNvGraphicFramePr>
+              <a:graphicFrameLocks xmlns:a="http://schemas.openxmlformats.org/drawingml/2006/main" noChangeAspect="1"/>
+            </wp:cNvGraphicFramePr>
+            <a:graphic xmlns:a="http://schemas.openxmlformats.org/drawingml/2006/main">
+              <a:graphicData uri="http://schemas.openxmlformats.org/drawingml/2006/picture">
+                <pic:pic xmlns:pic="http://schemas.openxmlformats.org/drawingml/2006/picture">
+                  <pic:nvPicPr>
+                    <pic:cNvPr id="0" name="Picture 9"/>
+                    <pic:cNvPicPr>
+                      <a:picLocks noChangeAspect="1" noChangeArrowheads="1"/>
+                    </pic:cNvPicPr>
+                  </pic:nvPicPr>
+                  <pic:blipFill rotWithShape="1">
+                    <a:blip r:embed="rId22" cstate="print">
+                      <a:extLst>
+                        <a:ext uri="{28A0092B-C50C-407E-A947-70E740481C1C}">
+                          <a14:useLocalDpi xmlns:a14="http://schemas.microsoft.com/office/drawing/2010/main" val="0"/>
+                        </a:ext>
+                      </a:extLst>
+                    </a:blip>
+                    <a:srcRect r="2982"/>
+                    <a:stretch>
+                      <a:fillRect/>
+                    </a:stretch>
+                  </pic:blipFill>
+                  <pic:spPr bwMode="auto">
+                    <a:xfrm>
+                      <a:off x="0" y="0"/>
+                      <a:ext cx="2432320" cy="1772386"/>
+                    </a:xfrm>
+                    <a:prstGeom prst="rect">
+                      <a:avLst/>
+                    </a:prstGeom>
+                    <a:noFill/>
+                    <a:ln>
+                      <a:noFill/>
+                    </a:ln>
+                    <a:extLst>
+                      <a:ext uri="{53640926-AAD7-44D8-BBD7-CCE9431645EC}">
+                        <a14:shadowObscured xmlns:a14="http://schemas.microsoft.com/office/drawing/2010/main"/>
+                      </a:ext>
+                    </a:extLst>
+                  </pic:spPr>
+                </pic:pic>
+              </a:graphicData>
+            </a:graphic>
+          </wp:inline>
+        </w:drawing>
+      </w:r>
     </w:p>
     <w:p>
       <w:pPr>
@@ -7145,20 +7445,1633 @@
         </w:r>
       </w:fldSimple>
       <w:r>
-        <w:t xml:space="preserve"> - Modell Audiosystem Armbereich 1,5m Mensch im Sichtkegel 60° x 40°</w:t>
+        <w:t xml:space="preserve"> - Modell Audiosystem Armbereich</w:t>
+      </w:r>
+      <w:r>
+        <w:t xml:space="preserve">e 207 cm und 140 cm </w:t>
+      </w:r>
+      <w:r>
+        <w:t>im Sicht</w:t>
+      </w:r>
+      <w:r>
+        <w:t>feld</w:t>
+      </w:r>
+      <w:r>
+        <w:t xml:space="preserve"> </w:t>
+      </w:r>
+      <w:r>
+        <w:t>8</w:t>
+      </w:r>
+      <w:r>
+        <w:t xml:space="preserve">0° x </w:t>
+      </w:r>
+      <w:r>
+        <w:t>5</w:t>
+      </w:r>
+      <w:r>
+        <w:t>0°</w:t>
       </w:r>
     </w:p>
     <w:p>
       <w:pPr>
         <w:pStyle w:val="Grundtext"/>
-      </w:pPr>
+        <w:keepNext/>
+      </w:pPr>
+      <w:r>
+        <w:t>Auf diese Art wird im Folgenden festgestellt</w:t>
+      </w:r>
+      <w:r>
+        <w:t>,</w:t>
+      </w:r>
+      <w:r>
+        <w:t xml:space="preserve"> welche Parameter notwendig sind, um Armgesten bildlich voll einzufangen. Es werden Personen zwischen 1</w:t>
+      </w:r>
+      <w:r>
+        <w:t>4</w:t>
+      </w:r>
+      <w:r>
+        <w:t>0 und 20</w:t>
+      </w:r>
+      <w:r>
+        <w:t>7</w:t>
+      </w:r>
+      <w:r>
+        <w:t xml:space="preserve"> cm Körperhöhe berücksichtigt.</w:t>
+      </w:r>
+      <w:r>
+        <w:t xml:space="preserve"> Der Armbereich deckt hierbei einen </w:t>
+      </w:r>
+      <w:r>
+        <w:t>Bewegungsradius von</w:t>
+      </w:r>
+      <w:r>
+        <w:t xml:space="preserve"> </w:t>
+      </w:r>
+      <w:r>
+        <w:t>180° ab, senkrecht nach oben bis senkrecht</w:t>
+      </w:r>
+      <w:r>
+        <w:t xml:space="preserve"> nach oben. </w:t>
+      </w:r>
+      <w:r>
+        <w:t>Zudem</w:t>
+      </w:r>
+      <w:r>
+        <w:t xml:space="preserve"> werden zwei Kamera </w:t>
+      </w:r>
+      <w:r>
+        <w:t>Ausrichtungen</w:t>
+      </w:r>
+      <w:r>
+        <w:t xml:space="preserve"> getestet, hier 45°</w:t>
+      </w:r>
+      <w:r>
+        <w:t xml:space="preserve"> </w:t>
+      </w:r>
+      <w:r>
+        <w:t>Ausrichtung und 90°</w:t>
+      </w:r>
+      <w:r>
+        <w:t xml:space="preserve"> </w:t>
+      </w:r>
+      <w:r>
+        <w:t xml:space="preserve">Ausrichtung genannt. Der Winkel </w:t>
+      </w:r>
+      <w:r>
+        <w:t>beschreibt,</w:t>
+      </w:r>
+      <w:r>
+        <w:t xml:space="preserve"> </w:t>
+      </w:r>
+      <w:r>
+        <w:t>wie d</w:t>
+      </w:r>
+      <w:r>
+        <w:t>ie Kamerablickrichtung zum Lichteinfall</w:t>
+      </w:r>
+      <w:r>
+        <w:t xml:space="preserve"> </w:t>
+      </w:r>
+      <w:r>
+        <w:t xml:space="preserve">steht, wenn das </w:t>
+      </w:r>
+      <w:r>
+        <w:t>Licht</w:t>
+      </w:r>
+      <w:r>
+        <w:t xml:space="preserve"> gerade </w:t>
+      </w:r>
+      <w:r>
+        <w:lastRenderedPageBreak/>
+        <w:t>durch die Fensterfront kommen würde.</w:t>
+      </w:r>
+      <w:r>
+        <w:t xml:space="preserve"> </w:t>
+      </w:r>
+      <w:r>
+        <w:t>Die folgenden Bilder</w:t>
+      </w:r>
+      <w:r>
+        <w:t xml:space="preserve"> zeigen Armbereich und Kamera Sichtfeld in </w:t>
+      </w:r>
+      <w:r>
+        <w:t xml:space="preserve">diesen </w:t>
+      </w:r>
+      <w:r>
+        <w:t>beiden Ausrichtungen, linkes Bild 45°, rechtes Bild 90°.</w:t>
+      </w:r>
     </w:p>
     <w:p>
       <w:pPr>
         <w:pStyle w:val="Grundtext"/>
-      </w:pPr>
-      <w:r>
-        <w:t>Die Bilder in Fikure</w:t>
+        <w:keepNext/>
+      </w:pPr>
+      <w:r>
+        <w:rPr>
+          <w:noProof/>
+        </w:rPr>
+        <w:drawing>
+          <wp:inline distT="0" distB="0" distL="0" distR="0" wp14:anchorId="070A0041" wp14:editId="5A140F65">
+            <wp:extent cx="2640787" cy="2625704"/>
+            <wp:effectExtent l="0" t="0" r="0" b="3810"/>
+            <wp:docPr id="873171569" name="Grafik 13"/>
+            <wp:cNvGraphicFramePr>
+              <a:graphicFrameLocks xmlns:a="http://schemas.openxmlformats.org/drawingml/2006/main" noChangeAspect="1"/>
+            </wp:cNvGraphicFramePr>
+            <a:graphic xmlns:a="http://schemas.openxmlformats.org/drawingml/2006/main">
+              <a:graphicData uri="http://schemas.openxmlformats.org/drawingml/2006/picture">
+                <pic:pic xmlns:pic="http://schemas.openxmlformats.org/drawingml/2006/picture">
+                  <pic:nvPicPr>
+                    <pic:cNvPr id="0" name="Picture 13"/>
+                    <pic:cNvPicPr>
+                      <a:picLocks noChangeAspect="1" noChangeArrowheads="1"/>
+                    </pic:cNvPicPr>
+                  </pic:nvPicPr>
+                  <pic:blipFill rotWithShape="1">
+                    <a:blip r:embed="rId23" cstate="print">
+                      <a:extLst>
+                        <a:ext uri="{28A0092B-C50C-407E-A947-70E740481C1C}">
+                          <a14:useLocalDpi xmlns:a14="http://schemas.microsoft.com/office/drawing/2010/main" val="0"/>
+                        </a:ext>
+                      </a:extLst>
+                    </a:blip>
+                    <a:srcRect r="28899"/>
+                    <a:stretch>
+                      <a:fillRect/>
+                    </a:stretch>
+                  </pic:blipFill>
+                  <pic:spPr bwMode="auto">
+                    <a:xfrm>
+                      <a:off x="0" y="0"/>
+                      <a:ext cx="2655318" cy="2640152"/>
+                    </a:xfrm>
+                    <a:prstGeom prst="rect">
+                      <a:avLst/>
+                    </a:prstGeom>
+                    <a:noFill/>
+                    <a:ln>
+                      <a:noFill/>
+                    </a:ln>
+                    <a:extLst>
+                      <a:ext uri="{53640926-AAD7-44D8-BBD7-CCE9431645EC}">
+                        <a14:shadowObscured xmlns:a14="http://schemas.microsoft.com/office/drawing/2010/main"/>
+                      </a:ext>
+                    </a:extLst>
+                  </pic:spPr>
+                </pic:pic>
+              </a:graphicData>
+            </a:graphic>
+          </wp:inline>
+        </w:drawing>
+      </w:r>
+      <w:r>
+        <w:rPr>
+          <w:noProof/>
+        </w:rPr>
+        <w:drawing>
+          <wp:inline distT="0" distB="0" distL="0" distR="0" wp14:anchorId="2FA0B37C" wp14:editId="5C5C401A">
+            <wp:extent cx="2605958" cy="2626156"/>
+            <wp:effectExtent l="0" t="0" r="0" b="3175"/>
+            <wp:docPr id="2108340329" name="Grafik 15"/>
+            <wp:cNvGraphicFramePr>
+              <a:graphicFrameLocks xmlns:a="http://schemas.openxmlformats.org/drawingml/2006/main" noChangeAspect="1"/>
+            </wp:cNvGraphicFramePr>
+            <a:graphic xmlns:a="http://schemas.openxmlformats.org/drawingml/2006/main">
+              <a:graphicData uri="http://schemas.openxmlformats.org/drawingml/2006/picture">
+                <pic:pic xmlns:pic="http://schemas.openxmlformats.org/drawingml/2006/picture">
+                  <pic:nvPicPr>
+                    <pic:cNvPr id="0" name="Picture 15"/>
+                    <pic:cNvPicPr>
+                      <a:picLocks noChangeAspect="1" noChangeArrowheads="1"/>
+                    </pic:cNvPicPr>
+                  </pic:nvPicPr>
+                  <pic:blipFill rotWithShape="1">
+                    <a:blip r:embed="rId24" cstate="print">
+                      <a:extLst>
+                        <a:ext uri="{28A0092B-C50C-407E-A947-70E740481C1C}">
+                          <a14:useLocalDpi xmlns:a14="http://schemas.microsoft.com/office/drawing/2010/main" val="0"/>
+                        </a:ext>
+                      </a:extLst>
+                    </a:blip>
+                    <a:srcRect r="29849"/>
+                    <a:stretch>
+                      <a:fillRect/>
+                    </a:stretch>
+                  </pic:blipFill>
+                  <pic:spPr bwMode="auto">
+                    <a:xfrm>
+                      <a:off x="0" y="0"/>
+                      <a:ext cx="2631025" cy="2651418"/>
+                    </a:xfrm>
+                    <a:prstGeom prst="rect">
+                      <a:avLst/>
+                    </a:prstGeom>
+                    <a:noFill/>
+                    <a:ln>
+                      <a:noFill/>
+                    </a:ln>
+                    <a:extLst>
+                      <a:ext uri="{53640926-AAD7-44D8-BBD7-CCE9431645EC}">
+                        <a14:shadowObscured xmlns:a14="http://schemas.microsoft.com/office/drawing/2010/main"/>
+                      </a:ext>
+                    </a:extLst>
+                  </pic:spPr>
+                </pic:pic>
+              </a:graphicData>
+            </a:graphic>
+          </wp:inline>
+        </w:drawing>
+      </w:r>
+    </w:p>
+    <w:p>
+      <w:pPr>
+        <w:pStyle w:val="Beschriftung"/>
+        <w:jc w:val="both"/>
+      </w:pPr>
+      <w:r>
+        <w:t xml:space="preserve">Figure </w:t>
+      </w:r>
+      <w:r>
+        <w:fldChar w:fldCharType="begin"/>
+      </w:r>
+      <w:r>
+        <w:instrText xml:space="preserve"> SEQ Figure \* ARABIC </w:instrText>
+      </w:r>
+      <w:r>
+        <w:fldChar w:fldCharType="separate"/>
+      </w:r>
+      <w:r>
+        <w:rPr>
+          <w:noProof/>
+        </w:rPr>
+        <w:t>4</w:t>
+      </w:r>
+      <w:r>
+        <w:fldChar w:fldCharType="end"/>
+      </w:r>
+      <w:r>
+        <w:t xml:space="preserve"> -Modell Audiosystem 45° und 90° Ausrichtung</w:t>
+      </w:r>
+    </w:p>
+    <w:p>
+      <w:r>
+        <w:t>Die Wahl der Standzone fiel auf 160 x 100 cm. Der Armbereich eines 207 cm Großen Menschen passt mit diesen gut in beide Ausrichtungen</w:t>
+      </w:r>
+      <w:r>
+        <w:t xml:space="preserve">. Die folgenden Bilder zeigen die grüne Standzone teilweise verdeckt vom orangenen Armbereich, in beiden Ausrichtungen von oben. Die rot umrahmten Bereiche sind Stellen, mit denen eine Kollision möglich wäre, diese begrenzen den Armbereich und folglich die Standzone. </w:t>
+      </w:r>
+      <w:r>
+        <w:t>D</w:t>
+      </w:r>
+      <w:r>
+        <w:t xml:space="preserve">ie Standzone im in der 45° Ausrichtung (links) </w:t>
+      </w:r>
+      <w:r>
+        <w:t>könnte um 45</w:t>
+      </w:r>
+      <w:r>
+        <w:t xml:space="preserve"> cm zu den Seiten erweitert werden</w:t>
+      </w:r>
+      <w:r>
+        <w:t>, ohne das Kollisionsgefahr besteht</w:t>
+      </w:r>
+      <w:r>
+        <w:t>, eine Zone von 2</w:t>
+      </w:r>
+      <w:r>
+        <w:t>5</w:t>
+      </w:r>
+      <w:r>
+        <w:t xml:space="preserve">0 x 100 cm wäre räumlich möglich. In der 90° Ausrichtung </w:t>
+      </w:r>
+      <w:r>
+        <w:t xml:space="preserve">gäbe es noch 50 cm nach hinten, hier wären 160 x 150 cm </w:t>
+      </w:r>
+      <w:r>
+        <w:t xml:space="preserve">räumlich </w:t>
+      </w:r>
+      <w:r>
+        <w:t>möglich.</w:t>
+      </w:r>
+    </w:p>
+    <w:p/>
+    <w:p>
+      <w:pPr>
+        <w:keepNext/>
+      </w:pPr>
+      <w:r>
+        <w:rPr>
+          <w:noProof/>
+        </w:rPr>
+        <w:drawing>
+          <wp:inline distT="0" distB="0" distL="0" distR="0" wp14:anchorId="659B3824" wp14:editId="4B8EA87B">
+            <wp:extent cx="2653792" cy="2598119"/>
+            <wp:effectExtent l="0" t="0" r="0" b="0"/>
+            <wp:docPr id="1882156791" name="Grafik 20"/>
+            <wp:cNvGraphicFramePr>
+              <a:graphicFrameLocks xmlns:a="http://schemas.openxmlformats.org/drawingml/2006/main" noChangeAspect="1"/>
+            </wp:cNvGraphicFramePr>
+            <a:graphic xmlns:a="http://schemas.openxmlformats.org/drawingml/2006/main">
+              <a:graphicData uri="http://schemas.openxmlformats.org/drawingml/2006/picture">
+                <pic:pic xmlns:pic="http://schemas.openxmlformats.org/drawingml/2006/picture">
+                  <pic:nvPicPr>
+                    <pic:cNvPr id="0" name="Picture 20"/>
+                    <pic:cNvPicPr>
+                      <a:picLocks noChangeAspect="1" noChangeArrowheads="1"/>
+                    </pic:cNvPicPr>
+                  </pic:nvPicPr>
+                  <pic:blipFill rotWithShape="1">
+                    <a:blip r:embed="rId25" cstate="print">
+                      <a:extLst>
+                        <a:ext uri="{28A0092B-C50C-407E-A947-70E740481C1C}">
+                          <a14:useLocalDpi xmlns:a14="http://schemas.microsoft.com/office/drawing/2010/main" val="0"/>
+                        </a:ext>
+                      </a:extLst>
+                    </a:blip>
+                    <a:srcRect l="17913" t="4415" r="17500" b="6143"/>
+                    <a:stretch>
+                      <a:fillRect/>
+                    </a:stretch>
+                  </pic:blipFill>
+                  <pic:spPr bwMode="auto">
+                    <a:xfrm>
+                      <a:off x="0" y="0"/>
+                      <a:ext cx="2671957" cy="2615903"/>
+                    </a:xfrm>
+                    <a:prstGeom prst="rect">
+                      <a:avLst/>
+                    </a:prstGeom>
+                    <a:noFill/>
+                    <a:ln>
+                      <a:noFill/>
+                    </a:ln>
+                    <a:extLst>
+                      <a:ext uri="{53640926-AAD7-44D8-BBD7-CCE9431645EC}">
+                        <a14:shadowObscured xmlns:a14="http://schemas.microsoft.com/office/drawing/2010/main"/>
+                      </a:ext>
+                    </a:extLst>
+                  </pic:spPr>
+                </pic:pic>
+              </a:graphicData>
+            </a:graphic>
+          </wp:inline>
+        </w:drawing>
+      </w:r>
+      <w:r>
+        <w:rPr>
+          <w:noProof/>
+        </w:rPr>
+        <w:drawing>
+          <wp:inline distT="0" distB="0" distL="0" distR="0" wp14:anchorId="352F2F9A" wp14:editId="35EFCCC0">
+            <wp:extent cx="2659865" cy="2598367"/>
+            <wp:effectExtent l="0" t="0" r="7620" b="0"/>
+            <wp:docPr id="987195403" name="Grafik 19"/>
+            <wp:cNvGraphicFramePr>
+              <a:graphicFrameLocks xmlns:a="http://schemas.openxmlformats.org/drawingml/2006/main" noChangeAspect="1"/>
+            </wp:cNvGraphicFramePr>
+            <a:graphic xmlns:a="http://schemas.openxmlformats.org/drawingml/2006/main">
+              <a:graphicData uri="http://schemas.openxmlformats.org/drawingml/2006/picture">
+                <pic:pic xmlns:pic="http://schemas.openxmlformats.org/drawingml/2006/picture">
+                  <pic:nvPicPr>
+                    <pic:cNvPr id="0" name="Picture 19"/>
+                    <pic:cNvPicPr>
+                      <a:picLocks noChangeAspect="1" noChangeArrowheads="1"/>
+                    </pic:cNvPicPr>
+                  </pic:nvPicPr>
+                  <pic:blipFill rotWithShape="1">
+                    <a:blip r:embed="rId26" cstate="print">
+                      <a:extLst>
+                        <a:ext uri="{28A0092B-C50C-407E-A947-70E740481C1C}">
+                          <a14:useLocalDpi xmlns:a14="http://schemas.microsoft.com/office/drawing/2010/main" val="0"/>
+                        </a:ext>
+                      </a:extLst>
+                    </a:blip>
+                    <a:srcRect l="18184" t="5015" r="17474" b="6073"/>
+                    <a:stretch>
+                      <a:fillRect/>
+                    </a:stretch>
+                  </pic:blipFill>
+                  <pic:spPr bwMode="auto">
+                    <a:xfrm>
+                      <a:off x="0" y="0"/>
+                      <a:ext cx="2691805" cy="2629569"/>
+                    </a:xfrm>
+                    <a:prstGeom prst="rect">
+                      <a:avLst/>
+                    </a:prstGeom>
+                    <a:noFill/>
+                    <a:ln>
+                      <a:noFill/>
+                    </a:ln>
+                    <a:extLst>
+                      <a:ext uri="{53640926-AAD7-44D8-BBD7-CCE9431645EC}">
+                        <a14:shadowObscured xmlns:a14="http://schemas.microsoft.com/office/drawing/2010/main"/>
+                      </a:ext>
+                    </a:extLst>
+                  </pic:spPr>
+                </pic:pic>
+              </a:graphicData>
+            </a:graphic>
+          </wp:inline>
+        </w:drawing>
+      </w:r>
+    </w:p>
+    <w:p>
+      <w:pPr>
+        <w:pStyle w:val="Beschriftung"/>
+      </w:pPr>
+      <w:r>
+        <w:t xml:space="preserve">Figure </w:t>
+      </w:r>
+      <w:fldSimple w:instr=" SEQ Figure \* ARABIC ">
+        <w:r>
+          <w:rPr>
+            <w:noProof/>
+          </w:rPr>
+          <w:t>5</w:t>
+        </w:r>
+      </w:fldSimple>
+      <w:r>
+        <w:t xml:space="preserve"> - </w:t>
+      </w:r>
+      <w:r>
+        <w:t>Modell Audiosystem</w:t>
+      </w:r>
+      <w:r>
+        <w:t xml:space="preserve"> Kollisionsbereiche der Ausrichtungen</w:t>
+      </w:r>
+    </w:p>
+    <w:p>
+      <w:pPr>
+        <w:pStyle w:val="Grundtext"/>
+      </w:pPr>
+      <w:r>
+        <w:t>Innerhalb der zwei Ausrichtungen werden je fünf verschiedene Kamerapositionen simulativ getestet.</w:t>
+      </w:r>
+      <w:r>
+        <w:t xml:space="preserve"> Bezugspunkt der Positionierung ist die </w:t>
+      </w:r>
+      <w:r>
+        <w:t>jeweil</w:t>
+      </w:r>
+      <w:r>
+        <w:t xml:space="preserve">ige Gerüstecke oben </w:t>
+      </w:r>
+      <w:r>
+        <w:lastRenderedPageBreak/>
+        <w:t xml:space="preserve">außen. Von da aus werden 50 cm Schritte nach unten und nach innen gemacht. </w:t>
+      </w:r>
+      <w:r>
+        <w:t xml:space="preserve">Bei der Positionswahl ist zu beachten, dass höhere Kamerapositionen mit steileren Kameraneigungswinkeln mehr Informationen über räumliche Tiefe liefern können und Positionen mir mehr horizontalen Winkeln, geben mehr Höheninformationen. Bei Verwendung einer 2D Kamera. Auch ist die Distanz zwischen Kamera und Mensch relevant, für das Sichtfeld welchen mindestens benötigt wird. Sehr steile Perspektiven von oben oder Perspektiven von unten nach oben, werden hier ausgeschlossen und als generell ungeeignet abgetan. </w:t>
+      </w:r>
+      <w:r>
+        <w:t xml:space="preserve">Die folgenden </w:t>
+      </w:r>
+      <w:r>
+        <w:t xml:space="preserve">zwei </w:t>
+      </w:r>
+      <w:r>
+        <w:t xml:space="preserve">Bilder zeigen </w:t>
+      </w:r>
+      <w:r>
+        <w:t>die getesteten</w:t>
+      </w:r>
+      <w:r>
+        <w:t xml:space="preserve"> Positionierungen</w:t>
+      </w:r>
+      <w:r>
+        <w:t>.</w:t>
+      </w:r>
+    </w:p>
+    <w:p>
+      <w:pPr>
+        <w:pStyle w:val="Grundtext"/>
+        <w:keepNext/>
+      </w:pPr>
+      <w:r>
+        <w:rPr>
+          <w:noProof/>
+        </w:rPr>
+        <w:drawing>
+          <wp:inline distT="0" distB="0" distL="0" distR="0" wp14:anchorId="79EC4D87" wp14:editId="43C24133">
+            <wp:extent cx="5391150" cy="3811270"/>
+            <wp:effectExtent l="0" t="0" r="0" b="0"/>
+            <wp:docPr id="2097543109" name="Grafik 16"/>
+            <wp:cNvGraphicFramePr>
+              <a:graphicFrameLocks xmlns:a="http://schemas.openxmlformats.org/drawingml/2006/main" noChangeAspect="1"/>
+            </wp:cNvGraphicFramePr>
+            <a:graphic xmlns:a="http://schemas.openxmlformats.org/drawingml/2006/main">
+              <a:graphicData uri="http://schemas.openxmlformats.org/drawingml/2006/picture">
+                <pic:pic xmlns:pic="http://schemas.openxmlformats.org/drawingml/2006/picture">
+                  <pic:nvPicPr>
+                    <pic:cNvPr id="0" name="Picture 16"/>
+                    <pic:cNvPicPr>
+                      <a:picLocks noChangeAspect="1" noChangeArrowheads="1"/>
+                    </pic:cNvPicPr>
+                  </pic:nvPicPr>
+                  <pic:blipFill>
+                    <a:blip r:embed="rId27" cstate="print">
+                      <a:extLst>
+                        <a:ext uri="{28A0092B-C50C-407E-A947-70E740481C1C}">
+                          <a14:useLocalDpi xmlns:a14="http://schemas.microsoft.com/office/drawing/2010/main" val="0"/>
+                        </a:ext>
+                      </a:extLst>
+                    </a:blip>
+                    <a:srcRect/>
+                    <a:stretch>
+                      <a:fillRect/>
+                    </a:stretch>
+                  </pic:blipFill>
+                  <pic:spPr bwMode="auto">
+                    <a:xfrm>
+                      <a:off x="0" y="0"/>
+                      <a:ext cx="5391150" cy="3811270"/>
+                    </a:xfrm>
+                    <a:prstGeom prst="rect">
+                      <a:avLst/>
+                    </a:prstGeom>
+                    <a:noFill/>
+                    <a:ln>
+                      <a:noFill/>
+                    </a:ln>
+                  </pic:spPr>
+                </pic:pic>
+              </a:graphicData>
+            </a:graphic>
+          </wp:inline>
+        </w:drawing>
+      </w:r>
+    </w:p>
+    <w:p>
+      <w:pPr>
+        <w:pStyle w:val="Beschriftung"/>
+        <w:jc w:val="both"/>
+      </w:pPr>
+      <w:r>
+        <w:t xml:space="preserve">Figure </w:t>
+      </w:r>
+      <w:fldSimple w:instr=" SEQ Figure \* ARABIC ">
+        <w:r>
+          <w:rPr>
+            <w:noProof/>
+          </w:rPr>
+          <w:t>6</w:t>
+        </w:r>
+      </w:fldSimple>
+      <w:r>
+        <w:t xml:space="preserve"> - Modell Audiosystem Schnittansicht der Kamera Positionen Ausrichtung </w:t>
+      </w:r>
+      <w:r>
+        <w:t>45</w:t>
+      </w:r>
+      <w:r>
+        <w:t>°</w:t>
+      </w:r>
+    </w:p>
+    <w:p>
+      <w:pPr>
+        <w:pStyle w:val="Beschriftung"/>
+        <w:jc w:val="both"/>
+      </w:pPr>
+      <w:r>
+        <w:rPr>
+          <w:noProof/>
+        </w:rPr>
+        <w:lastRenderedPageBreak/>
+        <w:drawing>
+          <wp:inline distT="0" distB="0" distL="0" distR="0" wp14:anchorId="5E4F744A" wp14:editId="739CB741">
+            <wp:extent cx="5391150" cy="3811270"/>
+            <wp:effectExtent l="0" t="0" r="0" b="0"/>
+            <wp:docPr id="1938599147" name="Grafik 12"/>
+            <wp:cNvGraphicFramePr>
+              <a:graphicFrameLocks xmlns:a="http://schemas.openxmlformats.org/drawingml/2006/main" noChangeAspect="1"/>
+            </wp:cNvGraphicFramePr>
+            <a:graphic xmlns:a="http://schemas.openxmlformats.org/drawingml/2006/main">
+              <a:graphicData uri="http://schemas.openxmlformats.org/drawingml/2006/picture">
+                <pic:pic xmlns:pic="http://schemas.openxmlformats.org/drawingml/2006/picture">
+                  <pic:nvPicPr>
+                    <pic:cNvPr id="0" name="Picture 12"/>
+                    <pic:cNvPicPr>
+                      <a:picLocks noChangeAspect="1" noChangeArrowheads="1"/>
+                    </pic:cNvPicPr>
+                  </pic:nvPicPr>
+                  <pic:blipFill>
+                    <a:blip r:embed="rId28" cstate="print">
+                      <a:extLst>
+                        <a:ext uri="{28A0092B-C50C-407E-A947-70E740481C1C}">
+                          <a14:useLocalDpi xmlns:a14="http://schemas.microsoft.com/office/drawing/2010/main" val="0"/>
+                        </a:ext>
+                      </a:extLst>
+                    </a:blip>
+                    <a:srcRect/>
+                    <a:stretch>
+                      <a:fillRect/>
+                    </a:stretch>
+                  </pic:blipFill>
+                  <pic:spPr bwMode="auto">
+                    <a:xfrm>
+                      <a:off x="0" y="0"/>
+                      <a:ext cx="5391150" cy="3811270"/>
+                    </a:xfrm>
+                    <a:prstGeom prst="rect">
+                      <a:avLst/>
+                    </a:prstGeom>
+                    <a:noFill/>
+                    <a:ln>
+                      <a:noFill/>
+                    </a:ln>
+                  </pic:spPr>
+                </pic:pic>
+              </a:graphicData>
+            </a:graphic>
+          </wp:inline>
+        </w:drawing>
+      </w:r>
+    </w:p>
+    <w:p>
+      <w:pPr>
+        <w:pStyle w:val="Beschriftung"/>
+        <w:jc w:val="both"/>
+      </w:pPr>
+      <w:r>
+        <w:t xml:space="preserve">Figure </w:t>
+      </w:r>
+      <w:fldSimple w:instr=" SEQ Figure \* ARABIC ">
+        <w:r>
+          <w:rPr>
+            <w:noProof/>
+          </w:rPr>
+          <w:t>7</w:t>
+        </w:r>
+      </w:fldSimple>
+      <w:r>
+        <w:t xml:space="preserve"> - Modell Audiosystem Schnittansicht der Kamera Positionen</w:t>
+      </w:r>
+      <w:r>
+        <w:t xml:space="preserve"> Ausrichtung 90°</w:t>
+      </w:r>
+    </w:p>
+    <w:p>
+      <w:r>
+        <w:t>Für die simulativen Tests wurden die folgenden fünf Parameter variiert:</w:t>
+      </w:r>
+    </w:p>
+    <w:p/>
+    <w:p>
+      <w:pPr>
+        <w:ind w:left="705" w:hanging="705"/>
+      </w:pPr>
+      <w:r>
+        <w:t>h, t</w:t>
+      </w:r>
+      <w:r>
+        <w:t xml:space="preserve">: </w:t>
+      </w:r>
+      <w:r>
+        <w:tab/>
+        <w:t>Kameraposition</w:t>
+      </w:r>
+      <w:r>
+        <w:t xml:space="preserve"> Tiefe</w:t>
+      </w:r>
+      <w:r>
+        <w:t xml:space="preserve"> und </w:t>
+      </w:r>
+      <w:r>
+        <w:t>Höhe</w:t>
+      </w:r>
+      <w:r>
+        <w:t xml:space="preserve"> in cm gemessen von der System Mitte am                                                                                                           Boden</w:t>
+      </w:r>
+    </w:p>
+    <w:p>
+      <w:pPr>
+        <w:ind w:left="705" w:hanging="705"/>
+      </w:pPr>
+      <w:r>
+        <w:t xml:space="preserve">n: </w:t>
+      </w:r>
+      <w:r>
+        <w:tab/>
+        <w:t>Neigungswinkel der Kamera, positiv von der Horizontalen zum Boden (0 - 90°)</w:t>
+      </w:r>
+    </w:p>
+    <w:p>
+      <w:pPr>
+        <w:pStyle w:val="Grundtext"/>
+        <w:jc w:val="left"/>
+      </w:pPr>
+      <w:r>
+        <w:t>h:</w:t>
+      </w:r>
+      <w:r>
+        <w:tab/>
+        <w:t xml:space="preserve">horizontaler Kamera Öffnungswinkel – hFOV </w:t>
+      </w:r>
+      <w:r>
+        <w:br/>
+        <w:t>v:</w:t>
+      </w:r>
+      <w:r>
+        <w:tab/>
+        <w:t xml:space="preserve">vertikaler Kamera Öffnungswinkel – vFOV </w:t>
+      </w:r>
+    </w:p>
+    <w:p>
+      <w:pPr>
+        <w:pStyle w:val="Grundtext"/>
+        <w:jc w:val="left"/>
+      </w:pPr>
+      <w:r>
+        <w:t>Die Folgenden Tabellen zeigen die Resultate:</w:t>
+      </w:r>
+    </w:p>
+    <w:p>
+      <w:r>
+        <w:t>45°</w:t>
+      </w:r>
+      <w:r>
+        <w:t xml:space="preserve"> Ausrichtung, Standzone 160 x 100 cm</w:t>
+      </w:r>
+    </w:p>
+    <w:tbl>
+      <w:tblPr>
+        <w:tblStyle w:val="Tabellenraster"/>
+        <w:tblW w:w="0" w:type="auto"/>
+        <w:tblLook w:val="04A0" w:firstRow="1" w:lastRow="0" w:firstColumn="1" w:lastColumn="0" w:noHBand="0" w:noVBand="1"/>
+      </w:tblPr>
+      <w:tblGrid>
+        <w:gridCol w:w="1698"/>
+        <w:gridCol w:w="1699"/>
+        <w:gridCol w:w="1699"/>
+        <w:gridCol w:w="1699"/>
+        <w:gridCol w:w="1699"/>
+      </w:tblGrid>
+      <w:tr>
+        <w:tc>
+          <w:tcPr>
+            <w:tcW w:w="1698" w:type="dxa"/>
+          </w:tcPr>
+          <w:p>
+            <w:r>
+              <w:t xml:space="preserve"> h [cm]</w:t>
+            </w:r>
+          </w:p>
+        </w:tc>
+        <w:tc>
+          <w:tcPr>
+            <w:tcW w:w="1699" w:type="dxa"/>
+          </w:tcPr>
+          <w:p>
+            <w:r>
+              <w:t>t [cm]</w:t>
+            </w:r>
+          </w:p>
+        </w:tc>
+        <w:tc>
+          <w:tcPr>
+            <w:tcW w:w="1699" w:type="dxa"/>
+          </w:tcPr>
+          <w:p>
+            <w:r>
+              <w:t>n [deg]</w:t>
+            </w:r>
+          </w:p>
+        </w:tc>
+        <w:tc>
+          <w:tcPr>
+            <w:tcW w:w="1699" w:type="dxa"/>
+          </w:tcPr>
+          <w:p>
+            <w:r>
+              <w:t>h [deg]</w:t>
+            </w:r>
+          </w:p>
+        </w:tc>
+        <w:tc>
+          <w:tcPr>
+            <w:tcW w:w="1699" w:type="dxa"/>
+          </w:tcPr>
+          <w:p>
+            <w:r>
+              <w:t>v [deg]</w:t>
+            </w:r>
+          </w:p>
+        </w:tc>
+      </w:tr>
+      <w:tr>
+        <w:tc>
+          <w:tcPr>
+            <w:tcW w:w="1698" w:type="dxa"/>
+          </w:tcPr>
+          <w:p>
+            <w:r>
+              <w:t>170</w:t>
+            </w:r>
+          </w:p>
+        </w:tc>
+        <w:tc>
+          <w:tcPr>
+            <w:tcW w:w="1699" w:type="dxa"/>
+          </w:tcPr>
+          <w:p>
+            <w:r>
+              <w:t>235</w:t>
+            </w:r>
+          </w:p>
+        </w:tc>
+        <w:tc>
+          <w:tcPr>
+            <w:tcW w:w="1699" w:type="dxa"/>
+          </w:tcPr>
+          <w:p>
+            <w:r>
+              <w:t>2</w:t>
+            </w:r>
+          </w:p>
+        </w:tc>
+        <w:tc>
+          <w:tcPr>
+            <w:tcW w:w="1699" w:type="dxa"/>
+          </w:tcPr>
+          <w:p>
+            <w:r>
+              <w:t>75</w:t>
+            </w:r>
+          </w:p>
+        </w:tc>
+        <w:tc>
+          <w:tcPr>
+            <w:tcW w:w="1699" w:type="dxa"/>
+          </w:tcPr>
+          <w:p>
+            <w:r>
+              <w:t>51</w:t>
+            </w:r>
+          </w:p>
+        </w:tc>
+      </w:tr>
+      <w:tr>
+        <w:tc>
+          <w:tcPr>
+            <w:tcW w:w="1698" w:type="dxa"/>
+          </w:tcPr>
+          <w:p>
+            <w:r>
+              <w:t>220</w:t>
+            </w:r>
+          </w:p>
+        </w:tc>
+        <w:tc>
+          <w:tcPr>
+            <w:tcW w:w="1699" w:type="dxa"/>
+          </w:tcPr>
+          <w:p>
+            <w:r>
+              <w:t>235</w:t>
+            </w:r>
+          </w:p>
+        </w:tc>
+        <w:tc>
+          <w:tcPr>
+            <w:tcW w:w="1699" w:type="dxa"/>
+          </w:tcPr>
+          <w:p>
+            <w:r>
+              <w:t>13</w:t>
+            </w:r>
+          </w:p>
+        </w:tc>
+        <w:tc>
+          <w:tcPr>
+            <w:tcW w:w="1699" w:type="dxa"/>
+          </w:tcPr>
+          <w:p>
+            <w:r>
+              <w:t>74</w:t>
+            </w:r>
+          </w:p>
+        </w:tc>
+        <w:tc>
+          <w:tcPr>
+            <w:tcW w:w="1699" w:type="dxa"/>
+          </w:tcPr>
+          <w:p>
+            <w:r>
+              <w:t>49</w:t>
+            </w:r>
+          </w:p>
+        </w:tc>
+      </w:tr>
+      <w:tr>
+        <w:tc>
+          <w:tcPr>
+            <w:tcW w:w="1698" w:type="dxa"/>
+          </w:tcPr>
+          <w:p>
+            <w:r>
+              <w:t>270</w:t>
+            </w:r>
+          </w:p>
+        </w:tc>
+        <w:tc>
+          <w:tcPr>
+            <w:tcW w:w="1699" w:type="dxa"/>
+          </w:tcPr>
+          <w:p>
+            <w:r>
+              <w:t>235</w:t>
+            </w:r>
+          </w:p>
+        </w:tc>
+        <w:tc>
+          <w:tcPr>
+            <w:tcW w:w="1699" w:type="dxa"/>
+          </w:tcPr>
+          <w:p>
+            <w:r>
+              <w:t>23</w:t>
+            </w:r>
+          </w:p>
+        </w:tc>
+        <w:tc>
+          <w:tcPr>
+            <w:tcW w:w="1699" w:type="dxa"/>
+          </w:tcPr>
+          <w:p>
+            <w:r>
+              <w:t>70</w:t>
+            </w:r>
+          </w:p>
+        </w:tc>
+        <w:tc>
+          <w:tcPr>
+            <w:tcW w:w="1699" w:type="dxa"/>
+          </w:tcPr>
+          <w:p>
+            <w:r>
+              <w:t>45</w:t>
+            </w:r>
+          </w:p>
+        </w:tc>
+      </w:tr>
+      <w:tr>
+        <w:tc>
+          <w:tcPr>
+            <w:tcW w:w="1698" w:type="dxa"/>
+          </w:tcPr>
+          <w:p>
+            <w:r>
+              <w:t>270</w:t>
+            </w:r>
+          </w:p>
+        </w:tc>
+        <w:tc>
+          <w:tcPr>
+            <w:tcW w:w="1699" w:type="dxa"/>
+          </w:tcPr>
+          <w:p>
+            <w:r>
+              <w:t>185</w:t>
+            </w:r>
+          </w:p>
+        </w:tc>
+        <w:tc>
+          <w:tcPr>
+            <w:tcW w:w="1699" w:type="dxa"/>
+          </w:tcPr>
+          <w:p>
+            <w:r>
+              <w:t>28</w:t>
+            </w:r>
+          </w:p>
+        </w:tc>
+        <w:tc>
+          <w:tcPr>
+            <w:tcW w:w="1699" w:type="dxa"/>
+          </w:tcPr>
+          <w:p>
+            <w:r>
+              <w:t>84</w:t>
+            </w:r>
+          </w:p>
+        </w:tc>
+        <w:tc>
+          <w:tcPr>
+            <w:tcW w:w="1699" w:type="dxa"/>
+          </w:tcPr>
+          <w:p>
+            <w:r>
+              <w:t>53</w:t>
+            </w:r>
+          </w:p>
+        </w:tc>
+      </w:tr>
+      <w:tr>
+        <w:tc>
+          <w:tcPr>
+            <w:tcW w:w="1698" w:type="dxa"/>
+          </w:tcPr>
+          <w:p>
+            <w:r>
+              <w:t>270</w:t>
+            </w:r>
+          </w:p>
+        </w:tc>
+        <w:tc>
+          <w:tcPr>
+            <w:tcW w:w="1699" w:type="dxa"/>
+          </w:tcPr>
+          <w:p>
+            <w:r>
+              <w:t>135</w:t>
+            </w:r>
+          </w:p>
+        </w:tc>
+        <w:tc>
+          <w:tcPr>
+            <w:tcW w:w="1699" w:type="dxa"/>
+          </w:tcPr>
+          <w:p>
+            <w:r>
+              <w:t>35</w:t>
+            </w:r>
+          </w:p>
+        </w:tc>
+        <w:tc>
+          <w:tcPr>
+            <w:tcW w:w="1699" w:type="dxa"/>
+          </w:tcPr>
+          <w:p>
+            <w:r>
+              <w:t>103</w:t>
+            </w:r>
+          </w:p>
+        </w:tc>
+        <w:tc>
+          <w:tcPr>
+            <w:tcW w:w="1699" w:type="dxa"/>
+          </w:tcPr>
+          <w:p>
+            <w:r>
+              <w:t>67</w:t>
+            </w:r>
+          </w:p>
+        </w:tc>
+      </w:tr>
+    </w:tbl>
+    <w:p/>
+    <w:p>
+      <w:r>
+        <w:t>90° Ausrichtung, Standzone 160 x 100 cm</w:t>
+      </w:r>
+    </w:p>
+    <w:tbl>
+      <w:tblPr>
+        <w:tblStyle w:val="Tabellenraster"/>
+        <w:tblW w:w="0" w:type="auto"/>
+        <w:tblLook w:val="04A0" w:firstRow="1" w:lastRow="0" w:firstColumn="1" w:lastColumn="0" w:noHBand="0" w:noVBand="1"/>
+      </w:tblPr>
+      <w:tblGrid>
+        <w:gridCol w:w="1698"/>
+        <w:gridCol w:w="1699"/>
+        <w:gridCol w:w="1699"/>
+        <w:gridCol w:w="1699"/>
+        <w:gridCol w:w="1699"/>
+      </w:tblGrid>
+      <w:tr>
+        <w:tc>
+          <w:tcPr>
+            <w:tcW w:w="1698" w:type="dxa"/>
+          </w:tcPr>
+          <w:p>
+            <w:r>
+              <w:t xml:space="preserve"> h [cm]</w:t>
+            </w:r>
+          </w:p>
+        </w:tc>
+        <w:tc>
+          <w:tcPr>
+            <w:tcW w:w="1699" w:type="dxa"/>
+          </w:tcPr>
+          <w:p>
+            <w:r>
+              <w:t>t [cm]</w:t>
+            </w:r>
+          </w:p>
+        </w:tc>
+        <w:tc>
+          <w:tcPr>
+            <w:tcW w:w="1699" w:type="dxa"/>
+          </w:tcPr>
+          <w:p>
+            <w:r>
+              <w:t>n [deg]</w:t>
+            </w:r>
+          </w:p>
+        </w:tc>
+        <w:tc>
+          <w:tcPr>
+            <w:tcW w:w="1699" w:type="dxa"/>
+          </w:tcPr>
+          <w:p>
+            <w:r>
+              <w:t>h [deg]</w:t>
+            </w:r>
+          </w:p>
+        </w:tc>
+        <w:tc>
+          <w:tcPr>
+            <w:tcW w:w="1699" w:type="dxa"/>
+          </w:tcPr>
+          <w:p>
+            <w:r>
+              <w:t>v [deg]</w:t>
+            </w:r>
+          </w:p>
+        </w:tc>
+      </w:tr>
+      <w:tr>
+        <w:tc>
+          <w:tcPr>
+            <w:tcW w:w="1698" w:type="dxa"/>
+          </w:tcPr>
+          <w:p>
+            <w:r>
+              <w:t>170</w:t>
+            </w:r>
+          </w:p>
+        </w:tc>
+        <w:tc>
+          <w:tcPr>
+            <w:tcW w:w="1699" w:type="dxa"/>
+          </w:tcPr>
+          <w:p>
+            <w:r>
+              <w:t>2</w:t>
+            </w:r>
+            <w:r>
+              <w:t>00</w:t>
+            </w:r>
+          </w:p>
+        </w:tc>
+        <w:tc>
+          <w:tcPr>
+            <w:tcW w:w="1699" w:type="dxa"/>
+          </w:tcPr>
+          <w:p>
+            <w:r>
+              <w:t>2</w:t>
+            </w:r>
+          </w:p>
+        </w:tc>
+        <w:tc>
+          <w:tcPr>
+            <w:tcW w:w="1699" w:type="dxa"/>
+          </w:tcPr>
+          <w:p>
+            <w:r>
+              <w:t>92</w:t>
+            </w:r>
+          </w:p>
+        </w:tc>
+        <w:tc>
+          <w:tcPr>
+            <w:tcW w:w="1699" w:type="dxa"/>
+          </w:tcPr>
+          <w:p>
+            <w:r>
+              <w:t>60</w:t>
+            </w:r>
+          </w:p>
+        </w:tc>
+      </w:tr>
+      <w:tr>
+        <w:tc>
+          <w:tcPr>
+            <w:tcW w:w="1698" w:type="dxa"/>
+          </w:tcPr>
+          <w:p>
+            <w:r>
+              <w:t>220</w:t>
+            </w:r>
+          </w:p>
+        </w:tc>
+        <w:tc>
+          <w:tcPr>
+            <w:tcW w:w="1699" w:type="dxa"/>
+          </w:tcPr>
+          <w:p>
+            <w:r>
+              <w:t>2</w:t>
+            </w:r>
+            <w:r>
+              <w:t>00</w:t>
+            </w:r>
+          </w:p>
+        </w:tc>
+        <w:tc>
+          <w:tcPr>
+            <w:tcW w:w="1699" w:type="dxa"/>
+          </w:tcPr>
+          <w:p>
+            <w:r>
+              <w:t>15</w:t>
+            </w:r>
+          </w:p>
+        </w:tc>
+        <w:tc>
+          <w:tcPr>
+            <w:tcW w:w="1699" w:type="dxa"/>
+          </w:tcPr>
+          <w:p>
+            <w:r>
+              <w:t>90</w:t>
+            </w:r>
+          </w:p>
+        </w:tc>
+        <w:tc>
+          <w:tcPr>
+            <w:tcW w:w="1699" w:type="dxa"/>
+          </w:tcPr>
+          <w:p>
+            <w:r>
+              <w:t>56</w:t>
+            </w:r>
+          </w:p>
+        </w:tc>
+      </w:tr>
+      <w:tr>
+        <w:tc>
+          <w:tcPr>
+            <w:tcW w:w="1698" w:type="dxa"/>
+          </w:tcPr>
+          <w:p>
+            <w:r>
+              <w:t>270</w:t>
+            </w:r>
+          </w:p>
+        </w:tc>
+        <w:tc>
+          <w:tcPr>
+            <w:tcW w:w="1699" w:type="dxa"/>
+          </w:tcPr>
+          <w:p>
+            <w:r>
+              <w:t>2</w:t>
+            </w:r>
+            <w:r>
+              <w:t>00</w:t>
+            </w:r>
+          </w:p>
+        </w:tc>
+        <w:tc>
+          <w:tcPr>
+            <w:tcW w:w="1699" w:type="dxa"/>
+          </w:tcPr>
+          <w:p>
+            <w:r>
+              <w:t>2</w:t>
+            </w:r>
+            <w:r>
+              <w:t>7</w:t>
+            </w:r>
+          </w:p>
+        </w:tc>
+        <w:tc>
+          <w:tcPr>
+            <w:tcW w:w="1699" w:type="dxa"/>
+          </w:tcPr>
+          <w:p>
+            <w:r>
+              <w:t>84</w:t>
+            </w:r>
+          </w:p>
+        </w:tc>
+        <w:tc>
+          <w:tcPr>
+            <w:tcW w:w="1699" w:type="dxa"/>
+          </w:tcPr>
+          <w:p>
+            <w:r>
+              <w:t>51</w:t>
+            </w:r>
+          </w:p>
+        </w:tc>
+      </w:tr>
+      <w:tr>
+        <w:tc>
+          <w:tcPr>
+            <w:tcW w:w="1698" w:type="dxa"/>
+          </w:tcPr>
+          <w:p>
+            <w:r>
+              <w:t>270</w:t>
+            </w:r>
+          </w:p>
+        </w:tc>
+        <w:tc>
+          <w:tcPr>
+            <w:tcW w:w="1699" w:type="dxa"/>
+          </w:tcPr>
+          <w:p>
+            <w:r>
+              <w:t>150</w:t>
+            </w:r>
+          </w:p>
+        </w:tc>
+        <w:tc>
+          <w:tcPr>
+            <w:tcW w:w="1699" w:type="dxa"/>
+          </w:tcPr>
+          <w:p>
+            <w:r>
+              <w:t>32</w:t>
+            </w:r>
+          </w:p>
+        </w:tc>
+        <w:tc>
+          <w:tcPr>
+            <w:tcW w:w="1699" w:type="dxa"/>
+          </w:tcPr>
+          <w:p>
+            <w:r>
+              <w:t>102</w:t>
+            </w:r>
+          </w:p>
+        </w:tc>
+        <w:tc>
+          <w:tcPr>
+            <w:tcW w:w="1699" w:type="dxa"/>
+          </w:tcPr>
+          <w:p>
+            <w:r>
+              <w:t>61</w:t>
+            </w:r>
+          </w:p>
+        </w:tc>
+      </w:tr>
+      <w:tr>
+        <w:tc>
+          <w:tcPr>
+            <w:tcW w:w="1698" w:type="dxa"/>
+          </w:tcPr>
+          <w:p>
+            <w:r>
+              <w:t>270</w:t>
+            </w:r>
+          </w:p>
+        </w:tc>
+        <w:tc>
+          <w:tcPr>
+            <w:tcW w:w="1699" w:type="dxa"/>
+          </w:tcPr>
+          <w:p>
+            <w:r>
+              <w:t>1</w:t>
+            </w:r>
+            <w:r>
+              <w:t>00</w:t>
+            </w:r>
+          </w:p>
+        </w:tc>
+        <w:tc>
+          <w:tcPr>
+            <w:tcW w:w="1699" w:type="dxa"/>
+          </w:tcPr>
+          <w:p>
+            <w:r>
+              <w:t>45</w:t>
+            </w:r>
+          </w:p>
+        </w:tc>
+        <w:tc>
+          <w:tcPr>
+            <w:tcW w:w="1699" w:type="dxa"/>
+          </w:tcPr>
+          <w:p>
+            <w:r>
+              <w:t>1</w:t>
+            </w:r>
+            <w:r>
+              <w:t>27</w:t>
+            </w:r>
+          </w:p>
+        </w:tc>
+        <w:tc>
+          <w:tcPr>
+            <w:tcW w:w="1699" w:type="dxa"/>
+          </w:tcPr>
+          <w:p>
+            <w:r>
+              <w:t>82</w:t>
+            </w:r>
+          </w:p>
+        </w:tc>
+      </w:tr>
+    </w:tbl>
+    <w:p/>
+    <w:p>
+      <w:r>
+        <w:lastRenderedPageBreak/>
+        <w:t xml:space="preserve">45° Ausrichtung, Standzone </w:t>
+      </w:r>
+      <w:r>
+        <w:t>25</w:t>
+      </w:r>
+      <w:r>
+        <w:t>0 x 100 cm</w:t>
+      </w:r>
+    </w:p>
+    <w:tbl>
+      <w:tblPr>
+        <w:tblStyle w:val="Tabellenraster"/>
+        <w:tblW w:w="0" w:type="auto"/>
+        <w:tblLook w:val="04A0" w:firstRow="1" w:lastRow="0" w:firstColumn="1" w:lastColumn="0" w:noHBand="0" w:noVBand="1"/>
+      </w:tblPr>
+      <w:tblGrid>
+        <w:gridCol w:w="1698"/>
+        <w:gridCol w:w="1699"/>
+        <w:gridCol w:w="1699"/>
+        <w:gridCol w:w="1699"/>
+        <w:gridCol w:w="1699"/>
+      </w:tblGrid>
+      <w:tr>
+        <w:tc>
+          <w:tcPr>
+            <w:tcW w:w="1698" w:type="dxa"/>
+          </w:tcPr>
+          <w:p>
+            <w:r>
+              <w:t xml:space="preserve"> h [cm]</w:t>
+            </w:r>
+          </w:p>
+        </w:tc>
+        <w:tc>
+          <w:tcPr>
+            <w:tcW w:w="1699" w:type="dxa"/>
+          </w:tcPr>
+          <w:p>
+            <w:r>
+              <w:t>t [cm]</w:t>
+            </w:r>
+          </w:p>
+        </w:tc>
+        <w:tc>
+          <w:tcPr>
+            <w:tcW w:w="1699" w:type="dxa"/>
+          </w:tcPr>
+          <w:p>
+            <w:r>
+              <w:t>n [deg]</w:t>
+            </w:r>
+          </w:p>
+        </w:tc>
+        <w:tc>
+          <w:tcPr>
+            <w:tcW w:w="1699" w:type="dxa"/>
+          </w:tcPr>
+          <w:p>
+            <w:r>
+              <w:t>h [deg]</w:t>
+            </w:r>
+          </w:p>
+        </w:tc>
+        <w:tc>
+          <w:tcPr>
+            <w:tcW w:w="1699" w:type="dxa"/>
+          </w:tcPr>
+          <w:p>
+            <w:r>
+              <w:t>v [deg]</w:t>
+            </w:r>
+          </w:p>
+        </w:tc>
+      </w:tr>
+      <w:tr>
+        <w:tc>
+          <w:tcPr>
+            <w:tcW w:w="1698" w:type="dxa"/>
+          </w:tcPr>
+          <w:p>
+            <w:r>
+              <w:t>2</w:t>
+            </w:r>
+            <w:r>
+              <w:t>70</w:t>
+            </w:r>
+          </w:p>
+        </w:tc>
+        <w:tc>
+          <w:tcPr>
+            <w:tcW w:w="1699" w:type="dxa"/>
+          </w:tcPr>
+          <w:p>
+            <w:r>
+              <w:t>235</w:t>
+            </w:r>
+          </w:p>
+        </w:tc>
+        <w:tc>
+          <w:tcPr>
+            <w:tcW w:w="1699" w:type="dxa"/>
+          </w:tcPr>
+          <w:p>
+            <w:r>
+              <w:t>2</w:t>
+            </w:r>
+            <w:r>
+              <w:t>3</w:t>
+            </w:r>
+          </w:p>
+        </w:tc>
+        <w:tc>
+          <w:tcPr>
+            <w:tcW w:w="1699" w:type="dxa"/>
+          </w:tcPr>
+          <w:p>
+            <w:r>
+              <w:t>85</w:t>
+            </w:r>
+          </w:p>
+        </w:tc>
+        <w:tc>
+          <w:tcPr>
+            <w:tcW w:w="1699" w:type="dxa"/>
+          </w:tcPr>
+          <w:p>
+            <w:r>
+              <w:t>45</w:t>
+            </w:r>
+          </w:p>
+        </w:tc>
+      </w:tr>
+    </w:tbl>
+    <w:p>
+      <w:pPr>
+        <w:pStyle w:val="Grundtext"/>
+        <w:jc w:val="left"/>
+      </w:pPr>
+    </w:p>
+    <w:p>
+      <w:pPr>
+        <w:pStyle w:val="Grundtext"/>
+      </w:pPr>
+      <w:r>
+        <w:t xml:space="preserve">Das </w:t>
+      </w:r>
+      <w:r>
+        <w:t>Mit der 45° Ausrichtung ist mindestens ein Sichtfeld von 70</w:t>
+      </w:r>
+      <w:r>
+        <w:t>°</w:t>
+      </w:r>
+      <w:r>
+        <w:t xml:space="preserve"> x 45° notwendig</w:t>
+      </w:r>
+      <w:r>
+        <w:t>, wenn es Die Eckposition werden soll. Bei der 90° Ausrichtung wären es 84° x 51°. Für eine Von-Vorne-Sicht mit der Höhe 170 cm, wären es 75° x 51° bzw. 92° x 60°.</w:t>
+      </w:r>
+      <w:r>
+        <w:t xml:space="preserve"> Zusammengefasst lässt sich sagen das für die meisten und die relevanten Positionen ein Sichtfeld von rund 95° x 60° ausreicht. Bei </w:t>
+      </w:r>
+      <w:r>
+        <w:t xml:space="preserve">der Wahl einer </w:t>
+      </w:r>
+      <w:r>
+        <w:t xml:space="preserve">Kamera mit </w:t>
+      </w:r>
+      <w:r>
+        <w:t>kleineren</w:t>
+      </w:r>
+      <w:r>
+        <w:t xml:space="preserve"> Sichtfeld, sollten die wegfallenden Positionierungsmöglichkeiten </w:t>
+      </w:r>
+      <w:r>
+        <w:t>berücksichtigt</w:t>
+      </w:r>
+      <w:r>
+        <w:t xml:space="preserve"> werden.</w:t>
       </w:r>
     </w:p>
     <w:p>
@@ -7322,7 +9235,7 @@
       <w:r>
         <w:t xml:space="preserve"> der Arbeit</w:t>
       </w:r>
-      <w:bookmarkEnd w:id="23"/>
+      <w:bookmarkEnd w:id="24"/>
       <w:bookmarkEnd w:id="39"/>
     </w:p>
     <w:p>
@@ -11238,7 +13151,7 @@
                     </pic:cNvPicPr>
                   </pic:nvPicPr>
                   <pic:blipFill>
-                    <a:blip r:embed="rId22" cstate="print"/>
+                    <a:blip r:embed="rId29" cstate="print"/>
                     <a:srcRect/>
                     <a:stretch>
                       <a:fillRect/>
@@ -12517,7 +14430,7 @@
                     </pic:cNvPicPr>
                   </pic:nvPicPr>
                   <pic:blipFill>
-                    <a:blip r:embed="rId23" cstate="print"/>
+                    <a:blip r:embed="rId30" cstate="print"/>
                     <a:srcRect/>
                     <a:stretch>
                       <a:fillRect/>
@@ -13282,7 +15195,7 @@
         </w:rPr>
         <w:t xml:space="preserve">(aktuelle Fassung liegt i.d.R. auf </w:t>
       </w:r>
-      <w:hyperlink r:id="rId24" w:history="1">
+      <w:hyperlink r:id="rId31" w:history="1">
         <w:r>
           <w:rPr>
             <w:rStyle w:val="Hyperlink"/>
@@ -14710,7 +16623,7 @@
         </w:rPr>
         <w:t xml:space="preserve">– Online im Internet: </w:t>
       </w:r>
-      <w:hyperlink r:id="rId25" w:history="1">
+      <w:hyperlink r:id="rId32" w:history="1">
         <w:r>
           <w:rPr>
             <w:rStyle w:val="Hyperlink"/>
@@ -14760,7 +16673,7 @@
       <w:r>
         <w:t xml:space="preserve">nline im Internet: </w:t>
       </w:r>
-      <w:hyperlink r:id="rId26" w:history="1">
+      <w:hyperlink r:id="rId33" w:history="1">
         <w:r>
           <w:rPr>
             <w:rStyle w:val="Hyperlink"/>
@@ -14818,7 +16731,7 @@
         </w:rPr>
         <w:t xml:space="preserve">m Internet: </w:t>
       </w:r>
-      <w:hyperlink r:id="rId27" w:history="1">
+      <w:hyperlink r:id="rId34" w:history="1">
         <w:r>
           <w:rPr>
             <w:rStyle w:val="Hyperlink"/>
@@ -14894,7 +16807,7 @@
         </w:rPr>
         <w:t xml:space="preserve">: </w:t>
       </w:r>
-      <w:hyperlink r:id="rId28" w:history="1">
+      <w:hyperlink r:id="rId35" w:history="1">
         <w:r>
           <w:rPr>
             <w:rStyle w:val="Hyperlink"/>
@@ -14935,7 +16848,7 @@
         </w:rPr>
         <w:t xml:space="preserve"> - Online im Internet: </w:t>
       </w:r>
-      <w:hyperlink r:id="rId29" w:history="1">
+      <w:hyperlink r:id="rId36" w:history="1">
         <w:r>
           <w:rPr>
             <w:rStyle w:val="Hyperlink"/>
@@ -15024,8 +16937,8 @@
       </w:r>
     </w:p>
     <w:sectPr>
-      <w:headerReference w:type="default" r:id="rId30"/>
-      <w:headerReference w:type="first" r:id="rId31"/>
+      <w:headerReference w:type="default" r:id="rId37"/>
+      <w:headerReference w:type="first" r:id="rId38"/>
       <w:pgSz w:w="11906" w:h="16838" w:code="9"/>
       <w:pgMar w:top="1701" w:right="1701" w:bottom="1134" w:left="1701" w:header="720" w:footer="720" w:gutter="0"/>
       <w:pgNumType w:start="1"/>
@@ -15666,7 +17579,7 @@
           <w:color w:val="000000" w:themeColor="text1"/>
           <w:u w:val="none"/>
         </w:rPr>
-        <w:t>10</w:t>
+        <w:t>13</w:t>
       </w:r>
       <w:r>
         <w:rPr>
@@ -15859,7 +17772,7 @@
         <w:rFonts w:ascii="Times New Roman" w:eastAsia="Times New Roman" w:hAnsi="Times New Roman" w:cs="Times New Roman" w:hint="default"/>
       </w:rPr>
     </w:lvl>
-    <w:lvl w:ilvl="1" w:tplc="04070003" w:tentative="1">
+    <w:lvl w:ilvl="1" w:tplc="04070003">
       <w:start w:val="1"/>
       <w:numFmt w:val="bullet"/>
       <w:lvlText w:val="o"/>
@@ -18006,7 +19919,7 @@
   <w:style w:type="paragraph" w:default="1" w:styleId="Standard">
     <w:name w:val="Normal"/>
     <w:qFormat/>
-    <w:rsid w:val="009C10E7"/>
+    <w:rsid w:val="00D16BF9"/>
     <w:rPr>
       <w:sz w:val="24"/>
       <w:szCs w:val="24"/>
@@ -18806,6 +20719,21 @@
       <w:contextualSpacing/>
     </w:pPr>
   </w:style>
+  <w:style w:type="table" w:styleId="Tabellenraster">
+    <w:name w:val="Table Grid"/>
+    <w:basedOn w:val="NormaleTabelle"/>
+    <w:rsid w:val="00FB6A72"/>
+    <w:tblPr>
+      <w:tblBorders>
+        <w:top w:val="single" w:sz="4" w:space="0" w:color="auto"/>
+        <w:left w:val="single" w:sz="4" w:space="0" w:color="auto"/>
+        <w:bottom w:val="single" w:sz="4" w:space="0" w:color="auto"/>
+        <w:right w:val="single" w:sz="4" w:space="0" w:color="auto"/>
+        <w:insideH w:val="single" w:sz="4" w:space="0" w:color="auto"/>
+        <w:insideV w:val="single" w:sz="4" w:space="0" w:color="auto"/>
+      </w:tblBorders>
+    </w:tblPr>
+  </w:style>
 </w:styles>
 </file>
 

</xml_diff>

<commit_message>
schreiben über ähnliche projekte für componenten wahl
</commit_message>
<xml_diff>
--- a/Kamerabasierte Gestenerkennung zur Steuerung eines virtuellen Orchesters (Masterarbeit Wegener).docx
+++ b/Kamerabasierte Gestenerkennung zur Steuerung eines virtuellen Orchesters (Masterarbeit Wegener).docx
@@ -6296,7 +6296,13 @@
         <w:pStyle w:val="Grundtext"/>
       </w:pPr>
       <w:r>
-        <w:t>Das Kamerabild muss ausreichend Bildinformationen liefern, um eine Gestenerkennung anwenden zu können. Dieser Informationsgehalt hängt jedoch nicht nur von der Kamera an sich ab, sondern auch von ihrer Positionierung im Raum und den Lichtverhältnissen. Bei der Wahl der Kamera ist hierbei auf ein Minimum der Auflösung, der Lichtempfindlichkeit und der Bildwiederholungsrate (Framerate) zu achten, also auf ein Minimum an Bildqualität. Zu dem ist zu entscheiden um es eine 2D oder 3D-Kamera seien soll. Eine 3D-Kamera gibt neben den Farbwerten des 2D Pixelfeldes auch Tiefeninformation bestimmter Bildbereiche.</w:t>
+        <w:t xml:space="preserve">Das Kamerabild muss ausreichend Bildinformationen liefern, um eine Gestenerkennung anwenden zu können. Dieser Informationsgehalt hängt jedoch nicht nur von der Kamera an sich ab, sondern auch von ihrer Positionierung im Raum und den Lichtverhältnissen. Bei der Wahl der Kamera ist hierbei auf ein Minimum der Auflösung, der Lichtempfindlichkeit und der Bildwiederholungsrate (Framerate) zu achten, also auf ein Minimum an Bildqualität. </w:t>
+      </w:r>
+      <w:r>
+        <w:t>Zudem</w:t>
+      </w:r>
+      <w:r>
+        <w:t xml:space="preserve"> ist zu entscheiden um es eine 2D oder 3D-Kamera seien soll. Eine 3D-Kamera gibt neben den Farbwerten des 2D Pixelfeldes auch Tiefeninformation bestimmter Bildbereiche.</w:t>
       </w:r>
     </w:p>
     <w:p>
@@ -6380,7 +6386,13 @@
         </w:numPr>
       </w:pPr>
       <w:r>
-        <w:t>Standzone: Bereich, am Boden, auf dem der Dirigent stehen können soll, um erkannt zu werden.</w:t>
+        <w:t xml:space="preserve">Standzone: Bereich, am Boden, auf dem der Dirigent stehen </w:t>
+      </w:r>
+      <w:r>
+        <w:t>darf</w:t>
+      </w:r>
+      <w:r>
+        <w:t>, um erkannt zu werden.</w:t>
       </w:r>
     </w:p>
     <w:p>
@@ -6392,7 +6404,13 @@
         </w:numPr>
       </w:pPr>
       <w:r>
-        <w:t>Armradius: Bereich, welchen die Arme des Dirigenten in Anspruch nehmen wenn er „dirigiert“ – mit Gesten steuert.</w:t>
+        <w:t xml:space="preserve">Armradius: Bereich, welchen die Arme des Dirigenten in Anspruch </w:t>
+      </w:r>
+      <w:r>
+        <w:t>nehmen,</w:t>
+      </w:r>
+      <w:r>
+        <w:t xml:space="preserve"> wenn er „dirigiert“ – mit Gesten steuert.</w:t>
       </w:r>
     </w:p>
     <w:p>
@@ -6668,14 +6686,27 @@
       <w:r>
         <w:t xml:space="preserve">Figure </w:t>
       </w:r>
-      <w:fldSimple w:instr=" SEQ Figure \* ARABIC ">
-        <w:r>
-          <w:rPr>
-            <w:noProof/>
-          </w:rPr>
-          <w:t>1</w:t>
-        </w:r>
-      </w:fldSimple>
+      <w:r>
+        <w:fldChar w:fldCharType="begin"/>
+      </w:r>
+      <w:r>
+        <w:instrText xml:space="preserve"> SEQ Figure \* ARABIC </w:instrText>
+      </w:r>
+      <w:r>
+        <w:fldChar w:fldCharType="separate"/>
+      </w:r>
+      <w:r>
+        <w:rPr>
+          <w:noProof/>
+        </w:rPr>
+        <w:t>1</w:t>
+      </w:r>
+      <w:r>
+        <w:rPr>
+          <w:noProof/>
+        </w:rPr>
+        <w:fldChar w:fldCharType="end"/>
+      </w:r>
       <w:r>
         <w:t xml:space="preserve"> – Modell Audiosystem leer und mir 1.80m Mensch</w:t>
       </w:r>
@@ -6813,14 +6844,27 @@
       <w:r>
         <w:t xml:space="preserve">Figure </w:t>
       </w:r>
-      <w:fldSimple w:instr=" SEQ Figure \* ARABIC ">
-        <w:r>
-          <w:rPr>
-            <w:noProof/>
-          </w:rPr>
-          <w:t>2</w:t>
-        </w:r>
-      </w:fldSimple>
+      <w:r>
+        <w:fldChar w:fldCharType="begin"/>
+      </w:r>
+      <w:r>
+        <w:instrText xml:space="preserve"> SEQ Figure \* ARABIC </w:instrText>
+      </w:r>
+      <w:r>
+        <w:fldChar w:fldCharType="separate"/>
+      </w:r>
+      <w:r>
+        <w:rPr>
+          <w:noProof/>
+        </w:rPr>
+        <w:t>2</w:t>
+      </w:r>
+      <w:r>
+        <w:rPr>
+          <w:noProof/>
+        </w:rPr>
+        <w:fldChar w:fldCharType="end"/>
+      </w:r>
       <w:r>
         <w:t xml:space="preserve"> </w:t>
       </w:r>
@@ -6989,31 +7033,7 @@
         <w:pStyle w:val="Grundtext"/>
       </w:pPr>
       <w:r>
-        <w:t>Die untere Körpergrenze soll ein 140 cm großer Mensch repräsentieren</w:t>
-      </w:r>
-      <w:r>
-        <w:t>. Es wird willkürlich davon ausgegangen das noch kleinere Personen nicht mit diesem System interagieren werden.</w:t>
-      </w:r>
-      <w:r>
-        <w:t xml:space="preserve"> </w:t>
-      </w:r>
-      <w:r>
-        <w:t xml:space="preserve">Die </w:t>
-      </w:r>
-      <w:r>
-        <w:t>entsprechende</w:t>
-      </w:r>
-      <w:r>
-        <w:t>n</w:t>
-      </w:r>
-      <w:r>
-        <w:t xml:space="preserve"> Körpermaße werden linear abgeleitet, dass soll in seiner Genauigkeit für </w:t>
-      </w:r>
-      <w:r>
-        <w:t>das Modell mit seiner</w:t>
-      </w:r>
-      <w:r>
-        <w:t xml:space="preserve"> Simulation genügen.</w:t>
+        <w:t>Die untere Körpergrenze soll ein 140 cm großer Mensch repräsentieren. Es wird willkürlich davon ausgegangen das noch kleinere Personen nicht mit diesem System interagieren werden. Die entsprechenden Körpermaße werden linear abgeleitet, dass soll in seiner Genauigkeit für das Modell mit seiner Simulation genügen.</w:t>
       </w:r>
     </w:p>
     <w:p>
@@ -7436,14 +7456,27 @@
       <w:r>
         <w:t xml:space="preserve">Figure </w:t>
       </w:r>
-      <w:fldSimple w:instr=" SEQ Figure \* ARABIC ">
-        <w:r>
-          <w:rPr>
-            <w:noProof/>
-          </w:rPr>
-          <w:t>3</w:t>
-        </w:r>
-      </w:fldSimple>
+      <w:r>
+        <w:fldChar w:fldCharType="begin"/>
+      </w:r>
+      <w:r>
+        <w:instrText xml:space="preserve"> SEQ Figure \* ARABIC </w:instrText>
+      </w:r>
+      <w:r>
+        <w:fldChar w:fldCharType="separate"/>
+      </w:r>
+      <w:r>
+        <w:rPr>
+          <w:noProof/>
+        </w:rPr>
+        <w:t>3</w:t>
+      </w:r>
+      <w:r>
+        <w:rPr>
+          <w:noProof/>
+        </w:rPr>
+        <w:fldChar w:fldCharType="end"/>
+      </w:r>
       <w:r>
         <w:t xml:space="preserve"> - Modell Audiosystem Armbereich</w:t>
       </w:r>
@@ -7903,22 +7936,29 @@
       <w:r>
         <w:t xml:space="preserve">Figure </w:t>
       </w:r>
-      <w:fldSimple w:instr=" SEQ Figure \* ARABIC ">
-        <w:r>
-          <w:rPr>
-            <w:noProof/>
-          </w:rPr>
-          <w:t>5</w:t>
-        </w:r>
-      </w:fldSimple>
-      <w:r>
-        <w:t xml:space="preserve"> - </w:t>
-      </w:r>
-      <w:r>
-        <w:t>Modell Audiosystem</w:t>
-      </w:r>
-      <w:r>
-        <w:t xml:space="preserve"> Kollisionsbereiche der Ausrichtungen</w:t>
+      <w:r>
+        <w:fldChar w:fldCharType="begin"/>
+      </w:r>
+      <w:r>
+        <w:instrText xml:space="preserve"> SEQ Figure \* ARABIC </w:instrText>
+      </w:r>
+      <w:r>
+        <w:fldChar w:fldCharType="separate"/>
+      </w:r>
+      <w:r>
+        <w:rPr>
+          <w:noProof/>
+        </w:rPr>
+        <w:t>5</w:t>
+      </w:r>
+      <w:r>
+        <w:rPr>
+          <w:noProof/>
+        </w:rPr>
+        <w:fldChar w:fldCharType="end"/>
+      </w:r>
+      <w:r>
+        <w:t xml:space="preserve"> - Modell Audiosystem Kollisionsbereiche der Ausrichtungen</w:t>
       </w:r>
     </w:p>
     <w:p>
@@ -7929,13 +7969,7 @@
         <w:t>Innerhalb der zwei Ausrichtungen werden je fünf verschiedene Kamerapositionen simulativ getestet.</w:t>
       </w:r>
       <w:r>
-        <w:t xml:space="preserve"> Bezugspunkt der Positionierung ist die </w:t>
-      </w:r>
-      <w:r>
-        <w:t>jeweil</w:t>
-      </w:r>
-      <w:r>
-        <w:t xml:space="preserve">ige Gerüstecke oben </w:t>
+        <w:t xml:space="preserve"> Bezugspunkt der Positionierung ist die jeweilige Gerüstecke oben </w:t>
       </w:r>
       <w:r>
         <w:lastRenderedPageBreak/>
@@ -8030,14 +8064,27 @@
       <w:r>
         <w:t xml:space="preserve">Figure </w:t>
       </w:r>
-      <w:fldSimple w:instr=" SEQ Figure \* ARABIC ">
-        <w:r>
-          <w:rPr>
-            <w:noProof/>
-          </w:rPr>
-          <w:t>6</w:t>
-        </w:r>
-      </w:fldSimple>
+      <w:r>
+        <w:fldChar w:fldCharType="begin"/>
+      </w:r>
+      <w:r>
+        <w:instrText xml:space="preserve"> SEQ Figure \* ARABIC </w:instrText>
+      </w:r>
+      <w:r>
+        <w:fldChar w:fldCharType="separate"/>
+      </w:r>
+      <w:r>
+        <w:rPr>
+          <w:noProof/>
+        </w:rPr>
+        <w:t>6</w:t>
+      </w:r>
+      <w:r>
+        <w:rPr>
+          <w:noProof/>
+        </w:rPr>
+        <w:fldChar w:fldCharType="end"/>
+      </w:r>
       <w:r>
         <w:t xml:space="preserve"> - Modell Audiosystem Schnittansicht der Kamera Positionen Ausrichtung </w:t>
       </w:r>
@@ -8116,14 +8163,27 @@
       <w:r>
         <w:t xml:space="preserve">Figure </w:t>
       </w:r>
-      <w:fldSimple w:instr=" SEQ Figure \* ARABIC ">
-        <w:r>
-          <w:rPr>
-            <w:noProof/>
-          </w:rPr>
-          <w:t>7</w:t>
-        </w:r>
-      </w:fldSimple>
+      <w:r>
+        <w:fldChar w:fldCharType="begin"/>
+      </w:r>
+      <w:r>
+        <w:instrText xml:space="preserve"> SEQ Figure \* ARABIC </w:instrText>
+      </w:r>
+      <w:r>
+        <w:fldChar w:fldCharType="separate"/>
+      </w:r>
+      <w:r>
+        <w:rPr>
+          <w:noProof/>
+        </w:rPr>
+        <w:t>7</w:t>
+      </w:r>
+      <w:r>
+        <w:rPr>
+          <w:noProof/>
+        </w:rPr>
+        <w:fldChar w:fldCharType="end"/>
+      </w:r>
       <w:r>
         <w:t xml:space="preserve"> - Modell Audiosystem Schnittansicht der Kamera Positionen</w:t>
       </w:r>
@@ -8208,10 +8268,7 @@
     </w:p>
     <w:p>
       <w:r>
-        <w:t>45°</w:t>
-      </w:r>
-      <w:r>
-        <w:t xml:space="preserve"> Ausrichtung, Standzone 160 x 100 cm</w:t>
+        <w:t>45° Ausrichtung, Standzone 160 x 100 cm</w:t>
       </w:r>
     </w:p>
     <w:tbl>
@@ -8628,10 +8685,7 @@
           </w:tcPr>
           <w:p>
             <w:r>
-              <w:t>2</w:t>
-            </w:r>
-            <w:r>
-              <w:t>00</w:t>
+              <w:t>200</w:t>
             </w:r>
           </w:p>
         </w:tc>
@@ -8683,10 +8737,7 @@
           </w:tcPr>
           <w:p>
             <w:r>
-              <w:t>2</w:t>
-            </w:r>
-            <w:r>
-              <w:t>00</w:t>
+              <w:t>200</w:t>
             </w:r>
           </w:p>
         </w:tc>
@@ -8738,10 +8789,7 @@
           </w:tcPr>
           <w:p>
             <w:r>
-              <w:t>2</w:t>
-            </w:r>
-            <w:r>
-              <w:t>00</w:t>
+              <w:t>200</w:t>
             </w:r>
           </w:p>
         </w:tc>
@@ -8751,10 +8799,7 @@
           </w:tcPr>
           <w:p>
             <w:r>
-              <w:t>2</w:t>
-            </w:r>
-            <w:r>
-              <w:t>7</w:t>
+              <w:t>27</w:t>
             </w:r>
           </w:p>
         </w:tc>
@@ -8848,10 +8893,7 @@
           </w:tcPr>
           <w:p>
             <w:r>
-              <w:t>1</w:t>
-            </w:r>
-            <w:r>
-              <w:t>00</w:t>
+              <w:t>100</w:t>
             </w:r>
           </w:p>
         </w:tc>
@@ -8871,10 +8913,7 @@
           </w:tcPr>
           <w:p>
             <w:r>
-              <w:t>1</w:t>
-            </w:r>
-            <w:r>
-              <w:t>27</w:t>
+              <w:t>127</w:t>
             </w:r>
           </w:p>
         </w:tc>
@@ -8894,13 +8933,7 @@
     <w:p>
       <w:r>
         <w:lastRenderedPageBreak/>
-        <w:t xml:space="preserve">45° Ausrichtung, Standzone </w:t>
-      </w:r>
-      <w:r>
-        <w:t>25</w:t>
-      </w:r>
-      <w:r>
-        <w:t>0 x 100 cm</w:t>
+        <w:t>45° Ausrichtung, Standzone 250 x 100 cm</w:t>
       </w:r>
     </w:p>
     <w:tbl>
@@ -8975,10 +9008,7 @@
           </w:tcPr>
           <w:p>
             <w:r>
-              <w:t>2</w:t>
-            </w:r>
-            <w:r>
-              <w:t>70</w:t>
+              <w:t>270</w:t>
             </w:r>
           </w:p>
         </w:tc>
@@ -8998,10 +9028,7 @@
           </w:tcPr>
           <w:p>
             <w:r>
-              <w:t>2</w:t>
-            </w:r>
-            <w:r>
-              <w:t>3</w:t>
+              <w:t>23</w:t>
             </w:r>
           </w:p>
         </w:tc>
@@ -9038,76 +9065,1221 @@
         <w:pStyle w:val="Grundtext"/>
       </w:pPr>
       <w:r>
+        <w:t>Mit der 45° Ausrichtung ist mindestens ein Sichtfeld von 70</w:t>
+      </w:r>
+      <w:r>
+        <w:t>°</w:t>
+      </w:r>
+      <w:r>
+        <w:t xml:space="preserve"> x 45° notwendig</w:t>
+      </w:r>
+      <w:r>
+        <w:t>, wenn es Die Eckposition werden soll. Bei der 90° Ausrichtung wären es 84° x 51°. Für eine Von-Vorne-Sicht mit der Höhe 170 cm, wären es 75° x 51° bzw. 92° x 60°.</w:t>
+      </w:r>
+      <w:r>
+        <w:t xml:space="preserve"> Zusammengefasst lässt sich sagen das für die meisten und die relevanten Positionen ein Sichtfeld von rund 95° x 60° ausreicht. Bei </w:t>
+      </w:r>
+      <w:r>
+        <w:t xml:space="preserve">der Wahl einer </w:t>
+      </w:r>
+      <w:r>
+        <w:t xml:space="preserve">Kamera mit kleineren Sichtfeld, sollten die wegfallenden Positionierungsmöglichkeiten </w:t>
+      </w:r>
+      <w:r>
+        <w:t>berücksichtigt</w:t>
+      </w:r>
+      <w:r>
+        <w:t xml:space="preserve"> werden.</w:t>
+      </w:r>
+      <w:r>
+        <w:t xml:space="preserve"> Alternative könnte ließe sich die Standzone verkleinern (beeinflusst besonders das hFOV) oder die berücksichtigte Personengröße reduzieren </w:t>
+      </w:r>
+      <w:r>
+        <w:t xml:space="preserve">(beeinflusst besonders das </w:t>
+      </w:r>
+      <w:r>
+        <w:t>v</w:t>
+      </w:r>
+      <w:r>
+        <w:t>FOV)</w:t>
+      </w:r>
+      <w:r>
+        <w:t xml:space="preserve">. </w:t>
+      </w:r>
+    </w:p>
+    <w:p>
+      <w:pPr>
+        <w:pStyle w:val="berschrift3"/>
+      </w:pPr>
+      <w:bookmarkStart w:id="35" w:name="_Toc228557175"/>
+      <w:r>
+        <w:t xml:space="preserve">Projektanforderungen </w:t>
+      </w:r>
+      <w:r>
+        <w:t>an die Recheneinheit</w:t>
+      </w:r>
+      <w:bookmarkEnd w:id="35"/>
+    </w:p>
+    <w:p>
+      <w:pPr>
+        <w:pStyle w:val="Grundtext"/>
+        <w:numPr>
+          <w:ilvl w:val="0"/>
+          <w:numId w:val="31"/>
+        </w:numPr>
+      </w:pPr>
+      <w:r>
+        <w:t xml:space="preserve">Preis im </w:t>
+      </w:r>
+      <w:r>
+        <w:t>Projektbudget</w:t>
+      </w:r>
+    </w:p>
+    <w:p>
+      <w:pPr>
+        <w:pStyle w:val="Grundtext"/>
+        <w:numPr>
+          <w:ilvl w:val="0"/>
+          <w:numId w:val="31"/>
+        </w:numPr>
+      </w:pPr>
+      <w:r>
+        <w:t>Positionierung, idealerweise Befestigung am Gerüst möglich</w:t>
+      </w:r>
+    </w:p>
+    <w:p>
+      <w:pPr>
+        <w:pStyle w:val="Grundtext"/>
+        <w:numPr>
+          <w:ilvl w:val="0"/>
+          <w:numId w:val="31"/>
+        </w:numPr>
+      </w:pPr>
+      <w:r>
+        <w:t>Schnittstelle für eine Kamera</w:t>
+      </w:r>
+    </w:p>
+    <w:p>
+      <w:pPr>
+        <w:pStyle w:val="Grundtext"/>
+        <w:numPr>
+          <w:ilvl w:val="0"/>
+          <w:numId w:val="31"/>
+        </w:numPr>
+      </w:pPr>
+      <w:r>
+        <w:t xml:space="preserve">Bildschim Anschluss für grafisches User-Feedback </w:t>
+      </w:r>
+    </w:p>
+    <w:p>
+      <w:pPr>
+        <w:pStyle w:val="Grundtext"/>
+        <w:numPr>
+          <w:ilvl w:val="0"/>
+          <w:numId w:val="31"/>
+        </w:numPr>
+      </w:pPr>
+      <w:r>
+        <w:t>Netzwerkfeig</w:t>
+      </w:r>
+    </w:p>
+    <w:p>
+      <w:pPr>
+        <w:pStyle w:val="Grundtext"/>
+        <w:numPr>
+          <w:ilvl w:val="0"/>
+          <w:numId w:val="31"/>
+        </w:numPr>
+      </w:pPr>
+      <w:r>
+        <w:t xml:space="preserve">Echtzeitfeig   </w:t>
+      </w:r>
+    </w:p>
+    <w:p>
+      <w:pPr>
+        <w:pStyle w:val="berschrift3"/>
+      </w:pPr>
+      <w:bookmarkStart w:id="36" w:name="_Toc228557176"/>
+      <w:r>
+        <w:t xml:space="preserve">Projektanforderungen </w:t>
+      </w:r>
+      <w:r>
+        <w:t>an die Programmumgebung</w:t>
+      </w:r>
+      <w:bookmarkEnd w:id="36"/>
+      <w:r>
+        <w:t xml:space="preserve"> </w:t>
+      </w:r>
+    </w:p>
+    <w:p>
+      <w:pPr>
+        <w:pStyle w:val="Grundtext"/>
+        <w:numPr>
+          <w:ilvl w:val="0"/>
+          <w:numId w:val="31"/>
+        </w:numPr>
+      </w:pPr>
+      <w:r>
+        <w:t>Preis im Projektbudget, idealerweise kostenfrei</w:t>
+      </w:r>
+    </w:p>
+    <w:p>
+      <w:pPr>
+        <w:pStyle w:val="Grundtext"/>
+        <w:numPr>
+          <w:ilvl w:val="0"/>
+          <w:numId w:val="31"/>
+        </w:numPr>
+      </w:pPr>
+      <w:r>
+        <w:t>Unterstützt Video-/Bildverarbeitung</w:t>
+      </w:r>
+    </w:p>
+    <w:p>
+      <w:pPr>
+        <w:pStyle w:val="Grundtext"/>
+        <w:numPr>
+          <w:ilvl w:val="0"/>
+          <w:numId w:val="31"/>
+        </w:numPr>
+      </w:pPr>
+      <w:r>
+        <w:t>Echtzeitfeig</w:t>
+      </w:r>
+    </w:p>
+    <w:p>
+      <w:pPr>
+        <w:pStyle w:val="Grundtext"/>
+        <w:numPr>
+          <w:ilvl w:val="0"/>
+          <w:numId w:val="31"/>
+        </w:numPr>
+      </w:pPr>
+      <w:r>
+        <w:t xml:space="preserve">Möglichst mehrere Anbindungen an, </w:t>
+      </w:r>
+      <w:r>
+        <w:t>passende</w:t>
+      </w:r>
+      <w:r>
+        <w:t xml:space="preserve"> fertige Bildverarbeitungs- bzw. Gestenerkennungsverfahren </w:t>
+      </w:r>
+    </w:p>
+    <w:p>
+      <w:pPr>
+        <w:pStyle w:val="Grundtext"/>
+        <w:numPr>
+          <w:ilvl w:val="0"/>
+          <w:numId w:val="31"/>
+        </w:numPr>
+      </w:pPr>
+      <w:r>
+        <w:t>Möglichst gut dokumentiert durch ähnliche Gestenerkennungsprojekte.</w:t>
+      </w:r>
+    </w:p>
+    <w:p>
+      <w:pPr>
+        <w:pStyle w:val="berschrift2"/>
+      </w:pPr>
+      <w:bookmarkStart w:id="37" w:name="_Toc228557177"/>
+      <w:r>
+        <w:lastRenderedPageBreak/>
+        <w:t>Wahl</w:t>
+      </w:r>
+      <w:r>
+        <w:t xml:space="preserve"> und Kombinationen</w:t>
+      </w:r>
+      <w:r>
+        <w:t xml:space="preserve"> aus ähnlichen Projekten </w:t>
+      </w:r>
+    </w:p>
+    <w:p>
+      <w:r>
+        <w:rPr>
+          <w:lang w:val="en-US"/>
+        </w:rPr>
+        <w:t xml:space="preserve">Das Projekt </w:t>
+      </w:r>
+      <w:r>
+        <w:rPr>
+          <w:lang w:val="en-US"/>
+        </w:rPr>
+        <w:t>“</w:t>
+      </w:r>
+      <w:r>
+        <w:rPr>
+          <w:lang w:val="en-US"/>
+        </w:rPr>
+        <w:t>Gesture Controlled Robotic Arm Using Kinect (Simulink Support For Kinect) and Arduino</w:t>
+      </w:r>
+      <w:r>
+        <w:rPr>
+          <w:lang w:val="en-US"/>
+        </w:rPr>
+        <w:t>” [</w:t>
+      </w:r>
+      <w:hyperlink w:anchor="Baranitharan_2026" w:history="1">
+        <w:r>
+          <w:rPr>
+            <w:rStyle w:val="Hyperlink"/>
+            <w:lang w:val="en-US"/>
+          </w:rPr>
+          <w:t>Baranitharan_2026</w:t>
+        </w:r>
+      </w:hyperlink>
+      <w:r>
+        <w:rPr>
+          <w:lang w:val="en-US"/>
+        </w:rPr>
+        <w:t xml:space="preserve">] lasst sich auf der MATLAB community Webseite finden. </w:t>
+      </w:r>
+      <w:r>
+        <w:t>In diesem Projekt</w:t>
+      </w:r>
+      <w:r>
+        <w:t xml:space="preserve"> </w:t>
+      </w:r>
+      <w:r>
+        <w:t>werden</w:t>
+      </w:r>
+      <w:r>
+        <w:t xml:space="preserve"> </w:t>
+      </w:r>
+      <w:r>
+        <w:t xml:space="preserve">an verschiedenes Gelangen </w:t>
+      </w:r>
+      <w:r>
+        <w:t>des menschlichen Arms, die Winkel b</w:t>
+      </w:r>
+      <w:r>
+        <w:t>ildlich erfasst und ausgewertet</w:t>
+      </w:r>
+      <w:r>
+        <w:t>.</w:t>
+      </w:r>
+      <w:r>
+        <w:t xml:space="preserve"> </w:t>
+      </w:r>
+      <w:r>
+        <w:t>Das kommt der hier geplanten Gestensteuerung sehr nahe. Es wird die Kombination aus</w:t>
+      </w:r>
+      <w:r>
+        <w:t>:</w:t>
+      </w:r>
+      <w:r>
+        <w:t xml:space="preserve"> </w:t>
+      </w:r>
+    </w:p>
+    <w:p/>
+    <w:p>
+      <w:pPr>
+        <w:pStyle w:val="Listenabsatz"/>
+        <w:numPr>
+          <w:ilvl w:val="0"/>
+          <w:numId w:val="35"/>
+        </w:numPr>
+      </w:pPr>
+      <w:r>
+        <w:t xml:space="preserve"> </w:t>
+      </w:r>
+      <w:r>
+        <w:tab/>
+        <w:t xml:space="preserve">- </w:t>
+      </w:r>
+      <w:r>
+        <w:t>Microsoft Kinect</w:t>
+      </w:r>
+      <w:r>
+        <w:t xml:space="preserve"> V1</w:t>
+      </w:r>
+      <w:r>
+        <w:t xml:space="preserve"> – als Kamera</w:t>
+      </w:r>
+      <w:r>
+        <w:t>, horizontal und stationär</w:t>
+      </w:r>
+      <w:r>
+        <w:t xml:space="preserve"> </w:t>
+      </w:r>
+    </w:p>
+    <w:p>
+      <w:r>
+        <w:t xml:space="preserve"> </w:t>
+      </w:r>
+      <w:r>
+        <w:tab/>
+      </w:r>
+      <w:r>
+        <w:t xml:space="preserve">- </w:t>
+      </w:r>
+      <w:r>
+        <w:t xml:space="preserve">MATLAB Simulink </w:t>
+      </w:r>
+      <w:r>
+        <w:t xml:space="preserve">– </w:t>
+      </w:r>
+      <w:r>
+        <w:t>für die Gestenerkennung</w:t>
+      </w:r>
+      <w:r>
+        <w:t xml:space="preserve"> </w:t>
+      </w:r>
+      <w:r>
+        <w:t xml:space="preserve"> </w:t>
+      </w:r>
+    </w:p>
+    <w:p>
+      <w:pPr>
+        <w:ind w:firstLine="708"/>
+      </w:pPr>
+      <w:r>
+        <w:t xml:space="preserve">- </w:t>
+      </w:r>
+      <w:r>
+        <w:t>Windows</w:t>
+      </w:r>
+      <w:r>
+        <w:t xml:space="preserve"> 7</w:t>
+      </w:r>
+      <w:r>
+        <w:t xml:space="preserve"> Notebook</w:t>
+      </w:r>
+    </w:p>
+    <w:p>
+      <w:pPr>
+        <w:ind w:firstLine="708"/>
+      </w:pPr>
+      <w:r>
+        <w:t>- Arduino</w:t>
+      </w:r>
+      <w:r>
+        <w:t xml:space="preserve"> – für die Robotersteuerung</w:t>
+      </w:r>
+    </w:p>
+    <w:p>
+      <w:pPr>
+        <w:ind w:firstLine="708"/>
+      </w:pPr>
+    </w:p>
+    <w:p>
+      <w:r>
+        <w:rPr>
+          <w:lang w:val="en-US"/>
+        </w:rPr>
+        <w:t xml:space="preserve">genutzt. </w:t>
+      </w:r>
+      <w:r>
+        <w:t xml:space="preserve">Der Arduino, steuert einen Roboterarm, das ist </w:t>
+      </w:r>
+      <w:r>
+        <w:t>für</w:t>
+      </w:r>
+      <w:r>
+        <w:t xml:space="preserve"> diese</w:t>
+      </w:r>
+      <w:r>
+        <w:t xml:space="preserve"> Masterarbeit </w:t>
+      </w:r>
+      <w:r>
+        <w:t xml:space="preserve">uninteressant. </w:t>
+      </w:r>
+      <w:r>
+        <w:t xml:space="preserve">Es wird beschrieben, dass die </w:t>
+      </w:r>
+      <w:hyperlink r:id="rId29" w:history="1">
+        <w:r>
+          <w:rPr>
+            <w:rStyle w:val="Hyperlink"/>
+          </w:rPr>
+          <w:t>Asus Xtion Pro Tiefenkamera</w:t>
+        </w:r>
+      </w:hyperlink>
+      <w:r>
+        <w:t xml:space="preserve"> ebenfalls mit den verwendeten Simulink Paketen kompatibel ist. </w:t>
+      </w:r>
+      <w:r>
+        <w:t xml:space="preserve">Das Projekt ist dokumentiert und Open Sause. </w:t>
+      </w:r>
+    </w:p>
+    <w:p/>
+    <w:p>
+      <w:r>
+        <w:t xml:space="preserve">Der </w:t>
+      </w:r>
+      <w:r>
+        <w:t>Kinect</w:t>
+      </w:r>
+      <w:r>
+        <w:t xml:space="preserve"> </w:t>
+      </w:r>
+      <w:r>
+        <w:t>Sensor</w:t>
+      </w:r>
+      <w:r>
+        <w:t xml:space="preserve"> </w:t>
+      </w:r>
+      <w:r>
+        <w:t xml:space="preserve">und der Asus Xtion Pro </w:t>
+      </w:r>
+      <w:r>
+        <w:t>Sensor</w:t>
+      </w:r>
+      <w:r>
+        <w:t xml:space="preserve"> </w:t>
+      </w:r>
+      <w:r>
+        <w:t>sind</w:t>
+      </w:r>
+      <w:r>
+        <w:t xml:space="preserve"> eine 3D</w:t>
+      </w:r>
+      <w:r>
+        <w:t>-</w:t>
+      </w:r>
+      <w:r>
+        <w:t>Kamera</w:t>
+      </w:r>
+      <w:r>
+        <w:t xml:space="preserve">. Die Kinect gibt es </w:t>
+      </w:r>
+      <w:r>
+        <w:t>in zwei Versionen</w:t>
+      </w:r>
+      <w:r>
+        <w:t>.</w:t>
+      </w:r>
+      <w:r>
+        <w:t xml:space="preserve"> Die technischen Daten </w:t>
+      </w:r>
+      <w:r>
+        <w:t xml:space="preserve">der Sensoren </w:t>
+      </w:r>
+      <w:r>
+        <w:t>sind wie folgt:</w:t>
+      </w:r>
+    </w:p>
+    <w:p/>
+    <w:tbl>
+      <w:tblPr>
+        <w:tblStyle w:val="Tabellenraster"/>
+        <w:tblW w:w="0" w:type="auto"/>
+        <w:tblLook w:val="04A0" w:firstRow="1" w:lastRow="0" w:firstColumn="1" w:lastColumn="0" w:noHBand="0" w:noVBand="1"/>
+      </w:tblPr>
+      <w:tblGrid>
+        <w:gridCol w:w="2405"/>
+        <w:gridCol w:w="2268"/>
+        <w:gridCol w:w="1843"/>
+        <w:gridCol w:w="1978"/>
+      </w:tblGrid>
+      <w:tr>
+        <w:tc>
+          <w:tcPr>
+            <w:tcW w:w="2405" w:type="dxa"/>
+          </w:tcPr>
+          <w:p>
+            <w:r>
+              <w:t>Modell</w:t>
+            </w:r>
+          </w:p>
+        </w:tc>
+        <w:tc>
+          <w:tcPr>
+            <w:tcW w:w="2268" w:type="dxa"/>
+          </w:tcPr>
+          <w:p>
+            <w:r>
+              <w:t>Kinect V1</w:t>
+            </w:r>
+          </w:p>
+        </w:tc>
+        <w:tc>
+          <w:tcPr>
+            <w:tcW w:w="1843" w:type="dxa"/>
+          </w:tcPr>
+          <w:p>
+            <w:r>
+              <w:t>Kinect V2</w:t>
+            </w:r>
+          </w:p>
+        </w:tc>
+        <w:tc>
+          <w:tcPr>
+            <w:tcW w:w="1978" w:type="dxa"/>
+          </w:tcPr>
+          <w:p>
+            <w:r>
+              <w:t>Asus Xtion Pro</w:t>
+            </w:r>
+          </w:p>
+        </w:tc>
+      </w:tr>
+      <w:tr>
+        <w:tc>
+          <w:tcPr>
+            <w:tcW w:w="2405" w:type="dxa"/>
+          </w:tcPr>
+          <w:p>
+            <w:r>
+              <w:t>Farbbildauflösung [Pixel]</w:t>
+            </w:r>
+          </w:p>
+        </w:tc>
+        <w:tc>
+          <w:tcPr>
+            <w:tcW w:w="2268" w:type="dxa"/>
+          </w:tcPr>
+          <w:p>
+            <w:r>
+              <w:t>640 x 480 (VGA)</w:t>
+            </w:r>
+          </w:p>
+        </w:tc>
+        <w:tc>
+          <w:tcPr>
+            <w:tcW w:w="1843" w:type="dxa"/>
+          </w:tcPr>
+          <w:p>
+            <w:r>
+              <w:t>1920 x 1080 (</w:t>
+            </w:r>
+            <w:r>
+              <w:t>Full HD</w:t>
+            </w:r>
+            <w:r>
+              <w:t>)</w:t>
+            </w:r>
+          </w:p>
+        </w:tc>
+        <w:tc>
+          <w:tcPr>
+            <w:tcW w:w="1978" w:type="dxa"/>
+          </w:tcPr>
+          <w:p>
+            <w:r>
+              <w:t>1280 x 1024 (SXGA)</w:t>
+            </w:r>
+          </w:p>
+        </w:tc>
+      </w:tr>
+      <w:tr>
+        <w:tc>
+          <w:tcPr>
+            <w:tcW w:w="2405" w:type="dxa"/>
+          </w:tcPr>
+          <w:p>
+            <w:r>
+              <w:t>Tiefenbildauflösung [Pixel]</w:t>
+            </w:r>
+          </w:p>
+        </w:tc>
+        <w:tc>
+          <w:tcPr>
+            <w:tcW w:w="2268" w:type="dxa"/>
+          </w:tcPr>
+          <w:p>
+            <w:r>
+              <w:t>320 x 240 (QVGA)</w:t>
+            </w:r>
+          </w:p>
+        </w:tc>
+        <w:tc>
+          <w:tcPr>
+            <w:tcW w:w="1843" w:type="dxa"/>
+          </w:tcPr>
+          <w:p>
+            <w:r>
+              <w:t>512 x 424</w:t>
+            </w:r>
+          </w:p>
+        </w:tc>
+        <w:tc>
+          <w:tcPr>
+            <w:tcW w:w="1978" w:type="dxa"/>
+          </w:tcPr>
+          <w:p>
+            <w:pPr>
+              <w:rPr>
+                <w:lang w:val="en-US"/>
+              </w:rPr>
+            </w:pPr>
+            <w:r>
+              <w:rPr>
+                <w:lang w:val="en-US"/>
+              </w:rPr>
+              <w:t>640x480</w:t>
+            </w:r>
+            <w:r>
+              <w:rPr>
+                <w:lang w:val="en-US"/>
+              </w:rPr>
+              <w:t xml:space="preserve"> </w:t>
+            </w:r>
+            <w:r>
+              <w:rPr>
+                <w:lang w:val="en-US"/>
+              </w:rPr>
+              <w:t>(</w:t>
+            </w:r>
+            <w:r>
+              <w:rPr>
+                <w:lang w:val="en-US"/>
+              </w:rPr>
+              <w:t>VGA</w:t>
+            </w:r>
+            <w:r>
+              <w:rPr>
+                <w:lang w:val="en-US"/>
+              </w:rPr>
+              <w:t xml:space="preserve">), </w:t>
+            </w:r>
+            <w:r>
+              <w:rPr>
+                <w:lang w:val="en-US"/>
+              </w:rPr>
+              <w:t>320x240</w:t>
+            </w:r>
+            <w:r>
+              <w:rPr>
+                <w:lang w:val="en-US"/>
+              </w:rPr>
+              <w:t xml:space="preserve"> (</w:t>
+            </w:r>
+            <w:r>
+              <w:rPr>
+                <w:lang w:val="en-US"/>
+              </w:rPr>
+              <w:t>QVGA</w:t>
+            </w:r>
+            <w:r>
+              <w:rPr>
+                <w:lang w:val="en-US"/>
+              </w:rPr>
+              <w:t>)</w:t>
+            </w:r>
+          </w:p>
+        </w:tc>
+      </w:tr>
+      <w:tr>
+        <w:tc>
+          <w:tcPr>
+            <w:tcW w:w="2405" w:type="dxa"/>
+          </w:tcPr>
+          <w:p>
+            <w:r>
+              <w:t>Farbbildsichtfeld [deg]</w:t>
+            </w:r>
+          </w:p>
+        </w:tc>
+        <w:tc>
+          <w:tcPr>
+            <w:tcW w:w="2268" w:type="dxa"/>
+          </w:tcPr>
+          <w:p>
+            <w:r>
+              <w:t>62 x 48,6</w:t>
+            </w:r>
+          </w:p>
+        </w:tc>
+        <w:tc>
+          <w:tcPr>
+            <w:tcW w:w="1843" w:type="dxa"/>
+          </w:tcPr>
+          <w:p>
+            <w:r>
+              <w:t>84,1 x 53,8</w:t>
+            </w:r>
+          </w:p>
+        </w:tc>
+        <w:tc>
+          <w:tcPr>
+            <w:tcW w:w="1978" w:type="dxa"/>
+          </w:tcPr>
+          <w:p>
+            <w:r>
+              <w:t>58 x 45</w:t>
+            </w:r>
+          </w:p>
+        </w:tc>
+      </w:tr>
+      <w:tr>
+        <w:tc>
+          <w:tcPr>
+            <w:tcW w:w="2405" w:type="dxa"/>
+          </w:tcPr>
+          <w:p>
+            <w:r>
+              <w:t>Tiefen</w:t>
+            </w:r>
+            <w:r>
+              <w:t>bild</w:t>
+            </w:r>
+            <w:r>
+              <w:t>sichtfeld [deg]</w:t>
+            </w:r>
+          </w:p>
+        </w:tc>
+        <w:tc>
+          <w:tcPr>
+            <w:tcW w:w="2268" w:type="dxa"/>
+          </w:tcPr>
+          <w:p>
+            <w:r>
+              <w:t>58,5 x 46,6</w:t>
+            </w:r>
+          </w:p>
+        </w:tc>
+        <w:tc>
+          <w:tcPr>
+            <w:tcW w:w="1843" w:type="dxa"/>
+          </w:tcPr>
+          <w:p>
+            <w:r>
+              <w:t>70,6 x 60</w:t>
+            </w:r>
+          </w:p>
+        </w:tc>
+        <w:tc>
+          <w:tcPr>
+            <w:tcW w:w="1978" w:type="dxa"/>
+          </w:tcPr>
+          <w:p>
+            <w:r>
+              <w:t>58 x 45</w:t>
+            </w:r>
+          </w:p>
+        </w:tc>
+      </w:tr>
+      <w:tr>
+        <w:tc>
+          <w:tcPr>
+            <w:tcW w:w="2405" w:type="dxa"/>
+          </w:tcPr>
+          <w:p>
+            <w:r>
+              <w:t>Bildwiederholungsrate [FPS]</w:t>
+            </w:r>
+          </w:p>
+        </w:tc>
+        <w:tc>
+          <w:tcPr>
+            <w:tcW w:w="2268" w:type="dxa"/>
+          </w:tcPr>
+          <w:p>
+            <w:r>
+              <w:t>30</w:t>
+            </w:r>
+          </w:p>
+        </w:tc>
+        <w:tc>
+          <w:tcPr>
+            <w:tcW w:w="1843" w:type="dxa"/>
+          </w:tcPr>
+          <w:p>
+            <w:r>
+              <w:t>30</w:t>
+            </w:r>
+          </w:p>
+        </w:tc>
+        <w:tc>
+          <w:tcPr>
+            <w:tcW w:w="1978" w:type="dxa"/>
+          </w:tcPr>
+          <w:p>
+            <w:r>
+              <w:t xml:space="preserve">30 (VGA), </w:t>
+            </w:r>
+            <w:r>
+              <w:br/>
+              <w:t>60 (QVGA)</w:t>
+            </w:r>
+          </w:p>
+        </w:tc>
+      </w:tr>
+    </w:tbl>
+    <w:p>
+      <w:pPr>
+        <w:rPr>
+          <w:sz w:val="20"/>
+          <w:szCs w:val="20"/>
+        </w:rPr>
+      </w:pPr>
+      <w:r>
+        <w:rPr>
+          <w:sz w:val="20"/>
+          <w:szCs w:val="20"/>
+        </w:rPr>
+        <w:t xml:space="preserve">Daten der Kinect Sensoren: </w:t>
+      </w:r>
+      <w:hyperlink r:id="rId30" w:history="1">
+        <w:r>
+          <w:rPr>
+            <w:rStyle w:val="Hyperlink"/>
+            <w:sz w:val="20"/>
+            <w:szCs w:val="20"/>
+          </w:rPr>
+          <w:t>https://smeenk.com/kinect-field-of-view-comparison/?utm_source=chatgpt.com</w:t>
+        </w:r>
+      </w:hyperlink>
+    </w:p>
+    <w:p>
+      <w:pPr>
+        <w:rPr>
+          <w:sz w:val="20"/>
+          <w:szCs w:val="20"/>
+        </w:rPr>
+      </w:pPr>
+      <w:r>
+        <w:rPr>
+          <w:sz w:val="20"/>
+          <w:szCs w:val="20"/>
+        </w:rPr>
+        <w:t xml:space="preserve">Datan des Asus Xtion Pro: </w:t>
+      </w:r>
+      <w:hyperlink r:id="rId31" w:history="1">
+        <w:r>
+          <w:rPr>
+            <w:rStyle w:val="Hyperlink"/>
+            <w:sz w:val="20"/>
+            <w:szCs w:val="20"/>
+          </w:rPr>
+          <w:t>https://wiki.hshl.de/wiki/index.php/Asus_Xtion_Pro_Tiefenkamera_mit_Matlab/Simulink</w:t>
+        </w:r>
+      </w:hyperlink>
+    </w:p>
+    <w:p>
+      <w:pPr>
+        <w:rPr>
+          <w:sz w:val="20"/>
+          <w:szCs w:val="20"/>
+        </w:rPr>
+      </w:pPr>
+      <w:r>
+        <w:rPr>
+          <w:sz w:val="20"/>
+          <w:szCs w:val="20"/>
+        </w:rPr>
+        <w:t xml:space="preserve">Alle Standards für Bildformate: </w:t>
+      </w:r>
+      <w:hyperlink r:id="rId32" w:history="1">
+        <w:r>
+          <w:rPr>
+            <w:rStyle w:val="Hyperlink"/>
+            <w:sz w:val="20"/>
+            <w:szCs w:val="20"/>
+          </w:rPr>
+          <w:t>https://www.touchandscreen.de/bildschirmaufloesungen</w:t>
+        </w:r>
+      </w:hyperlink>
+    </w:p>
+    <w:p/>
+    <w:p>
+      <w:r>
+        <w:t xml:space="preserve">Diese Sensoren haben ein Sichtfeld welches kleiner ist als für dieses Projekt gewünscht ist, ihre Verwendung würde also mit Kompromissen einhergehen. </w:t>
+      </w:r>
+    </w:p>
+    <w:p/>
+    <w:p>
+      <w:r>
+        <w:t xml:space="preserve">Es ist zu bemerken, dass eine VGA-Farbbildauflösung in </w:t>
+      </w:r>
+      <w:r>
+        <w:t>A. Baranitharan</w:t>
+      </w:r>
+      <w:r>
+        <w:t>‘s Projekt ausreichend war, um Arm und Hand Abwicklungen (in alle drei Dimensionen) zuverlässig zu erkennen. Jedoch wurden auch zusätzliche Tiefeninformationen erfasst</w:t>
+      </w:r>
+    </w:p>
+    <w:p/>
+    <w:p/>
+    <w:p>
+      <w:r>
+        <w:t>Das Projekt “</w:t>
+      </w:r>
+      <w:r>
+        <w:t>Vision Robotic Arm Gesture Recognition</w:t>
+      </w:r>
+      <w:r>
+        <w:t xml:space="preserve">“ </w:t>
+      </w:r>
+      <w:r>
+        <w:t>[</w:t>
+      </w:r>
+      <w:hyperlink w:anchor="Candeloro_2022" w:history="1">
+        <w:r>
+          <w:rPr>
+            <w:rStyle w:val="Hyperlink"/>
+          </w:rPr>
+          <w:t>Candeloro_2022</w:t>
+        </w:r>
+      </w:hyperlink>
+      <w:hyperlink w:anchor="Fabrizi_2022" w:history="1"/>
+      <w:r>
+        <w:t>] ist</w:t>
+      </w:r>
+      <w:r>
+        <w:t xml:space="preserve"> ein Semester Projekt der “</w:t>
+      </w:r>
+      <w:r>
+        <w:t>University</w:t>
+      </w:r>
+      <w:r>
+        <w:t xml:space="preserve"> </w:t>
+      </w:r>
+      <w:r>
+        <w:t>of Modena and Reggio Emilia (UNIMORE)</w:t>
+      </w:r>
+      <w:r>
+        <w:t>“</w:t>
+      </w:r>
+      <w:r>
+        <w:t xml:space="preserve">. Hier werden Ellenbogenwinkel, Schulterwinkel also Körperausrichtung und </w:t>
+      </w:r>
+      <w:r>
+        <w:t>Handöffnungsgrad</w:t>
+      </w:r>
+      <w:r>
+        <w:t xml:space="preserve"> bildlich erkannt und ausgewertet. Das kommt den Zielen der </w:t>
+      </w:r>
+      <w:r>
+        <w:lastRenderedPageBreak/>
+        <w:t xml:space="preserve">Gestenerkennung </w:t>
+      </w:r>
+      <w:r>
+        <w:t>dieser Masterarbeit</w:t>
+      </w:r>
+      <w:r>
+        <w:t xml:space="preserve"> nahe.</w:t>
+      </w:r>
+      <w:r>
+        <w:t xml:space="preserve"> In </w:t>
+      </w:r>
+      <w:r>
+        <w:t>Candeloro’s Projekt wird folgende Komponenten genutzt:</w:t>
+      </w:r>
+    </w:p>
+    <w:p/>
+    <w:p>
+      <w:pPr>
+        <w:pStyle w:val="Listenabsatz"/>
+        <w:numPr>
+          <w:ilvl w:val="0"/>
+          <w:numId w:val="31"/>
+        </w:numPr>
+      </w:pPr>
+      <w:hyperlink r:id="rId33" w:history="1">
+        <w:r>
+          <w:rPr>
+            <w:rStyle w:val="Hyperlink"/>
+          </w:rPr>
+          <w:t>MediaPipe</w:t>
+        </w:r>
+      </w:hyperlink>
+      <w:r>
+        <w:t xml:space="preserve"> und </w:t>
+      </w:r>
+      <w:hyperlink r:id="rId34" w:history="1">
+        <w:r>
+          <w:rPr>
+            <w:rStyle w:val="Hyperlink"/>
+          </w:rPr>
+          <w:t>OpenCV</w:t>
+        </w:r>
+      </w:hyperlink>
+      <w:r>
+        <w:t xml:space="preserve"> in Python 3 – für die Gestenerkennung </w:t>
+      </w:r>
+    </w:p>
+    <w:p>
+      <w:pPr>
+        <w:pStyle w:val="Listenabsatz"/>
+        <w:numPr>
+          <w:ilvl w:val="0"/>
+          <w:numId w:val="31"/>
+        </w:numPr>
+      </w:pPr>
+      <w:r>
+        <w:t>ROS in Python 3 und Gazebo – als Kommunikationsprotokoll</w:t>
+      </w:r>
+    </w:p>
+    <w:p>
+      <w:pPr>
+        <w:pStyle w:val="Listenabsatz"/>
+        <w:numPr>
+          <w:ilvl w:val="0"/>
+          <w:numId w:val="31"/>
+        </w:numPr>
+      </w:pPr>
+      <w:r>
+        <w:t xml:space="preserve">Gazebo – zur Robotersimulation </w:t>
+      </w:r>
+    </w:p>
+    <w:p>
+      <w:pPr>
+        <w:pStyle w:val="Listenabsatz"/>
+        <w:numPr>
+          <w:ilvl w:val="0"/>
+          <w:numId w:val="31"/>
+        </w:numPr>
+      </w:pPr>
+      <w:r>
+        <w:t xml:space="preserve">undefinierte 2D-Webcam </w:t>
+      </w:r>
+      <w:r>
+        <w:t xml:space="preserve">– horizontal und stationär </w:t>
+      </w:r>
+    </w:p>
+    <w:p>
+      <w:pPr>
+        <w:pStyle w:val="Listenabsatz"/>
+        <w:numPr>
+          <w:ilvl w:val="0"/>
+          <w:numId w:val="31"/>
+        </w:numPr>
+      </w:pPr>
+      <w:r>
+        <w:t>Linux Ubuntu Computer</w:t>
+      </w:r>
+    </w:p>
+    <w:p/>
+    <w:p>
+      <w:r>
+        <w:t xml:space="preserve">Das Projekt ist ausführlich dokumentiert und Open Source auf </w:t>
+      </w:r>
+      <w:hyperlink r:id="rId35" w:history="1">
+        <w:r>
+          <w:rPr>
+            <w:rStyle w:val="Hyperlink"/>
+          </w:rPr>
+          <w:t>GitHub</w:t>
+        </w:r>
+      </w:hyperlink>
+      <w:r>
+        <w:t xml:space="preserve"> zu finden</w:t>
+      </w:r>
+      <w:r>
+        <w:t>.</w:t>
+      </w:r>
+    </w:p>
+    <w:p/>
+    <w:p/>
+    <w:p>
+      <w:r>
+        <w:t xml:space="preserve">Das “Sports2D“ Programm von </w:t>
+      </w:r>
+      <w:r>
+        <w:t>D</w:t>
+      </w:r>
+      <w:r>
+        <w:t>a</w:t>
+      </w:r>
+      <w:r>
+        <w:t>vid Pagnon</w:t>
+      </w:r>
+      <w:r>
+        <w:t xml:space="preserve"> [</w:t>
+      </w:r>
+      <w:hyperlink w:anchor="Pagnon_2026" w:history="1">
+        <w:r>
+          <w:rPr>
+            <w:rStyle w:val="Hyperlink"/>
+          </w:rPr>
+          <w:t>Pagnon_2026</w:t>
+        </w:r>
+      </w:hyperlink>
+      <w:r>
+        <w:t>]</w:t>
+      </w:r>
+      <w:r>
+        <w:t xml:space="preserve"> erkennt sämtliche Gelenkwinkel von mehreren Menschen. Das Eingangsmaterial kann ein Video oder Livestream sein. Es kommt ohne grafische Bedienoberfläche (auf Englisch: </w:t>
+      </w:r>
+      <w:r>
+        <w:t>graphical user interface</w:t>
+      </w:r>
+      <w:r>
+        <w:t xml:space="preserve">, kurz: GUI) daher und ist mit den drei gängigen Betriebssystemen: Windows, Linux und Mac OS kompatibel. Es basiert auf </w:t>
+      </w:r>
+      <w:hyperlink r:id="rId36" w:history="1">
+        <w:r>
+          <w:rPr>
+            <w:rStyle w:val="Hyperlink"/>
+          </w:rPr>
+          <w:t>O</w:t>
+        </w:r>
+        <w:r>
+          <w:rPr>
+            <w:rStyle w:val="Hyperlink"/>
+          </w:rPr>
+          <w:t>pen</w:t>
+        </w:r>
+        <w:r>
+          <w:rPr>
+            <w:rStyle w:val="Hyperlink"/>
+          </w:rPr>
+          <w:t>P</w:t>
+        </w:r>
+        <w:r>
+          <w:rPr>
+            <w:rStyle w:val="Hyperlink"/>
+          </w:rPr>
+          <w:t>ose</w:t>
+        </w:r>
+      </w:hyperlink>
+      <w:r>
+        <w:t xml:space="preserve"> in </w:t>
+      </w:r>
+      <w:r>
+        <w:t>P</w:t>
+      </w:r>
+      <w:r>
+        <w:t>ython 3</w:t>
+      </w:r>
+    </w:p>
+    <w:p/>
+    <w:p>
+      <w:r>
+        <w:t>…</w:t>
+      </w:r>
+    </w:p>
+    <w:p/>
+    <w:p>
+      <w:r>
         <w:t xml:space="preserve">Das </w:t>
       </w:r>
       <w:r>
-        <w:t>Mit der 45° Ausrichtung ist mindestens ein Sichtfeld von 70</w:t>
-      </w:r>
-      <w:r>
-        <w:t>°</w:t>
-      </w:r>
-      <w:r>
-        <w:t xml:space="preserve"> x 45° notwendig</w:t>
-      </w:r>
-      <w:r>
-        <w:t>, wenn es Die Eckposition werden soll. Bei der 90° Ausrichtung wären es 84° x 51°. Für eine Von-Vorne-Sicht mit der Höhe 170 cm, wären es 75° x 51° bzw. 92° x 60°.</w:t>
-      </w:r>
-      <w:r>
-        <w:t xml:space="preserve"> Zusammengefasst lässt sich sagen das für die meisten und die relevanten Positionen ein Sichtfeld von rund 95° x 60° ausreicht. Bei </w:t>
-      </w:r>
-      <w:r>
-        <w:t xml:space="preserve">der Wahl einer </w:t>
-      </w:r>
-      <w:r>
-        <w:t xml:space="preserve">Kamera mit </w:t>
-      </w:r>
-      <w:r>
-        <w:t>kleineren</w:t>
-      </w:r>
-      <w:r>
-        <w:t xml:space="preserve"> Sichtfeld, sollten die wegfallenden Positionierungsmöglichkeiten </w:t>
-      </w:r>
-      <w:r>
-        <w:t>berücksichtigt</w:t>
-      </w:r>
-      <w:r>
-        <w:t xml:space="preserve"> werden.</w:t>
-      </w:r>
-    </w:p>
-    <w:p>
-      <w:pPr>
-        <w:pStyle w:val="berschrift3"/>
-      </w:pPr>
-      <w:bookmarkStart w:id="35" w:name="_Toc228557175"/>
-      <w:r>
-        <w:t xml:space="preserve">Projektanforderungen </w:t>
-      </w:r>
-      <w:r>
-        <w:t>an die Recheneinheit</w:t>
-      </w:r>
-      <w:bookmarkEnd w:id="35"/>
-    </w:p>
-    <w:p>
-      <w:pPr>
-        <w:pStyle w:val="berschrift3"/>
-      </w:pPr>
-      <w:bookmarkStart w:id="36" w:name="_Toc228557176"/>
-      <w:r>
-        <w:t xml:space="preserve">Projektanforderungen </w:t>
-      </w:r>
-      <w:r>
-        <w:t>an die Programmumgebung</w:t>
-      </w:r>
-      <w:bookmarkEnd w:id="36"/>
-      <w:r>
-        <w:t xml:space="preserve"> </w:t>
-      </w:r>
-    </w:p>
+        <w:t>Programm</w:t>
+      </w:r>
+      <w:r>
+        <w:t xml:space="preserve"> ist ausführlich dokumentiert und Open Source auf </w:t>
+      </w:r>
+      <w:hyperlink r:id="rId37" w:history="1">
+        <w:r>
+          <w:rPr>
+            <w:rStyle w:val="Hyperlink"/>
+          </w:rPr>
+          <w:t>GitH</w:t>
+        </w:r>
+        <w:r>
+          <w:rPr>
+            <w:rStyle w:val="Hyperlink"/>
+          </w:rPr>
+          <w:t>u</w:t>
+        </w:r>
+        <w:r>
+          <w:rPr>
+            <w:rStyle w:val="Hyperlink"/>
+          </w:rPr>
+          <w:t>b</w:t>
+        </w:r>
+      </w:hyperlink>
+      <w:r>
+        <w:t xml:space="preserve"> zu finden.</w:t>
+      </w:r>
+    </w:p>
+    <w:p/>
     <w:p>
       <w:pPr>
         <w:pStyle w:val="berschrift2"/>
       </w:pPr>
-      <w:bookmarkStart w:id="37" w:name="_Toc228557177"/>
       <w:r>
         <w:t>Wahl der Hardware und Software</w:t>
       </w:r>
@@ -9221,6 +10393,9 @@
       </w:r>
       <w:r>
         <w:t xml:space="preserve"> dient.</w:t>
+      </w:r>
+      <w:r>
+        <w:t xml:space="preserve"> </w:t>
       </w:r>
     </w:p>
     <w:p>
@@ -13151,7 +14326,7 @@
                     </pic:cNvPicPr>
                   </pic:nvPicPr>
                   <pic:blipFill>
-                    <a:blip r:embed="rId29" cstate="print"/>
+                    <a:blip r:embed="rId38" cstate="print"/>
                     <a:srcRect/>
                     <a:stretch>
                       <a:fillRect/>
@@ -14430,7 +15605,7 @@
                     </pic:cNvPicPr>
                   </pic:nvPicPr>
                   <pic:blipFill>
-                    <a:blip r:embed="rId30" cstate="print"/>
+                    <a:blip r:embed="rId39" cstate="print"/>
                     <a:srcRect/>
                     <a:stretch>
                       <a:fillRect/>
@@ -15195,7 +16370,7 @@
         </w:rPr>
         <w:t xml:space="preserve">(aktuelle Fassung liegt i.d.R. auf </w:t>
       </w:r>
-      <w:hyperlink r:id="rId31" w:history="1">
+      <w:hyperlink r:id="rId40" w:history="1">
         <w:r>
           <w:rPr>
             <w:rStyle w:val="Hyperlink"/>
@@ -16623,7 +17798,7 @@
         </w:rPr>
         <w:t xml:space="preserve">– Online im Internet: </w:t>
       </w:r>
-      <w:hyperlink r:id="rId32" w:history="1">
+      <w:hyperlink r:id="rId41" w:history="1">
         <w:r>
           <w:rPr>
             <w:rStyle w:val="Hyperlink"/>
@@ -16673,7 +17848,7 @@
       <w:r>
         <w:t xml:space="preserve">nline im Internet: </w:t>
       </w:r>
-      <w:hyperlink r:id="rId33" w:history="1">
+      <w:hyperlink r:id="rId42" w:history="1">
         <w:r>
           <w:rPr>
             <w:rStyle w:val="Hyperlink"/>
@@ -16731,7 +17906,7 @@
         </w:rPr>
         <w:t xml:space="preserve">m Internet: </w:t>
       </w:r>
-      <w:hyperlink r:id="rId34" w:history="1">
+      <w:hyperlink r:id="rId43" w:history="1">
         <w:r>
           <w:rPr>
             <w:rStyle w:val="Hyperlink"/>
@@ -16807,7 +17982,7 @@
         </w:rPr>
         <w:t xml:space="preserve">: </w:t>
       </w:r>
-      <w:hyperlink r:id="rId35" w:history="1">
+      <w:hyperlink r:id="rId44" w:history="1">
         <w:r>
           <w:rPr>
             <w:rStyle w:val="Hyperlink"/>
@@ -16846,9 +18021,21 @@
         <w:rPr>
           <w:lang w:val="en-US"/>
         </w:rPr>
-        <w:t xml:space="preserve"> - Online im Internet: </w:t>
-      </w:r>
-      <w:hyperlink r:id="rId36" w:history="1">
+        <w:t xml:space="preserve"> </w:t>
+      </w:r>
+      <w:r>
+        <w:rPr>
+          <w:lang w:val="en-US"/>
+        </w:rPr>
+        <w:t>–</w:t>
+      </w:r>
+      <w:r>
+        <w:rPr>
+          <w:lang w:val="en-US"/>
+        </w:rPr>
+        <w:t xml:space="preserve"> Online im Internet: </w:t>
+      </w:r>
+      <w:hyperlink r:id="rId45" w:history="1">
         <w:r>
           <w:rPr>
             <w:rStyle w:val="Hyperlink"/>
@@ -16864,6 +18051,282 @@
         <w:t xml:space="preserve"> (Stand: 20.06.26)</w:t>
       </w:r>
     </w:p>
+    <w:p>
+      <w:pPr>
+        <w:pStyle w:val="Literatureintrag"/>
+        <w:jc w:val="both"/>
+        <w:rPr>
+          <w:lang w:val="en-US"/>
+        </w:rPr>
+      </w:pPr>
+    </w:p>
+    <w:p>
+      <w:pPr>
+        <w:pStyle w:val="Literatureintrag"/>
+        <w:jc w:val="both"/>
+        <w:rPr>
+          <w:lang w:val="en-US"/>
+        </w:rPr>
+      </w:pPr>
+      <w:bookmarkStart w:id="187" w:name="Baranitharan_2026"/>
+      <w:r>
+        <w:rPr>
+          <w:lang w:val="en-US"/>
+        </w:rPr>
+        <w:t xml:space="preserve">Baranitharan </w:t>
+      </w:r>
+      <w:r>
+        <w:rPr>
+          <w:lang w:val="en-US"/>
+        </w:rPr>
+        <w:t xml:space="preserve">A. </w:t>
+      </w:r>
+      <w:r>
+        <w:rPr>
+          <w:lang w:val="en-US"/>
+        </w:rPr>
+        <w:t>(2026)</w:t>
+      </w:r>
+      <w:r>
+        <w:rPr>
+          <w:lang w:val="en-US"/>
+        </w:rPr>
+        <w:t>:</w:t>
+      </w:r>
+      <w:r>
+        <w:rPr>
+          <w:lang w:val="en-US"/>
+        </w:rPr>
+        <w:t> Gesture Controlled Robotic Arm Using Kinect (Simulink Support For Kinect) and Arduino </w:t>
+      </w:r>
+      <w:r>
+        <w:rPr>
+          <w:lang w:val="en-US"/>
+        </w:rPr>
+        <w:t xml:space="preserve">– Online im Internet: </w:t>
+      </w:r>
+      <w:hyperlink r:id="rId46" w:history="1">
+        <w:r>
+          <w:rPr>
+            <w:rStyle w:val="Hyperlink"/>
+            <w:lang w:val="en-US"/>
+          </w:rPr>
+          <w:t>https://de.mathworks.com/matlabcentral/fileexchange/58189-gesture-controlled-robotic-arm-using-kinect-simulink-support-for-kinect-and-arduino</w:t>
+        </w:r>
+      </w:hyperlink>
+      <w:r>
+        <w:rPr>
+          <w:lang w:val="en-US"/>
+        </w:rPr>
+        <w:t xml:space="preserve"> (Stand:</w:t>
+      </w:r>
+      <w:r>
+        <w:rPr>
+          <w:lang w:val="en-US"/>
+        </w:rPr>
+        <w:t xml:space="preserve"> 28. </w:t>
+      </w:r>
+      <w:r>
+        <w:rPr>
+          <w:lang w:val="en-US"/>
+        </w:rPr>
+        <w:t>Juni</w:t>
+      </w:r>
+      <w:r>
+        <w:rPr>
+          <w:lang w:val="en-US"/>
+        </w:rPr>
+        <w:t xml:space="preserve"> 2026</w:t>
+      </w:r>
+      <w:r>
+        <w:rPr>
+          <w:lang w:val="en-US"/>
+        </w:rPr>
+        <w:t>)</w:t>
+      </w:r>
+      <w:bookmarkEnd w:id="187"/>
+    </w:p>
+    <w:p>
+      <w:pPr>
+        <w:pStyle w:val="Literatureintrag"/>
+        <w:jc w:val="both"/>
+        <w:rPr>
+          <w:lang w:val="en-US"/>
+        </w:rPr>
+      </w:pPr>
+    </w:p>
+    <w:p>
+      <w:pPr>
+        <w:pStyle w:val="Literatureintrag"/>
+        <w:jc w:val="both"/>
+      </w:pPr>
+      <w:bookmarkStart w:id="188" w:name="Candeloro_2022"/>
+      <w:bookmarkEnd w:id="188"/>
+      <w:r>
+        <w:rPr>
+          <w:lang w:val="en-US"/>
+        </w:rPr>
+        <w:t>Candeloro E.,</w:t>
+      </w:r>
+      <w:r>
+        <w:rPr>
+          <w:lang w:val="en-US"/>
+        </w:rPr>
+        <w:t xml:space="preserve"> </w:t>
+      </w:r>
+      <w:r>
+        <w:rPr>
+          <w:lang w:val="en-US"/>
+        </w:rPr>
+        <w:t>Rosati G.,</w:t>
+      </w:r>
+      <w:r>
+        <w:rPr>
+          <w:lang w:val="en-US"/>
+        </w:rPr>
+        <w:t xml:space="preserve"> </w:t>
+      </w:r>
+      <w:r>
+        <w:rPr>
+          <w:lang w:val="en-US"/>
+        </w:rPr>
+        <w:t>Bianchi E.,</w:t>
+      </w:r>
+      <w:r>
+        <w:rPr>
+          <w:lang w:val="en-US"/>
+        </w:rPr>
+        <w:t xml:space="preserve"> </w:t>
+      </w:r>
+      <w:r>
+        <w:rPr>
+          <w:lang w:val="en-US"/>
+        </w:rPr>
+        <w:t>Fabrizi</w:t>
+      </w:r>
+      <w:r>
+        <w:rPr>
+          <w:lang w:val="en-US"/>
+        </w:rPr>
+        <w:t xml:space="preserve"> B., </w:t>
+      </w:r>
+      <w:r>
+        <w:rPr>
+          <w:lang w:val="en-US"/>
+        </w:rPr>
+        <w:t>University of Modena and Reggio Emilia (UNIMORE)</w:t>
+      </w:r>
+      <w:r>
+        <w:rPr>
+          <w:lang w:val="en-US"/>
+        </w:rPr>
+        <w:t xml:space="preserve"> </w:t>
+      </w:r>
+      <w:r>
+        <w:rPr>
+          <w:lang w:val="en-US"/>
+        </w:rPr>
+        <w:t>(</w:t>
+      </w:r>
+      <w:r>
+        <w:rPr>
+          <w:lang w:val="en-US"/>
+        </w:rPr>
+        <w:t>202</w:t>
+      </w:r>
+      <w:r>
+        <w:rPr>
+          <w:lang w:val="en-US"/>
+        </w:rPr>
+        <w:t>2</w:t>
+      </w:r>
+      <w:r>
+        <w:rPr>
+          <w:lang w:val="en-US"/>
+        </w:rPr>
+        <w:t xml:space="preserve">): </w:t>
+      </w:r>
+      <w:r>
+        <w:rPr>
+          <w:lang w:val="en-US"/>
+        </w:rPr>
+        <w:t>Vision Robotic Arm Gesture Recognition</w:t>
+      </w:r>
+      <w:r>
+        <w:rPr>
+          <w:lang w:val="en-US"/>
+        </w:rPr>
+        <w:t xml:space="preserve"> </w:t>
+      </w:r>
+      <w:r>
+        <w:rPr>
+          <w:lang w:val="en-US"/>
+        </w:rPr>
+        <w:t>– Online im Internet:</w:t>
+      </w:r>
+      <w:r>
+        <w:rPr>
+          <w:lang w:val="en-US"/>
+        </w:rPr>
+        <w:t xml:space="preserve"> </w:t>
+      </w:r>
+      <w:hyperlink r:id="rId47" w:history="1">
+        <w:r>
+          <w:rPr>
+            <w:rStyle w:val="Hyperlink"/>
+            <w:lang w:val="en-US"/>
+          </w:rPr>
+          <w:t>https://github.com/dusty-nv/jetson-inference/blob/master/docs/jetpack-setup-2.md</w:t>
+        </w:r>
+      </w:hyperlink>
+      <w:r>
+        <w:rPr>
+          <w:lang w:val="en-US"/>
+        </w:rPr>
+        <w:t xml:space="preserve"> (Stand: 28. Juni 2026)</w:t>
+      </w:r>
+    </w:p>
+    <w:p>
+      <w:pPr>
+        <w:pStyle w:val="Literatureintrag"/>
+        <w:jc w:val="both"/>
+        <w:rPr>
+          <w:lang w:val="en-US"/>
+        </w:rPr>
+      </w:pPr>
+    </w:p>
+    <w:p>
+      <w:pPr>
+        <w:pStyle w:val="Literatureintrag"/>
+        <w:ind w:left="0" w:firstLine="0"/>
+        <w:jc w:val="both"/>
+      </w:pPr>
+      <w:bookmarkStart w:id="189" w:name="Pagnon_2026"/>
+      <w:bookmarkEnd w:id="189"/>
+      <w:r>
+        <w:t>Pagnon</w:t>
+      </w:r>
+      <w:r>
+        <w:t xml:space="preserve"> D.</w:t>
+      </w:r>
+      <w:r>
+        <w:t xml:space="preserve"> (2026): Sports2D – Online im </w:t>
+      </w:r>
+      <w:r>
+        <w:t xml:space="preserve">Internet: </w:t>
+      </w:r>
+      <w:hyperlink r:id="rId48" w:history="1">
+        <w:r>
+          <w:rPr>
+            <w:rStyle w:val="Hyperlink"/>
+          </w:rPr>
+          <w:t>https://github.com/davidpagnon/Sports2D/tree/main</w:t>
+        </w:r>
+      </w:hyperlink>
+      <w:r>
+        <w:t xml:space="preserve"> (Stand: 28. Juni 2026)</w:t>
+      </w:r>
+    </w:p>
     <w:bookmarkEnd w:id="184"/>
     <w:bookmarkEnd w:id="186"/>
     <w:p>
@@ -16937,8 +18400,8 @@
       </w:r>
     </w:p>
     <w:sectPr>
-      <w:headerReference w:type="default" r:id="rId37"/>
-      <w:headerReference w:type="first" r:id="rId38"/>
+      <w:headerReference w:type="default" r:id="rId49"/>
+      <w:headerReference w:type="first" r:id="rId50"/>
       <w:pgSz w:w="11906" w:h="16838" w:code="9"/>
       <w:pgMar w:top="1701" w:right="1701" w:bottom="1134" w:left="1701" w:header="720" w:footer="720" w:gutter="0"/>
       <w:pgNumType w:start="1"/>
@@ -17146,7 +18609,13 @@
       </w:r>
       <w:r>
         <w:tab/>
-        <w:t xml:space="preserve">Einfache Anführungszeichen kennzeichnen Begriffe. </w:t>
+        <w:t xml:space="preserve">Einfache </w:t>
+      </w:r>
+      <w:r>
+        <w:t>Anführungszeichen</w:t>
+      </w:r>
+      <w:r>
+        <w:t xml:space="preserve"> kennzeichnen Begriffe. </w:t>
       </w:r>
     </w:p>
   </w:footnote>
@@ -17579,7 +19048,7 @@
           <w:color w:val="000000" w:themeColor="text1"/>
           <w:u w:val="none"/>
         </w:rPr>
-        <w:t>13</w:t>
+        <w:t>15</w:t>
       </w:r>
       <w:r>
         <w:rPr>
@@ -18459,6 +19928,155 @@
     </w:lvl>
   </w:abstractNum>
   <w:abstractNum w:abstractNumId="14" w15:restartNumberingAfterBreak="0">
+    <w:nsid w:val="34E15023"/>
+    <w:multiLevelType w:val="multilevel"/>
+    <w:tmpl w:val="4E187150"/>
+    <w:lvl w:ilvl="0">
+      <w:start w:val="1"/>
+      <w:numFmt w:val="bullet"/>
+      <w:lvlText w:val=""/>
+      <w:lvlJc w:val="left"/>
+      <w:pPr>
+        <w:tabs>
+          <w:tab w:val="num" w:pos="720"/>
+        </w:tabs>
+        <w:ind w:left="720" w:hanging="360"/>
+      </w:pPr>
+      <w:rPr>
+        <w:rFonts w:ascii="Symbol" w:hAnsi="Symbol" w:hint="default"/>
+        <w:sz w:val="20"/>
+      </w:rPr>
+    </w:lvl>
+    <w:lvl w:ilvl="1" w:tentative="1">
+      <w:start w:val="1"/>
+      <w:numFmt w:val="bullet"/>
+      <w:lvlText w:val="o"/>
+      <w:lvlJc w:val="left"/>
+      <w:pPr>
+        <w:tabs>
+          <w:tab w:val="num" w:pos="1440"/>
+        </w:tabs>
+        <w:ind w:left="1440" w:hanging="360"/>
+      </w:pPr>
+      <w:rPr>
+        <w:rFonts w:ascii="Courier New" w:hAnsi="Courier New" w:hint="default"/>
+        <w:sz w:val="20"/>
+      </w:rPr>
+    </w:lvl>
+    <w:lvl w:ilvl="2" w:tentative="1">
+      <w:start w:val="1"/>
+      <w:numFmt w:val="bullet"/>
+      <w:lvlText w:val=""/>
+      <w:lvlJc w:val="left"/>
+      <w:pPr>
+        <w:tabs>
+          <w:tab w:val="num" w:pos="2160"/>
+        </w:tabs>
+        <w:ind w:left="2160" w:hanging="360"/>
+      </w:pPr>
+      <w:rPr>
+        <w:rFonts w:ascii="Wingdings" w:hAnsi="Wingdings" w:hint="default"/>
+        <w:sz w:val="20"/>
+      </w:rPr>
+    </w:lvl>
+    <w:lvl w:ilvl="3" w:tentative="1">
+      <w:start w:val="1"/>
+      <w:numFmt w:val="bullet"/>
+      <w:lvlText w:val=""/>
+      <w:lvlJc w:val="left"/>
+      <w:pPr>
+        <w:tabs>
+          <w:tab w:val="num" w:pos="2880"/>
+        </w:tabs>
+        <w:ind w:left="2880" w:hanging="360"/>
+      </w:pPr>
+      <w:rPr>
+        <w:rFonts w:ascii="Wingdings" w:hAnsi="Wingdings" w:hint="default"/>
+        <w:sz w:val="20"/>
+      </w:rPr>
+    </w:lvl>
+    <w:lvl w:ilvl="4" w:tentative="1">
+      <w:start w:val="1"/>
+      <w:numFmt w:val="bullet"/>
+      <w:lvlText w:val=""/>
+      <w:lvlJc w:val="left"/>
+      <w:pPr>
+        <w:tabs>
+          <w:tab w:val="num" w:pos="3600"/>
+        </w:tabs>
+        <w:ind w:left="3600" w:hanging="360"/>
+      </w:pPr>
+      <w:rPr>
+        <w:rFonts w:ascii="Wingdings" w:hAnsi="Wingdings" w:hint="default"/>
+        <w:sz w:val="20"/>
+      </w:rPr>
+    </w:lvl>
+    <w:lvl w:ilvl="5" w:tentative="1">
+      <w:start w:val="1"/>
+      <w:numFmt w:val="bullet"/>
+      <w:lvlText w:val=""/>
+      <w:lvlJc w:val="left"/>
+      <w:pPr>
+        <w:tabs>
+          <w:tab w:val="num" w:pos="4320"/>
+        </w:tabs>
+        <w:ind w:left="4320" w:hanging="360"/>
+      </w:pPr>
+      <w:rPr>
+        <w:rFonts w:ascii="Wingdings" w:hAnsi="Wingdings" w:hint="default"/>
+        <w:sz w:val="20"/>
+      </w:rPr>
+    </w:lvl>
+    <w:lvl w:ilvl="6" w:tentative="1">
+      <w:start w:val="1"/>
+      <w:numFmt w:val="bullet"/>
+      <w:lvlText w:val=""/>
+      <w:lvlJc w:val="left"/>
+      <w:pPr>
+        <w:tabs>
+          <w:tab w:val="num" w:pos="5040"/>
+        </w:tabs>
+        <w:ind w:left="5040" w:hanging="360"/>
+      </w:pPr>
+      <w:rPr>
+        <w:rFonts w:ascii="Wingdings" w:hAnsi="Wingdings" w:hint="default"/>
+        <w:sz w:val="20"/>
+      </w:rPr>
+    </w:lvl>
+    <w:lvl w:ilvl="7" w:tentative="1">
+      <w:start w:val="1"/>
+      <w:numFmt w:val="bullet"/>
+      <w:lvlText w:val=""/>
+      <w:lvlJc w:val="left"/>
+      <w:pPr>
+        <w:tabs>
+          <w:tab w:val="num" w:pos="5760"/>
+        </w:tabs>
+        <w:ind w:left="5760" w:hanging="360"/>
+      </w:pPr>
+      <w:rPr>
+        <w:rFonts w:ascii="Wingdings" w:hAnsi="Wingdings" w:hint="default"/>
+        <w:sz w:val="20"/>
+      </w:rPr>
+    </w:lvl>
+    <w:lvl w:ilvl="8" w:tentative="1">
+      <w:start w:val="1"/>
+      <w:numFmt w:val="bullet"/>
+      <w:lvlText w:val=""/>
+      <w:lvlJc w:val="left"/>
+      <w:pPr>
+        <w:tabs>
+          <w:tab w:val="num" w:pos="6480"/>
+        </w:tabs>
+        <w:ind w:left="6480" w:hanging="360"/>
+      </w:pPr>
+      <w:rPr>
+        <w:rFonts w:ascii="Wingdings" w:hAnsi="Wingdings" w:hint="default"/>
+        <w:sz w:val="20"/>
+      </w:rPr>
+    </w:lvl>
+  </w:abstractNum>
+  <w:abstractNum w:abstractNumId="15" w15:restartNumberingAfterBreak="0">
     <w:nsid w:val="380C5B20"/>
     <w:multiLevelType w:val="multilevel"/>
     <w:tmpl w:val="61A8BE06"/>
@@ -18580,7 +20198,7 @@
       </w:rPr>
     </w:lvl>
   </w:abstractNum>
-  <w:abstractNum w:abstractNumId="15" w15:restartNumberingAfterBreak="0">
+  <w:abstractNum w:abstractNumId="16" w15:restartNumberingAfterBreak="0">
     <w:nsid w:val="40703B6E"/>
     <w:multiLevelType w:val="singleLevel"/>
     <w:tmpl w:val="A802028E"/>
@@ -18595,7 +20213,7 @@
       </w:pPr>
     </w:lvl>
   </w:abstractNum>
-  <w:abstractNum w:abstractNumId="16" w15:restartNumberingAfterBreak="0">
+  <w:abstractNum w:abstractNumId="17" w15:restartNumberingAfterBreak="0">
     <w:nsid w:val="4F052F77"/>
     <w:multiLevelType w:val="singleLevel"/>
     <w:tmpl w:val="6B867132"/>
@@ -18605,7 +20223,120 @@
       <w:lvlJc w:val="left"/>
     </w:lvl>
   </w:abstractNum>
-  <w:abstractNum w:abstractNumId="17" w15:restartNumberingAfterBreak="0">
+  <w:abstractNum w:abstractNumId="18" w15:restartNumberingAfterBreak="0">
+    <w:nsid w:val="50A800B4"/>
+    <w:multiLevelType w:val="hybridMultilevel"/>
+    <w:tmpl w:val="6D980154"/>
+    <w:lvl w:ilvl="0" w:tplc="6198A3A4">
+      <w:start w:val="6"/>
+      <w:numFmt w:val="bullet"/>
+      <w:lvlText w:val=""/>
+      <w:lvlJc w:val="left"/>
+      <w:pPr>
+        <w:ind w:left="720" w:hanging="360"/>
+      </w:pPr>
+      <w:rPr>
+        <w:rFonts w:ascii="Times New Roman" w:eastAsia="Times New Roman" w:hAnsi="Times New Roman" w:cs="Times New Roman" w:hint="default"/>
+      </w:rPr>
+    </w:lvl>
+    <w:lvl w:ilvl="1" w:tplc="04070003" w:tentative="1">
+      <w:start w:val="1"/>
+      <w:numFmt w:val="bullet"/>
+      <w:lvlText w:val="o"/>
+      <w:lvlJc w:val="left"/>
+      <w:pPr>
+        <w:ind w:left="1440" w:hanging="360"/>
+      </w:pPr>
+      <w:rPr>
+        <w:rFonts w:ascii="Courier New" w:hAnsi="Courier New" w:cs="Courier New" w:hint="default"/>
+      </w:rPr>
+    </w:lvl>
+    <w:lvl w:ilvl="2" w:tplc="04070005" w:tentative="1">
+      <w:start w:val="1"/>
+      <w:numFmt w:val="bullet"/>
+      <w:lvlText w:val=""/>
+      <w:lvlJc w:val="left"/>
+      <w:pPr>
+        <w:ind w:left="2160" w:hanging="360"/>
+      </w:pPr>
+      <w:rPr>
+        <w:rFonts w:ascii="Wingdings" w:hAnsi="Wingdings" w:hint="default"/>
+      </w:rPr>
+    </w:lvl>
+    <w:lvl w:ilvl="3" w:tplc="04070001" w:tentative="1">
+      <w:start w:val="1"/>
+      <w:numFmt w:val="bullet"/>
+      <w:lvlText w:val=""/>
+      <w:lvlJc w:val="left"/>
+      <w:pPr>
+        <w:ind w:left="2880" w:hanging="360"/>
+      </w:pPr>
+      <w:rPr>
+        <w:rFonts w:ascii="Symbol" w:hAnsi="Symbol" w:hint="default"/>
+      </w:rPr>
+    </w:lvl>
+    <w:lvl w:ilvl="4" w:tplc="04070003" w:tentative="1">
+      <w:start w:val="1"/>
+      <w:numFmt w:val="bullet"/>
+      <w:lvlText w:val="o"/>
+      <w:lvlJc w:val="left"/>
+      <w:pPr>
+        <w:ind w:left="3600" w:hanging="360"/>
+      </w:pPr>
+      <w:rPr>
+        <w:rFonts w:ascii="Courier New" w:hAnsi="Courier New" w:cs="Courier New" w:hint="default"/>
+      </w:rPr>
+    </w:lvl>
+    <w:lvl w:ilvl="5" w:tplc="04070005" w:tentative="1">
+      <w:start w:val="1"/>
+      <w:numFmt w:val="bullet"/>
+      <w:lvlText w:val=""/>
+      <w:lvlJc w:val="left"/>
+      <w:pPr>
+        <w:ind w:left="4320" w:hanging="360"/>
+      </w:pPr>
+      <w:rPr>
+        <w:rFonts w:ascii="Wingdings" w:hAnsi="Wingdings" w:hint="default"/>
+      </w:rPr>
+    </w:lvl>
+    <w:lvl w:ilvl="6" w:tplc="04070001" w:tentative="1">
+      <w:start w:val="1"/>
+      <w:numFmt w:val="bullet"/>
+      <w:lvlText w:val=""/>
+      <w:lvlJc w:val="left"/>
+      <w:pPr>
+        <w:ind w:left="5040" w:hanging="360"/>
+      </w:pPr>
+      <w:rPr>
+        <w:rFonts w:ascii="Symbol" w:hAnsi="Symbol" w:hint="default"/>
+      </w:rPr>
+    </w:lvl>
+    <w:lvl w:ilvl="7" w:tplc="04070003" w:tentative="1">
+      <w:start w:val="1"/>
+      <w:numFmt w:val="bullet"/>
+      <w:lvlText w:val="o"/>
+      <w:lvlJc w:val="left"/>
+      <w:pPr>
+        <w:ind w:left="5760" w:hanging="360"/>
+      </w:pPr>
+      <w:rPr>
+        <w:rFonts w:ascii="Courier New" w:hAnsi="Courier New" w:cs="Courier New" w:hint="default"/>
+      </w:rPr>
+    </w:lvl>
+    <w:lvl w:ilvl="8" w:tplc="04070005" w:tentative="1">
+      <w:start w:val="1"/>
+      <w:numFmt w:val="bullet"/>
+      <w:lvlText w:val=""/>
+      <w:lvlJc w:val="left"/>
+      <w:pPr>
+        <w:ind w:left="6480" w:hanging="360"/>
+      </w:pPr>
+      <w:rPr>
+        <w:rFonts w:ascii="Wingdings" w:hAnsi="Wingdings" w:hint="default"/>
+      </w:rPr>
+    </w:lvl>
+  </w:abstractNum>
+  <w:abstractNum w:abstractNumId="19" w15:restartNumberingAfterBreak="0">
     <w:nsid w:val="51126AF6"/>
     <w:multiLevelType w:val="singleLevel"/>
     <w:tmpl w:val="04070001"/>
@@ -18625,7 +20356,7 @@
       </w:rPr>
     </w:lvl>
   </w:abstractNum>
-  <w:abstractNum w:abstractNumId="18" w15:restartNumberingAfterBreak="0">
+  <w:abstractNum w:abstractNumId="20" w15:restartNumberingAfterBreak="0">
     <w:nsid w:val="527650A4"/>
     <w:multiLevelType w:val="hybridMultilevel"/>
     <w:tmpl w:val="D6586816"/>
@@ -18766,7 +20497,7 @@
       </w:rPr>
     </w:lvl>
   </w:abstractNum>
-  <w:abstractNum w:abstractNumId="19" w15:restartNumberingAfterBreak="0">
+  <w:abstractNum w:abstractNumId="21" w15:restartNumberingAfterBreak="0">
     <w:nsid w:val="5AEA1BC7"/>
     <w:multiLevelType w:val="hybridMultilevel"/>
     <w:tmpl w:val="A1EA287C"/>
@@ -18906,7 +20637,7 @@
       </w:rPr>
     </w:lvl>
   </w:abstractNum>
-  <w:abstractNum w:abstractNumId="20" w15:restartNumberingAfterBreak="0">
+  <w:abstractNum w:abstractNumId="22" w15:restartNumberingAfterBreak="0">
     <w:nsid w:val="61EA2143"/>
     <w:multiLevelType w:val="multilevel"/>
     <w:tmpl w:val="A060ED46"/>
@@ -19046,7 +20777,120 @@
       </w:rPr>
     </w:lvl>
   </w:abstractNum>
-  <w:abstractNum w:abstractNumId="21" w15:restartNumberingAfterBreak="0">
+  <w:abstractNum w:abstractNumId="23" w15:restartNumberingAfterBreak="0">
+    <w:nsid w:val="63E47C40"/>
+    <w:multiLevelType w:val="hybridMultilevel"/>
+    <w:tmpl w:val="5DB680C0"/>
+    <w:lvl w:ilvl="0" w:tplc="5C2A33FA">
+      <w:start w:val="6"/>
+      <w:numFmt w:val="bullet"/>
+      <w:lvlText w:val=""/>
+      <w:lvlJc w:val="left"/>
+      <w:pPr>
+        <w:ind w:left="420" w:hanging="360"/>
+      </w:pPr>
+      <w:rPr>
+        <w:rFonts w:ascii="Times New Roman" w:eastAsia="Times New Roman" w:hAnsi="Times New Roman" w:cs="Times New Roman" w:hint="default"/>
+      </w:rPr>
+    </w:lvl>
+    <w:lvl w:ilvl="1" w:tplc="04070003" w:tentative="1">
+      <w:start w:val="1"/>
+      <w:numFmt w:val="bullet"/>
+      <w:lvlText w:val="o"/>
+      <w:lvlJc w:val="left"/>
+      <w:pPr>
+        <w:ind w:left="1140" w:hanging="360"/>
+      </w:pPr>
+      <w:rPr>
+        <w:rFonts w:ascii="Courier New" w:hAnsi="Courier New" w:cs="Courier New" w:hint="default"/>
+      </w:rPr>
+    </w:lvl>
+    <w:lvl w:ilvl="2" w:tplc="04070005" w:tentative="1">
+      <w:start w:val="1"/>
+      <w:numFmt w:val="bullet"/>
+      <w:lvlText w:val=""/>
+      <w:lvlJc w:val="left"/>
+      <w:pPr>
+        <w:ind w:left="1860" w:hanging="360"/>
+      </w:pPr>
+      <w:rPr>
+        <w:rFonts w:ascii="Wingdings" w:hAnsi="Wingdings" w:hint="default"/>
+      </w:rPr>
+    </w:lvl>
+    <w:lvl w:ilvl="3" w:tplc="04070001" w:tentative="1">
+      <w:start w:val="1"/>
+      <w:numFmt w:val="bullet"/>
+      <w:lvlText w:val=""/>
+      <w:lvlJc w:val="left"/>
+      <w:pPr>
+        <w:ind w:left="2580" w:hanging="360"/>
+      </w:pPr>
+      <w:rPr>
+        <w:rFonts w:ascii="Symbol" w:hAnsi="Symbol" w:hint="default"/>
+      </w:rPr>
+    </w:lvl>
+    <w:lvl w:ilvl="4" w:tplc="04070003" w:tentative="1">
+      <w:start w:val="1"/>
+      <w:numFmt w:val="bullet"/>
+      <w:lvlText w:val="o"/>
+      <w:lvlJc w:val="left"/>
+      <w:pPr>
+        <w:ind w:left="3300" w:hanging="360"/>
+      </w:pPr>
+      <w:rPr>
+        <w:rFonts w:ascii="Courier New" w:hAnsi="Courier New" w:cs="Courier New" w:hint="default"/>
+      </w:rPr>
+    </w:lvl>
+    <w:lvl w:ilvl="5" w:tplc="04070005" w:tentative="1">
+      <w:start w:val="1"/>
+      <w:numFmt w:val="bullet"/>
+      <w:lvlText w:val=""/>
+      <w:lvlJc w:val="left"/>
+      <w:pPr>
+        <w:ind w:left="4020" w:hanging="360"/>
+      </w:pPr>
+      <w:rPr>
+        <w:rFonts w:ascii="Wingdings" w:hAnsi="Wingdings" w:hint="default"/>
+      </w:rPr>
+    </w:lvl>
+    <w:lvl w:ilvl="6" w:tplc="04070001" w:tentative="1">
+      <w:start w:val="1"/>
+      <w:numFmt w:val="bullet"/>
+      <w:lvlText w:val=""/>
+      <w:lvlJc w:val="left"/>
+      <w:pPr>
+        <w:ind w:left="4740" w:hanging="360"/>
+      </w:pPr>
+      <w:rPr>
+        <w:rFonts w:ascii="Symbol" w:hAnsi="Symbol" w:hint="default"/>
+      </w:rPr>
+    </w:lvl>
+    <w:lvl w:ilvl="7" w:tplc="04070003" w:tentative="1">
+      <w:start w:val="1"/>
+      <w:numFmt w:val="bullet"/>
+      <w:lvlText w:val="o"/>
+      <w:lvlJc w:val="left"/>
+      <w:pPr>
+        <w:ind w:left="5460" w:hanging="360"/>
+      </w:pPr>
+      <w:rPr>
+        <w:rFonts w:ascii="Courier New" w:hAnsi="Courier New" w:cs="Courier New" w:hint="default"/>
+      </w:rPr>
+    </w:lvl>
+    <w:lvl w:ilvl="8" w:tplc="04070005" w:tentative="1">
+      <w:start w:val="1"/>
+      <w:numFmt w:val="bullet"/>
+      <w:lvlText w:val=""/>
+      <w:lvlJc w:val="left"/>
+      <w:pPr>
+        <w:ind w:left="6180" w:hanging="360"/>
+      </w:pPr>
+      <w:rPr>
+        <w:rFonts w:ascii="Wingdings" w:hAnsi="Wingdings" w:hint="default"/>
+      </w:rPr>
+    </w:lvl>
+  </w:abstractNum>
+  <w:abstractNum w:abstractNumId="24" w15:restartNumberingAfterBreak="0">
     <w:nsid w:val="64817330"/>
     <w:multiLevelType w:val="singleLevel"/>
     <w:tmpl w:val="A802028E"/>
@@ -19061,7 +20905,7 @@
       </w:pPr>
     </w:lvl>
   </w:abstractNum>
-  <w:abstractNum w:abstractNumId="22" w15:restartNumberingAfterBreak="0">
+  <w:abstractNum w:abstractNumId="25" w15:restartNumberingAfterBreak="0">
     <w:nsid w:val="6A77240B"/>
     <w:multiLevelType w:val="singleLevel"/>
     <w:tmpl w:val="A802028E"/>
@@ -19076,7 +20920,7 @@
       </w:pPr>
     </w:lvl>
   </w:abstractNum>
-  <w:abstractNum w:abstractNumId="23" w15:restartNumberingAfterBreak="0">
+  <w:abstractNum w:abstractNumId="26" w15:restartNumberingAfterBreak="0">
     <w:nsid w:val="6EAC076F"/>
     <w:multiLevelType w:val="singleLevel"/>
     <w:tmpl w:val="A802028E"/>
@@ -19091,7 +20935,7 @@
       </w:pPr>
     </w:lvl>
   </w:abstractNum>
-  <w:abstractNum w:abstractNumId="24" w15:restartNumberingAfterBreak="0">
+  <w:abstractNum w:abstractNumId="27" w15:restartNumberingAfterBreak="0">
     <w:nsid w:val="7278413B"/>
     <w:multiLevelType w:val="singleLevel"/>
     <w:tmpl w:val="A802028E"/>
@@ -19106,7 +20950,7 @@
       </w:pPr>
     </w:lvl>
   </w:abstractNum>
-  <w:abstractNum w:abstractNumId="25" w15:restartNumberingAfterBreak="0">
+  <w:abstractNum w:abstractNumId="28" w15:restartNumberingAfterBreak="0">
     <w:nsid w:val="764334D6"/>
     <w:multiLevelType w:val="multilevel"/>
     <w:tmpl w:val="4962B31C"/>
@@ -19246,7 +21090,7 @@
       </w:rPr>
     </w:lvl>
   </w:abstractNum>
-  <w:abstractNum w:abstractNumId="26" w15:restartNumberingAfterBreak="0">
+  <w:abstractNum w:abstractNumId="29" w15:restartNumberingAfterBreak="0">
     <w:nsid w:val="77816A02"/>
     <w:multiLevelType w:val="singleLevel"/>
     <w:tmpl w:val="37A8B15C"/>
@@ -19256,7 +21100,7 @@
       <w:lvlJc w:val="left"/>
     </w:lvl>
   </w:abstractNum>
-  <w:abstractNum w:abstractNumId="27" w15:restartNumberingAfterBreak="0">
+  <w:abstractNum w:abstractNumId="30" w15:restartNumberingAfterBreak="0">
     <w:nsid w:val="794E02B9"/>
     <w:multiLevelType w:val="hybridMultilevel"/>
     <w:tmpl w:val="81C014C0"/>
@@ -19377,7 +21221,7 @@
     <w:abstractNumId w:val="5"/>
   </w:num>
   <w:num w:numId="6" w16cid:durableId="628242571">
-    <w:abstractNumId w:val="17"/>
+    <w:abstractNumId w:val="19"/>
   </w:num>
   <w:num w:numId="7" w16cid:durableId="582646734">
     <w:abstractNumId w:val="9"/>
@@ -19386,7 +21230,7 @@
     <w:abstractNumId w:val="2"/>
   </w:num>
   <w:num w:numId="9" w16cid:durableId="1613390816">
-    <w:abstractNumId w:val="20"/>
+    <w:abstractNumId w:val="22"/>
   </w:num>
   <w:num w:numId="10" w16cid:durableId="452287993">
     <w:abstractNumId w:val="1"/>
@@ -19408,10 +21252,10 @@
     </w:lvlOverride>
   </w:num>
   <w:num w:numId="11" w16cid:durableId="1631931747">
-    <w:abstractNumId w:val="18"/>
+    <w:abstractNumId w:val="20"/>
   </w:num>
   <w:num w:numId="12" w16cid:durableId="1523206813">
-    <w:abstractNumId w:val="25"/>
+    <w:abstractNumId w:val="28"/>
   </w:num>
   <w:num w:numId="13" w16cid:durableId="348606159">
     <w:abstractNumId w:val="3"/>
@@ -19450,7 +21294,7 @@
     </w:lvlOverride>
   </w:num>
   <w:num w:numId="15" w16cid:durableId="1660693243">
-    <w:abstractNumId w:val="26"/>
+    <w:abstractNumId w:val="29"/>
     <w:lvlOverride w:ilvl="0">
       <w:lvl w:ilvl="0">
         <w:start w:val="1"/>
@@ -19468,7 +21312,7 @@
     </w:lvlOverride>
   </w:num>
   <w:num w:numId="16" w16cid:durableId="1945456854">
-    <w:abstractNumId w:val="16"/>
+    <w:abstractNumId w:val="17"/>
     <w:lvlOverride w:ilvl="0">
       <w:lvl w:ilvl="0">
         <w:start w:val="1"/>
@@ -19486,34 +21330,34 @@
     </w:lvlOverride>
   </w:num>
   <w:num w:numId="17" w16cid:durableId="243994392">
-    <w:abstractNumId w:val="23"/>
+    <w:abstractNumId w:val="26"/>
   </w:num>
   <w:num w:numId="18" w16cid:durableId="38166899">
     <w:abstractNumId w:val="10"/>
   </w:num>
   <w:num w:numId="19" w16cid:durableId="1127704012">
-    <w:abstractNumId w:val="21"/>
+    <w:abstractNumId w:val="24"/>
   </w:num>
   <w:num w:numId="20" w16cid:durableId="1900360885">
-    <w:abstractNumId w:val="15"/>
+    <w:abstractNumId w:val="16"/>
   </w:num>
   <w:num w:numId="21" w16cid:durableId="1051342329">
     <w:abstractNumId w:val="6"/>
   </w:num>
   <w:num w:numId="22" w16cid:durableId="415202503">
-    <w:abstractNumId w:val="22"/>
+    <w:abstractNumId w:val="25"/>
   </w:num>
   <w:num w:numId="23" w16cid:durableId="1749501247">
-    <w:abstractNumId w:val="24"/>
+    <w:abstractNumId w:val="27"/>
   </w:num>
   <w:num w:numId="24" w16cid:durableId="1994604197">
-    <w:abstractNumId w:val="14"/>
+    <w:abstractNumId w:val="15"/>
   </w:num>
   <w:num w:numId="25" w16cid:durableId="942570112">
     <w:abstractNumId w:val="12"/>
   </w:num>
   <w:num w:numId="26" w16cid:durableId="1866477436">
-    <w:abstractNumId w:val="19"/>
+    <w:abstractNumId w:val="21"/>
   </w:num>
   <w:num w:numId="27" w16cid:durableId="683941177">
     <w:abstractNumId w:val="12"/>
@@ -19525,13 +21369,22 @@
     <w:abstractNumId w:val="12"/>
   </w:num>
   <w:num w:numId="30" w16cid:durableId="1417630888">
-    <w:abstractNumId w:val="27"/>
+    <w:abstractNumId w:val="30"/>
   </w:num>
   <w:num w:numId="31" w16cid:durableId="1989432135">
     <w:abstractNumId w:val="4"/>
   </w:num>
   <w:num w:numId="32" w16cid:durableId="873809129">
     <w:abstractNumId w:val="8"/>
+  </w:num>
+  <w:num w:numId="33" w16cid:durableId="1006443209">
+    <w:abstractNumId w:val="14"/>
+  </w:num>
+  <w:num w:numId="34" w16cid:durableId="664943961">
+    <w:abstractNumId w:val="18"/>
+  </w:num>
+  <w:num w:numId="35" w16cid:durableId="558369289">
+    <w:abstractNumId w:val="23"/>
   </w:num>
 </w:numbering>
 </file>
@@ -19919,7 +21772,7 @@
   <w:style w:type="paragraph" w:default="1" w:styleId="Standard">
     <w:name w:val="Normal"/>
     <w:qFormat/>
-    <w:rsid w:val="00D16BF9"/>
+    <w:rsid w:val="00A46F32"/>
     <w:rPr>
       <w:sz w:val="24"/>
       <w:szCs w:val="24"/>
@@ -20084,7 +21937,6 @@
   <w:style w:type="character" w:default="1" w:styleId="Absatz-Standardschriftart">
     <w:name w:val="Default Paragraph Font"/>
     <w:uiPriority w:val="1"/>
-    <w:semiHidden/>
     <w:unhideWhenUsed/>
   </w:style>
   <w:style w:type="table" w:default="1" w:styleId="NormaleTabelle">

</xml_diff>